<commit_message>
@ docs: actualizar los manuales con los cambios de doblada y exportarlos
Co-Authored-By: Claude Opus 5 <noreply@anthropic.com>
@
</commit_message>
<xml_diff>
--- a/AppTurnosExplora/docs/pdf/Manual_Usuario.docx
+++ b/AppTurnosExplora/docs/pdf/Manual_Usuario.docx
@@ -42,7 +42,7 @@
           <w:color w:val="606060"/>
           <w:sz w:val="20"/>
         </w:rPr>
-        <w:t>Version 1.0  |  09/08/2026</w:t>
+        <w:t>Version 1.0  |  13/08/2026</w:t>
       </w:r>
     </w:p>
     <w:p>
@@ -13535,7 +13535,21 @@
         <w:pStyle w:val="ListNumber"/>
       </w:pPr>
       <w:r>
-        <w:t xml:space="preserve">Si el pago cae en sábado, indica en </w:t>
+        <w:t>Si el pago cae en sábado y ese día tú estás libre pero tu compañero sí trabaja, aparece</w:t>
+      </w:r>
+    </w:p>
+    <w:p>
+      <w:r>
+        <w:t xml:space="preserve">el aviso </w:t>
+      </w:r>
+      <w:r>
+        <w:rPr>
+          <w:b/>
+        </w:rPr>
+        <w:t>Pago en Sábado</w:t>
+      </w:r>
+      <w:r>
+        <w:t xml:space="preserve"> y debes indicar en </w:t>
       </w:r>
       <w:r>
         <w:rPr>
@@ -13544,12 +13558,56 @@
         <w:t>¿Qué mitad del sábado cubrirás tú?</w:t>
       </w:r>
       <w:r>
-        <w:t xml:space="preserve"> la jornada</w:t>
-      </w:r>
-    </w:p>
-    <w:p>
-      <w:r>
-        <w:t>que asumes.</w:t>
+        <w:t xml:space="preserve"> la jornada que asumes: él trabaja la otra mitad. Si tu compañero también descansa ese sábado, ni el aviso ni esa pregunta aparecen, porque no hay ninguna jornada suya que cubrir; la </w:t>
+      </w:r>
+      <w:r>
+        <w:rPr>
+          <w:b/>
+        </w:rPr>
+        <w:t>Vista Previa del Acuerdo</w:t>
+      </w:r>
+      <w:r>
+        <w:t xml:space="preserve"> te dirá que esa fecha de pago no sirve. &lt;!-- fuente: static/js/cambio-turno/solicitar_doblada.js (sincronizarSelectorPagoSabado) --&gt;</w:t>
+      </w:r>
+    </w:p>
+    <w:p>
+      <w:pPr>
+        <w:pStyle w:val="ListNumber"/>
+      </w:pPr>
+      <w:r>
+        <w:t xml:space="preserve">Revisa la </w:t>
+      </w:r>
+      <w:r>
+        <w:rPr>
+          <w:b/>
+        </w:rPr>
+        <w:t>Vista Previa del Acuerdo</w:t>
+      </w:r>
+      <w:r>
+        <w:t xml:space="preserve"> antes de enviar: si el recuadro es azul</w:t>
+      </w:r>
+    </w:p>
+    <w:p>
+      <w:r>
+        <w:t>(</w:t>
+      </w:r>
+      <w:r>
+        <w:rPr>
+          <w:b/>
+        </w:rPr>
+        <w:t>Resumen del Acuerdo</w:t>
+      </w:r>
+      <w:r>
+        <w:t>), el acuerdo es válido; si es rojo (</w:t>
+      </w:r>
+      <w:r>
+        <w:rPr>
+          <w:b/>
+        </w:rPr>
+        <w:t>No se puede enviar la solicitud</w:t>
+      </w:r>
+      <w:r>
+        <w:t>), corrige lo que indique el motivo. &lt;!-- fuente: static/js/cambio-turno/solicitar_doblada.js (verificarCoincidenciaPago) --&gt;</w:t>
       </w:r>
     </w:p>
     <w:p>
@@ -14173,7 +14231,7 @@
               <w:rPr>
                 <w:sz w:val="20"/>
               </w:rPr>
-              <w:t>Solo si el pago es sábado</w:t>
+              <w:t>Solo si el pago es sábado, tú estás libre ese día y el compañero sí trabaja</w:t>
             </w:r>
           </w:p>
         </w:tc>
@@ -14209,7 +14267,7 @@
               <w:rPr>
                 <w:sz w:val="20"/>
               </w:rPr>
-              <w:t>Define tu carga ese sábado</w:t>
+              <w:t>Define tu carga ese sábado &lt;!-- fuente: static/js/cambio-turno/solicitar_doblada.js (sincronizarSelectorPagoSabado) --&gt;</w:t>
             </w:r>
           </w:p>
         </w:tc>
@@ -14762,6 +14820,51 @@
               <w:rPr>
                 <w:sz w:val="20"/>
               </w:rPr>
+              <w:t xml:space="preserve">Pago en </w:t>
+            </w:r>
+            <w:r>
+              <w:rPr>
+                <w:b/>
+                <w:sz w:val="20"/>
+              </w:rPr>
+              <w:t>sábado en el que el compañero descansa</w:t>
+            </w:r>
+          </w:p>
+        </w:tc>
+        <w:tc>
+          <w:tcPr>
+            <w:tcW w:type="dxa" w:w="4320"/>
+          </w:tcPr>
+          <w:p>
+            <w:r>
+              <w:rPr>
+                <w:sz w:val="20"/>
+              </w:rPr>
+            </w:r>
+            <w:r>
+              <w:rPr>
+                <w:sz w:val="20"/>
+              </w:rPr>
+              <w:t>No sirve como fecha de pago: no hay jornada suya que cubrir. No se te pide la mitad del sábado y la vista previa lo rechaza &lt;!-- fuente: static/js/cambio-turno/solicitar_doblada.js; solicitudes/services/doblada_pago_service.py:100 --&gt;</w:t>
+            </w:r>
+          </w:p>
+        </w:tc>
+      </w:tr>
+      <w:tr>
+        <w:tc>
+          <w:tcPr>
+            <w:tcW w:type="dxa" w:w="4320"/>
+          </w:tcPr>
+          <w:p>
+            <w:r>
+              <w:rPr>
+                <w:sz w:val="20"/>
+              </w:rPr>
+            </w:r>
+            <w:r>
+              <w:rPr>
+                <w:sz w:val="20"/>
+              </w:rPr>
               <w:t xml:space="preserve">Cesión y pago </w:t>
             </w:r>
             <w:r>
@@ -14962,6 +15065,79 @@
     </w:p>
     <w:p>
       <w:r>
+        <w:t xml:space="preserve">En cuanto completas </w:t>
+      </w:r>
+      <w:r>
+        <w:rPr>
+          <w:b/>
+        </w:rPr>
+        <w:t>Fecha de Pago</w:t>
+      </w:r>
+      <w:r>
+        <w:t xml:space="preserve"> y </w:t>
+      </w:r>
+      <w:r>
+        <w:rPr>
+          <w:b/>
+        </w:rPr>
+        <w:t>Compañero que te Cubrirá</w:t>
+      </w:r>
+      <w:r>
+        <w:t xml:space="preserve">, la </w:t>
+      </w:r>
+      <w:r>
+        <w:rPr>
+          <w:b/>
+        </w:rPr>
+        <w:t>Vista Previa del Acuerdo</w:t>
+      </w:r>
+      <w:r>
+        <w:t xml:space="preserve"> se pronuncia: si el acuerdo es válido verás el recuadro azul </w:t>
+      </w:r>
+      <w:r>
+        <w:rPr>
+          <w:b/>
+        </w:rPr>
+        <w:t>Resumen del Acuerdo</w:t>
+      </w:r>
+      <w:r>
+        <w:t xml:space="preserve">; si el sistema ya sabe que lo rechazará, verás en su lugar un recuadro rojo </w:t>
+      </w:r>
+      <w:r>
+        <w:rPr>
+          <w:b/>
+        </w:rPr>
+        <w:t>No se puede enviar la solicitud</w:t>
+      </w:r>
+      <w:r>
+        <w:t xml:space="preserve"> con el motivo, sin tener que pulsar </w:t>
+      </w:r>
+      <w:r>
+        <w:rPr>
+          <w:b/>
+        </w:rPr>
+        <w:t>Enviar Solicitud</w:t>
+      </w:r>
+      <w:r>
+        <w:t xml:space="preserve"> para enterarte. Ocurre, por ejemplo, cuando los dos descansan en la fecha de pago, cuando el compañero descansa ese día o cuando ese día ambos tenéis la misma jornada. &lt;!-- fuente: static/js/cambio-turno/solicitar_doblada.js (verificarCoincidenciaPago) --&gt;</w:t>
+      </w:r>
+    </w:p>
+    <w:p>
+      <w:r>
+        <w:t xml:space="preserve">Si el pago cae en sábado, el aviso </w:t>
+      </w:r>
+      <w:r>
+        <w:rPr>
+          <w:b/>
+        </w:rPr>
+        <w:t>Pago en Sábado</w:t>
+      </w:r>
+      <w:r>
+        <w:t xml:space="preserve"> y la pregunta por la mitad solo aparecen cuando el compañero sí trabaja ese sábado. Si él descansa, no aparecen: no existe mitad que repartir. &lt;!-- fuente: static/js/cambio-turno/solicitar_doblada.js (sincronizarSelectorPagoSabado) --&gt;</w:t>
+      </w:r>
+    </w:p>
+    <w:p>
+      <w:r>
         <w:t>&lt;!-- fuente: static/js/cambio-turno/solicitar_doblada.js --&gt;</w:t>
       </w:r>
     </w:p>
@@ -15116,7 +15292,44 @@
     </w:p>
     <w:p>
       <w:r>
-        <w:t>Al aprobarse, el día de la cesión te queda libre y el de pago queda registrado como tu devolución.</w:t>
+        <w:t xml:space="preserve">Al aprobarse, el día de la cesión te queda libre y el de pago queda registrado como tu devolución. Las condiciones se vuelven a comprobar en ese momento: si entre el envío y la aprobación el compañero dejó de trabajar el sábado de pago, la solicitud no se aplica y se avisa con </w:t>
+      </w:r>
+      <w:r>
+        <w:rPr>
+          <w:i/>
+        </w:rPr>
+        <w:t>"&amp;lt;Nombre&amp;gt; no trabaja el sábado DD/MM/AAAA: ese día descansa, así que no hay jornada suya que cubrir y no se le puede pagar la doblada. La doblada debe rehacerse con otra fecha de pago."</w:t>
+      </w:r>
+      <w:r>
+        <w:t xml:space="preserve"> Ese aviso lo ve quien aprueba, no tú: por eso no pide elegir una fecha, sino que deja constancia de que la solicitud debe volver a enviarse con otra fecha de pago. &lt;!-- fuente: solicitudes/services/doblada_pago_service.py:144 --&gt;</w:t>
+      </w:r>
+    </w:p>
+    <w:p>
+      <w:r>
+        <w:t xml:space="preserve">La misma comprobación se aplica cuando el pago cae </w:t>
+      </w:r>
+      <w:r>
+        <w:rPr>
+          <w:b/>
+        </w:rPr>
+        <w:t>entre semana</w:t>
+      </w:r>
+      <w:r>
+        <w:t xml:space="preserve">. Si al aplicarse la doblada resulta que el compañero descansa ese día, el sistema se detiene y avisa con </w:t>
+      </w:r>
+      <w:r>
+        <w:rPr>
+          <w:i/>
+        </w:rPr>
+        <w:t>"&amp;lt;Nombre&amp;gt; &amp;lt;Apellido&amp;gt; no trabaja el DD/MM/AAAA: ese día descansa, así que no tiene una jornada que cubrirle para pagar la doblada. La doblada debe rehacerse con otra fecha de pago."</w:t>
+      </w:r>
+      <w:r>
+        <w:t xml:space="preserve"> Antes, en algunos casos, la doblada seguía adelante y le dejaba a esa persona un turno en un día libre sin que nadie se enterara. &lt;!-- fuente: solicitudes/services/doblada_pago_service.py:302,536 --&gt;</w:t>
+      </w:r>
+    </w:p>
+    <w:p>
+      <w:r>
+        <w:t>Rellenando el formulario no deberías toparte con este aviso: al enviar ya se comprueba que el compañero trabaje la fecha de pago. Aparece sobre todo cuando ese día cambió entre el envío y la aprobación, o cuando un administrador rehace una doblada por su cuenta.</w:t>
       </w:r>
     </w:p>
     <w:p>
@@ -16189,6 +16402,118 @@
                 <w:sz w:val="20"/>
               </w:rPr>
               <w:t>Selecciónalo</w:t>
+            </w:r>
+          </w:p>
+        </w:tc>
+      </w:tr>
+      <w:tr>
+        <w:tc>
+          <w:tcPr>
+            <w:tcW w:type="dxa" w:w="2880"/>
+          </w:tcPr>
+          <w:p>
+            <w:r>
+              <w:rPr>
+                <w:sz w:val="20"/>
+              </w:rPr>
+            </w:r>
+            <w:r>
+              <w:rPr>
+                <w:sz w:val="20"/>
+              </w:rPr>
+              <w:t>"&amp;lt;Nombre&amp;gt; no trabaja el sábado DD/MM/AAAA: ese día descansa, así que no hay jornada suya que cubrir y no se le puede pagar la doblada. La doblada debe rehacerse con otra fecha de pago."</w:t>
+            </w:r>
+          </w:p>
+        </w:tc>
+        <w:tc>
+          <w:tcPr>
+            <w:tcW w:type="dxa" w:w="2880"/>
+          </w:tcPr>
+          <w:p>
+            <w:r>
+              <w:rPr>
+                <w:sz w:val="20"/>
+              </w:rPr>
+            </w:r>
+            <w:r>
+              <w:rPr>
+                <w:sz w:val="20"/>
+              </w:rPr>
+              <w:t>Al aprobarse, el compañero ya no trabaja ese sábado (cambió su programación o cedió el día). Lo ve quien aprueba</w:t>
+            </w:r>
+          </w:p>
+        </w:tc>
+        <w:tc>
+          <w:tcPr>
+            <w:tcW w:type="dxa" w:w="2880"/>
+          </w:tcPr>
+          <w:p>
+            <w:r>
+              <w:rPr>
+                <w:sz w:val="20"/>
+              </w:rPr>
+            </w:r>
+            <w:r>
+              <w:rPr>
+                <w:sz w:val="20"/>
+              </w:rPr>
+              <w:t>Envía la solicitud de nuevo con otra fecha de pago</w:t>
+            </w:r>
+          </w:p>
+        </w:tc>
+      </w:tr>
+      <w:tr>
+        <w:tc>
+          <w:tcPr>
+            <w:tcW w:type="dxa" w:w="2880"/>
+          </w:tcPr>
+          <w:p>
+            <w:r>
+              <w:rPr>
+                <w:sz w:val="20"/>
+              </w:rPr>
+            </w:r>
+            <w:r>
+              <w:rPr>
+                <w:sz w:val="20"/>
+              </w:rPr>
+              <w:t>"&amp;lt;Nombre&amp;gt; &amp;lt;Apellido&amp;gt; no trabaja el DD/MM/AAAA: ese día descansa, así que no tiene una jornada que cubrirle para pagar la doblada. La doblada debe rehacerse con otra fecha de pago."</w:t>
+            </w:r>
+          </w:p>
+        </w:tc>
+        <w:tc>
+          <w:tcPr>
+            <w:tcW w:type="dxa" w:w="2880"/>
+          </w:tcPr>
+          <w:p>
+            <w:r>
+              <w:rPr>
+                <w:sz w:val="20"/>
+              </w:rPr>
+            </w:r>
+            <w:r>
+              <w:rPr>
+                <w:sz w:val="20"/>
+              </w:rPr>
+              <w:t>Al aplicarse la doblada, el compañero ya no trabaja esa fecha de pago entre semana. Lo ve quien aprueba</w:t>
+            </w:r>
+          </w:p>
+        </w:tc>
+        <w:tc>
+          <w:tcPr>
+            <w:tcW w:type="dxa" w:w="2880"/>
+          </w:tcPr>
+          <w:p>
+            <w:r>
+              <w:rPr>
+                <w:sz w:val="20"/>
+              </w:rPr>
+            </w:r>
+            <w:r>
+              <w:rPr>
+                <w:sz w:val="20"/>
+              </w:rPr>
+              <w:t>Envía la solicitud de nuevo con otra fecha de pago</w:t>
             </w:r>
           </w:p>
         </w:tc>
@@ -23180,7 +23505,40 @@
     </w:p>
     <w:p>
       <w:r>
-        <w:t>Una solicitud pasa primero por el compañero y después por el supervisor. En el momento de cada aprobación el sistema vuelve a comprobar las reglas: si la situación cambió desde que se envió —una sanción nueva, un turno modificado— la aprobación se rechaza con el motivo. &lt;!-- fuente: solicitudes/services/solicitud_aprobacion_service.py ("No se puede aprobar: …") --&gt;</w:t>
+        <w:t>Una solicitud pasa primero por el compañero y después por el supervisor. En el momento de cada aprobación el sistema vuelve a comprobar las reglas: si la situación cambió desde que se envió —una sanción nueva, un turno modificado— la aprobación no se realiza y verás el motivo. &lt;!-- fuente: solicitudes/services/solicitud_aprobacion_service.py ("No se puede aprobar: …") --&gt;</w:t>
+      </w:r>
+    </w:p>
+    <w:p>
+      <w:r>
+        <w:t xml:space="preserve">Cuando eso ocurre, el aviso que lees empieza por "No se puede aprobar: la solicitud ya no es válida con el estado actual." y a continuación cita el motivo entre la palabra </w:t>
+      </w:r>
+      <w:r>
+        <w:rPr>
+          <w:b/>
+        </w:rPr>
+        <w:t>Motivo:</w:t>
+      </w:r>
+      <w:r>
+        <w:t xml:space="preserve"> y la aclaración "(instrucciones dirigidas a quien la envió)". &lt;!-- fuente: solicitudes/services/solicitud_aprobacion_service.py:130-134 --&gt;</w:t>
+      </w:r>
+    </w:p>
+    <w:p>
+      <w:r>
+        <w:t>Ese motivo está redactado para quien envió la solicitud, no para ti. Por eso suena a orden —"Elige otra fecha de pago.", "Elige otro día de la semana."— y por eso va entre paréntesis la aclaración: tú no puedes cambiar nada de una solicitud ya enviada. &lt;!-- fuente: solicitudes/services/solicitud_aprobacion_service.py:123-129 --&gt;</w:t>
+      </w:r>
+    </w:p>
+    <w:p>
+      <w:r>
+        <w:t xml:space="preserve">Lo que te toca hacer es </w:t>
+      </w:r>
+      <w:r>
+        <w:rPr>
+          <w:b/>
+        </w:rPr>
+        <w:t>rechazar</w:t>
+      </w:r>
+      <w:r>
+        <w:t xml:space="preserve"> la solicitud. Al rechazarla, tu compañero recibe el aviso y puede volver a enviarla corrigiendo lo que indica el motivo. El propio texto termina diciéndotelo: "Recházala para que pueda rehacerse." &lt;!-- fuente: solicitudes/services/solicitud_aprobacion_service.py:130-134 --&gt;</w:t>
       </w:r>
     </w:p>
     <w:p>
@@ -24838,6 +25196,62 @@
                 <w:sz w:val="20"/>
               </w:rPr>
               <w:t>Habla con tu supervisor &lt;!-- fuente: solicitudes/services/solicitud_aprobacion_service.py --&gt;</w:t>
+            </w:r>
+          </w:p>
+        </w:tc>
+      </w:tr>
+      <w:tr>
+        <w:tc>
+          <w:tcPr>
+            <w:tcW w:type="dxa" w:w="2880"/>
+          </w:tcPr>
+          <w:p>
+            <w:r>
+              <w:rPr>
+                <w:sz w:val="20"/>
+              </w:rPr>
+            </w:r>
+            <w:r>
+              <w:rPr>
+                <w:sz w:val="20"/>
+              </w:rPr>
+              <w:t>"No se puede aprobar: la solicitud ya no es válida con el estado actual. Motivo: … (instrucciones dirigidas a quien la envió). Recházala para que pueda rehacerse."</w:t>
+            </w:r>
+          </w:p>
+        </w:tc>
+        <w:tc>
+          <w:tcPr>
+            <w:tcW w:type="dxa" w:w="2880"/>
+          </w:tcPr>
+          <w:p>
+            <w:r>
+              <w:rPr>
+                <w:sz w:val="20"/>
+              </w:rPr>
+            </w:r>
+            <w:r>
+              <w:rPr>
+                <w:sz w:val="20"/>
+              </w:rPr>
+              <w:t>Lo ves al aprobar: la situación cambió desde que se envió la solicitud y ya no cumple las reglas. El motivo citado está escrito para quien la envió, no para ti</w:t>
+            </w:r>
+          </w:p>
+        </w:tc>
+        <w:tc>
+          <w:tcPr>
+            <w:tcW w:type="dxa" w:w="2880"/>
+          </w:tcPr>
+          <w:p>
+            <w:r>
+              <w:rPr>
+                <w:sz w:val="20"/>
+              </w:rPr>
+            </w:r>
+            <w:r>
+              <w:rPr>
+                <w:sz w:val="20"/>
+              </w:rPr>
+              <w:t>Recházala; tu compañero podrá enviarla de nuevo corregida. Ver el apartado 6.5 &lt;!-- fuente: solicitudes/services/solicitud_aprobacion_service.py:130-134 --&gt;</w:t>
             </w:r>
           </w:p>
         </w:tc>

</xml_diff>

<commit_message>
@ docs: documentar el rol del filtro de companeros de doblada
Manual de usuario: el desplegable esconde a quien queda trabajando AM+PM y sí
muestra a quien descansa por haber cedido su jornada, incluido quien te cedió
el día a ti. Manual técnico: ficha propia del servicio, la regla con la
asimetría de roles enunciada, y la zona frágil (el fallo es silencioso: la
lista sale plausible pero invertida).

Se cierran además los 21 marcadores "(sin commit aún)" del changelog con su
hash, ya que la rama está fusionada.

De paso, el logger del filtro etiquetaba el contador como `solicitudes=` cuando
cuenta receptores — justo lo que reinduce el error al depurar.

Co-Authored-By: Claude Opus 5 <noreply@anthropic.com>
@
</commit_message>
<xml_diff>
--- a/AppTurnosExplora/docs/pdf/Manual_Usuario.docx
+++ b/AppTurnosExplora/docs/pdf/Manual_Usuario.docx
@@ -42,7 +42,7 @@
           <w:color w:val="606060"/>
           <w:sz w:val="20"/>
         </w:rPr>
-        <w:t>Version 1.0  |  13/08/2026</w:t>
+        <w:t>Version 1.0  |  18/08/2026</w:t>
       </w:r>
     </w:p>
     <w:p>
@@ -13510,7 +13510,7 @@
     </w:p>
     <w:p>
       <w:r>
-        <w:t>disponibles para esa fecha.</w:t>
+        <w:t>disponibles para esa fecha. Se esconde a quien ese día ya queda trabajando la mañana y la tarde —pedirle la doblada sería un triple turno—, pero sí aparece quien ese día descansa por haber cedido su jornada en otra doblada, incluido quien descansa precisamente porque te cedió el día a ti. &lt;!-- fuente: solicitudes/services/doblada_filtro_service.py:54-66,94-113 --&gt;</w:t>
       </w:r>
     </w:p>
     <w:p>
@@ -14895,6 +14895,96 @@
           </w:p>
         </w:tc>
       </w:tr>
+      <w:tr>
+        <w:tc>
+          <w:tcPr>
+            <w:tcW w:type="dxa" w:w="4320"/>
+          </w:tcPr>
+          <w:p>
+            <w:r>
+              <w:rPr>
+                <w:sz w:val="20"/>
+              </w:rPr>
+            </w:r>
+            <w:r>
+              <w:rPr>
+                <w:sz w:val="20"/>
+              </w:rPr>
+              <w:t xml:space="preserve">Compañero que ese día </w:t>
+            </w:r>
+            <w:r>
+              <w:rPr>
+                <w:b/>
+                <w:sz w:val="20"/>
+              </w:rPr>
+              <w:t>trabaja mañana y tarde</w:t>
+            </w:r>
+          </w:p>
+        </w:tc>
+        <w:tc>
+          <w:tcPr>
+            <w:tcW w:type="dxa" w:w="4320"/>
+          </w:tcPr>
+          <w:p>
+            <w:r>
+              <w:rPr>
+                <w:sz w:val="20"/>
+              </w:rPr>
+            </w:r>
+            <w:r>
+              <w:rPr>
+                <w:sz w:val="20"/>
+              </w:rPr>
+              <w:t>No aparece en la lista: ya está doblado y no puede asumir otra jornada &lt;!-- fuente: solicitudes/services/doblada_filtro_service.py:94-113 --&gt;</w:t>
+            </w:r>
+          </w:p>
+        </w:tc>
+      </w:tr>
+      <w:tr>
+        <w:tc>
+          <w:tcPr>
+            <w:tcW w:type="dxa" w:w="4320"/>
+          </w:tcPr>
+          <w:p>
+            <w:r>
+              <w:rPr>
+                <w:sz w:val="20"/>
+              </w:rPr>
+            </w:r>
+            <w:r>
+              <w:rPr>
+                <w:sz w:val="20"/>
+              </w:rPr>
+              <w:t xml:space="preserve">Compañero que ese día </w:t>
+            </w:r>
+            <w:r>
+              <w:rPr>
+                <w:b/>
+                <w:sz w:val="20"/>
+              </w:rPr>
+              <w:t>descansa por haber cedido su jornada</w:t>
+            </w:r>
+          </w:p>
+        </w:tc>
+        <w:tc>
+          <w:tcPr>
+            <w:tcW w:type="dxa" w:w="4320"/>
+          </w:tcPr>
+          <w:p>
+            <w:r>
+              <w:rPr>
+                <w:sz w:val="20"/>
+              </w:rPr>
+            </w:r>
+            <w:r>
+              <w:rPr>
+                <w:sz w:val="20"/>
+              </w:rPr>
+              <w:t>Sí aparece: tiene el día libre y puede cubrirte &lt;!-- fuente: solicitudes/services/doblada_filtro_service.py:54-66 --&gt;</w:t>
+            </w:r>
+          </w:p>
+        </w:tc>
+      </w:tr>
     </w:tbl>
     <w:p/>
     <w:p>
@@ -28507,6 +28597,57 @@
                 <w:sz w:val="20"/>
               </w:rPr>
               <w:t>Queda el registro de la sanción y de cuándo se levantó &lt;!-- fuente: commit 0e541c1 --&gt;</w:t>
+            </w:r>
+          </w:p>
+        </w:tc>
+      </w:tr>
+      <w:tr>
+        <w:tc>
+          <w:tcPr>
+            <w:tcW w:type="dxa" w:w="4320"/>
+          </w:tcPr>
+          <w:p>
+            <w:r>
+              <w:rPr>
+                <w:sz w:val="20"/>
+              </w:rPr>
+            </w:r>
+            <w:r>
+              <w:rPr>
+                <w:sz w:val="20"/>
+              </w:rPr>
+              <w:t xml:space="preserve">En </w:t>
+            </w:r>
+            <w:r>
+              <w:rPr>
+                <w:b/>
+                <w:sz w:val="20"/>
+              </w:rPr>
+              <w:t>Doblada</w:t>
+            </w:r>
+            <w:r>
+              <w:rPr>
+                <w:sz w:val="20"/>
+              </w:rPr>
+              <w:t>, la lista de compañeros esconde a quien ya trabaja mañana y tarde</w:t>
+            </w:r>
+          </w:p>
+        </w:tc>
+        <w:tc>
+          <w:tcPr>
+            <w:tcW w:type="dxa" w:w="4320"/>
+          </w:tcPr>
+          <w:p>
+            <w:r>
+              <w:rPr>
+                <w:sz w:val="20"/>
+              </w:rPr>
+            </w:r>
+            <w:r>
+              <w:rPr>
+                <w:sz w:val="20"/>
+              </w:rPr>
+              <w:t>Antes se escondía por error a quien ese día descansaba por haber cedido su jornada. Ahora aparecen en el desplegable compañeros libres que antes no se mostraban, incluido quien descansa porque te cedió el día a ti &lt;!-- fuente: solicitudes/services/doblada_filtro_service.py:54-66 --&gt;</w:t>
             </w:r>
           </w:p>
         </w:tc>

</xml_diff>

<commit_message>
docs(manuales): correo en lote, base de plantillas y detalle del dia
Manual tecnico: los dos caminos de entrega del correo, la seccion de plantillas
(incluidos los dos correos PERMANENTES, que tienen que decir quien hace que), la
conexion SMTP por lote y el contrato de `GET /turnos/api/mis-turnos-por-mes/`
ahora que el detalle del dia trae siempre el acuerdo.

Manual de usuario: que dice «Mi Jornada» en el detalle del dia, las horas que la
corporacion le debe a el (6.10), y el aviso de envio lento — que pide COMPROBAR
antes de reenviar, porque cortar la espera no cancela nada en el servidor.

Se resella `.revisado-hasta` y se actualiza la cita de `dia_calendario_no_apto`
en los pendientes de arquitectura. PDFs y .docx regenerados.

Co-Authored-By: Claude Opus 5 <noreply@anthropic.com>
Claude-Session: https://claude.ai/code/session_01P4o5MaBcFLyLPxPjLeWUsu
</commit_message>
<xml_diff>
--- a/AppTurnosExplora/docs/pdf/Manual_Usuario.docx
+++ b/AppTurnosExplora/docs/pdf/Manual_Usuario.docx
@@ -42,7 +42,7 @@
           <w:color w:val="606060"/>
           <w:sz w:val="20"/>
         </w:rPr>
-        <w:t>Version 1.0  |  05/09/2026</w:t>
+        <w:t>Version 1.0  |  09/09/2026</w:t>
       </w:r>
     </w:p>
     <w:p>
@@ -1834,7 +1834,7 @@
               <w:rPr>
                 <w:sz w:val="20"/>
               </w:rPr>
-              <w:t>Día que te queda libre porque cediste tu jornada en una doblada. Se marca con ☕. &lt;!-- fuente: static/js/mis_turnos.js:459 --&gt;</w:t>
+              <w:t>Día que te queda libre porque un compañero trabaja por ti en una doblada: el que cediste o el que él te devuelve. Se marca con ☕. &lt;!-- fuente: static/js/mis_turnos.js:413-421,818-824 --&gt;</w:t>
             </w:r>
           </w:p>
         </w:tc>
@@ -4656,7 +4656,7 @@
               <w:rPr>
                 <w:sz w:val="20"/>
               </w:rPr>
-              <w:t>Día libre porque cediste tu jornada en una doblada</w:t>
+              <w:t>Día libre por una doblada: un compañero trabaja por ti, sea el día que cediste o el que te devuelven</w:t>
             </w:r>
           </w:p>
         </w:tc>
@@ -4821,12 +4821,84 @@
       </w:r>
     </w:p>
     <w:p>
-      <w:r>
-        <w:t xml:space="preserve">En el detalle del día, el nombre del acuerdo que modificó la jornada se muestra con su nombre real: </w:t>
-      </w:r>
-      <w:r>
-        <w:rPr>
+      <w:pPr>
+        <w:pStyle w:val="Heading4"/>
+      </w:pPr>
+      <w:r>
+        <w:t>Detalles del día: qué dice Mi Jornada</w:t>
+      </w:r>
+    </w:p>
+    <w:p>
+      <w:r>
+        <w:t>Cada día que una solicitud aprobada modificó te cuenta cuatro cosas: qué trabajas, de qué acuerdo viene, con quién es y cuándo se aprobó. Así se lee un día trabajado por una doblada permanente:</w:t>
+      </w:r>
+    </w:p>
+    <w:p>
+      <w:pPr>
+        <w:ind w:left="432"/>
+        <w:shd w:val="clear" w:fill="F7F7F0"/>
+      </w:pPr>
+      <w:r>
+        <w:rPr>
+          <w:b/>
           <w:i/>
+          <w:color w:val="606060"/>
+        </w:rPr>
+        <w:t>DOBLADA (AM + PM)</w:t>
+      </w:r>
+    </w:p>
+    <w:p>
+      <w:pPr>
+        <w:ind w:left="432"/>
+        <w:shd w:val="clear" w:fill="F7F7F0"/>
+      </w:pPr>
+    </w:p>
+    <w:p>
+      <w:pPr>
+        <w:ind w:left="432"/>
+        <w:shd w:val="clear" w:fill="F7F7F0"/>
+      </w:pPr>
+      <w:r>
+        <w:rPr>
+          <w:b/>
+          <w:i/>
+          <w:color w:val="606060"/>
+        </w:rPr>
+        <w:t>Doblada permanente:</w:t>
+      </w:r>
+      <w:r>
+        <w:rPr>
+          <w:i/>
+          <w:color w:val="606060"/>
+        </w:rPr>
+        <w:t xml:space="preserve"> Tu jornada predeterminada era AM; ahora trabajas DOBLADA (AM +</w:t>
+      </w:r>
+    </w:p>
+    <w:p>
+      <w:pPr>
+        <w:ind w:left="432"/>
+        <w:shd w:val="clear" w:fill="F7F7F0"/>
+      </w:pPr>
+      <w:r>
+        <w:rPr>
+          <w:i/>
+          <w:color w:val="606060"/>
+        </w:rPr>
+        <w:t>PM). Estás cubriendo a Arley Ramírez este día. Aprobado el 27/08/2026 14:29.</w:t>
+      </w:r>
+    </w:p>
+    <w:p>
+      <w:r>
+        <w:t>&lt;!-- fuente: static/js/utils/detalle-dia-mensajes.js (mensajeCambio); static/js/mis_turnos.js (mostrarDetallesDia) --&gt;</w:t>
+      </w:r>
+    </w:p>
+    <w:p>
+      <w:r>
+        <w:t xml:space="preserve">El acuerdo se nombra siempre por el trámite real: </w:t>
+      </w:r>
+      <w:r>
+        <w:rPr>
+          <w:i/>
         </w:rPr>
         <w:t>Cambio de turno</w:t>
       </w:r>
@@ -4867,75 +4939,86 @@
         <w:t>Doblada permanente</w:t>
       </w:r>
       <w:r>
+        <w:t xml:space="preserve">, </w:t>
+      </w:r>
+      <w:r>
+        <w:rPr>
+          <w:i/>
+        </w:rPr>
+        <w:t>Doblada de fin de semana</w:t>
+      </w:r>
+      <w:r>
         <w:t xml:space="preserve"> o </w:t>
       </w:r>
       <w:r>
         <w:rPr>
           <w:i/>
         </w:rPr>
-        <w:t>Doblada de fin de semana</w:t>
-      </w:r>
-      <w:r>
-        <w:t>. &lt;!-- fuente: static/js/mis_turnos.js:590-597 --&gt;</w:t>
-      </w:r>
-    </w:p>
-    <w:p>
-      <w:r>
-        <w:t xml:space="preserve">Si en el detalle del día la sala aparece como </w:t>
-      </w:r>
-      <w:r>
-        <w:rPr>
-          <w:b/>
-        </w:rPr>
-        <w:t>Por asignar</w:t>
-      </w:r>
-      <w:r>
-        <w:t>, no es un fallo ni te falta nada: significa que ese turno todavía no tiene sala asignada. El turno es válido y cuenta igual; la sala la completa tu supervisor. &lt;!-- fuente: turnos/services/mis_turnos_dia.py:77,141,205,235; turnos/services/turno_service.py:166 --&gt;</w:t>
-      </w:r>
-    </w:p>
-    <w:p>
-      <w:r>
-        <w:t xml:space="preserve">Un detalle de vocabulario: entre semana, trabajar AM y PM el mismo día se muestra como </w:t>
-      </w:r>
-      <w:r>
-        <w:rPr>
-          <w:b/>
-        </w:rPr>
-        <w:t>DOBLADA (AM + PM)</w:t>
-      </w:r>
-      <w:r>
-        <w:t xml:space="preserve">; en sábado o domingo, como </w:t>
-      </w:r>
-      <w:r>
-        <w:rPr>
-          <w:b/>
-        </w:rPr>
-        <w:t>DÍA COMPLETO (AM + PM)</w:t>
-      </w:r>
-      <w:r>
-        <w:t>, porque en fin de semana lo habitual es trabajar el día entero y no es un esfuerzo extra. &lt;!-- fuente: static/js/mis_turnos.js:742 --&gt;</w:t>
+        <w:t>Pago reprogramado</w:t>
+      </w:r>
+      <w:r>
+        <w:t>. &lt;!-- fuente: static/js/utils/detalle-dia-mensajes.js (NOMBRE_ACUERDO) --&gt;</w:t>
+      </w:r>
+    </w:p>
+    <w:p>
+      <w:r>
+        <w:t>La primera frase dice qué cambió, en una de estas tres formas:</w:t>
       </w:r>
     </w:p>
     <w:p>
       <w:pPr>
-        <w:pStyle w:val="Heading3"/>
+        <w:pStyle w:val="ListNumber"/>
       </w:pPr>
       <w:r>
-        <w:t>3.3 Estado de una solicitud</w:t>
-      </w:r>
-    </w:p>
-    <w:p>
-      <w:r>
-        <w:t xml:space="preserve">En </w:t>
-      </w:r>
-      <w:r>
-        <w:rPr>
-          <w:b/>
-        </w:rPr>
-        <w:t>Mis Solicitudes</w:t>
-      </w:r>
-      <w:r>
-        <w:t xml:space="preserve"> cada fila tiene un estado.</w:t>
+        <w:rPr>
+          <w:i/>
+        </w:rPr>
+        <w:t>"Tu jornada predeterminada era AM; ahora trabajas DOBLADA (AM + PM)."</w:t>
+      </w:r>
+      <w:r>
+        <w:t xml:space="preserve"> — lo habitual.</w:t>
+      </w:r>
+    </w:p>
+    <w:p>
+      <w:pPr>
+        <w:pStyle w:val="ListNumber"/>
+      </w:pPr>
+      <w:r>
+        <w:rPr>
+          <w:i/>
+        </w:rPr>
+        <w:t>"Normalmente descansabas este día; por este acuerdo trabajas PM."</w:t>
+      </w:r>
+      <w:r>
+        <w:t xml:space="preserve"> — cuando ese día</w:t>
+      </w:r>
+    </w:p>
+    <w:p>
+      <w:r>
+        <w:t>descansabas y el acuerdo te pone a trabajar.</w:t>
+      </w:r>
+    </w:p>
+    <w:p>
+      <w:pPr>
+        <w:pStyle w:val="ListNumber"/>
+      </w:pPr>
+      <w:r>
+        <w:t>*"Este turno fue modificado por un cambio aprobado. Tu jornada actual (AM) coincide con</w:t>
+      </w:r>
+    </w:p>
+    <w:p>
+      <w:r>
+        <w:t>tu jornada predeterminada."* — cuando el acuerdo te deja la misma jornada que ya tenías.</w:t>
+      </w:r>
+    </w:p>
+    <w:p>
+      <w:r>
+        <w:t>&lt;!-- fuente: static/js/utils/detalle-dia-mensajes.js (mensajeCambio) --&gt;</w:t>
+      </w:r>
+    </w:p>
+    <w:p>
+      <w:r>
+        <w:t>Después viene con quién. El compañero aparece con nombre y apellido, y la frase que lo acompaña cambia según el trámite, porque no todos significan lo mismo. &lt;!-- fuente: solicitudes/services/acuerdo_por_dia_service.py (companero_nombre: nombre y apellido) --&gt;</w:t>
       </w:r>
     </w:p>
     <w:tbl>
@@ -4966,7 +5049,7 @@
               <w:rPr>
                 <w:b/>
               </w:rPr>
-              <w:t>Estado</w:t>
+              <w:t>Acuerdo</w:t>
             </w:r>
           </w:p>
         </w:tc>
@@ -4984,7 +5067,7 @@
               <w:rPr>
                 <w:b/>
               </w:rPr>
-              <w:t>Qué significa</w:t>
+              <w:t>Frase que ves</w:t>
             </w:r>
           </w:p>
         </w:tc>
@@ -5002,7 +5085,7 @@
               <w:rPr>
                 <w:b/>
               </w:rPr>
-              <w:t>Qué puedes hacer</w:t>
+              <w:t>Qué quiere decir</w:t>
             </w:r>
           </w:p>
         </w:tc>
@@ -5023,50 +5106,82 @@
                 <w:b/>
                 <w:sz w:val="20"/>
               </w:rPr>
-              <w:t>Pendiente</w:t>
-            </w:r>
-          </w:p>
-        </w:tc>
-        <w:tc>
-          <w:tcPr>
-            <w:tcW w:type="dxa" w:w="2880"/>
-          </w:tcPr>
-          <w:p>
-            <w:r>
-              <w:rPr>
-                <w:sz w:val="20"/>
-              </w:rPr>
-            </w:r>
-            <w:r>
-              <w:rPr>
-                <w:sz w:val="20"/>
-              </w:rPr>
-              <w:t>Falta al menos una de las dos aprobaciones</w:t>
-            </w:r>
-          </w:p>
-        </w:tc>
-        <w:tc>
-          <w:tcPr>
-            <w:tcW w:type="dxa" w:w="2880"/>
-          </w:tcPr>
-          <w:p>
-            <w:r>
-              <w:rPr>
-                <w:sz w:val="20"/>
-              </w:rPr>
+              <w:t>Doblada</w:t>
+            </w:r>
+            <w:r>
+              <w:rPr>
+                <w:sz w:val="20"/>
+              </w:rPr>
+              <w:t xml:space="preserve">, </w:t>
             </w:r>
             <w:r>
               <w:rPr>
                 <w:b/>
                 <w:sz w:val="20"/>
               </w:rPr>
-              <w:t>Cancelar</w:t>
-            </w:r>
-            <w:r>
-              <w:rPr>
-                <w:sz w:val="20"/>
-              </w:rPr>
-              <w:t>, sin límite de tiempo y en el acto</w:t>
+              <w:t>Doblada de fin de semana</w:t>
+            </w:r>
+            <w:r>
+              <w:rPr>
+                <w:sz w:val="20"/>
+              </w:rPr>
+              <w:t xml:space="preserve">, </w:t>
+            </w:r>
+            <w:r>
+              <w:rPr>
+                <w:b/>
+                <w:sz w:val="20"/>
+              </w:rPr>
+              <w:t>Doblada permanente</w:t>
+            </w:r>
+          </w:p>
+        </w:tc>
+        <w:tc>
+          <w:tcPr>
+            <w:tcW w:type="dxa" w:w="2880"/>
+          </w:tcPr>
+          <w:p>
+            <w:r>
+              <w:rPr>
+                <w:sz w:val="20"/>
+              </w:rPr>
+            </w:r>
+            <w:r>
+              <w:rPr>
+                <w:sz w:val="20"/>
+              </w:rPr>
+              <w:t xml:space="preserve">"Estás </w:t>
+            </w:r>
+            <w:r>
+              <w:rPr>
+                <w:b/>
+                <w:sz w:val="20"/>
+              </w:rPr>
+              <w:t>cubriendo a</w:t>
+            </w:r>
+            <w:r>
+              <w:rPr>
+                <w:sz w:val="20"/>
+              </w:rPr>
+              <w:t xml:space="preserve"> Arley Ramírez este día."</w:t>
+            </w:r>
+          </w:p>
+        </w:tc>
+        <w:tc>
+          <w:tcPr>
+            <w:tcW w:type="dxa" w:w="2880"/>
+          </w:tcPr>
+          <w:p>
+            <w:r>
+              <w:rPr>
+                <w:sz w:val="20"/>
+              </w:rPr>
+            </w:r>
+            <w:r>
+              <w:rPr>
+                <w:sz w:val="20"/>
+              </w:rPr>
+              <w:t>El favor lo haces tú: trabajas el día que él cedió</w:t>
             </w:r>
           </w:p>
         </w:tc>
@@ -5084,53 +5199,58 @@
             </w:r>
             <w:r>
               <w:rPr>
+                <w:sz w:val="20"/>
+              </w:rPr>
+              <w:t>Los mismos tres</w:t>
+            </w:r>
+          </w:p>
+        </w:tc>
+        <w:tc>
+          <w:tcPr>
+            <w:tcW w:type="dxa" w:w="2880"/>
+          </w:tcPr>
+          <w:p>
+            <w:r>
+              <w:rPr>
+                <w:sz w:val="20"/>
+              </w:rPr>
+            </w:r>
+            <w:r>
+              <w:rPr>
+                <w:sz w:val="20"/>
+              </w:rPr>
+              <w:t xml:space="preserve">"Estás </w:t>
+            </w:r>
+            <w:r>
+              <w:rPr>
                 <w:b/>
                 <w:sz w:val="20"/>
               </w:rPr>
-              <w:t>Aprobada</w:t>
-            </w:r>
-          </w:p>
-        </w:tc>
-        <w:tc>
-          <w:tcPr>
-            <w:tcW w:type="dxa" w:w="2880"/>
-          </w:tcPr>
-          <w:p>
-            <w:r>
-              <w:rPr>
-                <w:sz w:val="20"/>
-              </w:rPr>
-            </w:r>
-            <w:r>
-              <w:rPr>
-                <w:sz w:val="20"/>
-              </w:rPr>
-              <w:t>Compañero y supervisor aprobaron; el calendario ya cambió</w:t>
-            </w:r>
-          </w:p>
-        </w:tc>
-        <w:tc>
-          <w:tcPr>
-            <w:tcW w:type="dxa" w:w="2880"/>
-          </w:tcPr>
-          <w:p>
-            <w:r>
-              <w:rPr>
-                <w:sz w:val="20"/>
-              </w:rPr>
-            </w:r>
-            <w:r>
-              <w:rPr>
-                <w:b/>
-                <w:sz w:val="20"/>
-              </w:rPr>
-              <w:t>Pedir cancelación</w:t>
-            </w:r>
-            <w:r>
-              <w:rPr>
-                <w:sz w:val="20"/>
-              </w:rPr>
-              <w:t xml:space="preserve"> al compañero, dentro de las 24 horas siguientes</w:t>
+              <w:t>devolviéndole el favor a</w:t>
+            </w:r>
+            <w:r>
+              <w:rPr>
+                <w:sz w:val="20"/>
+              </w:rPr>
+              <w:t xml:space="preserve"> Arley Ramírez."</w:t>
+            </w:r>
+          </w:p>
+        </w:tc>
+        <w:tc>
+          <w:tcPr>
+            <w:tcW w:type="dxa" w:w="2880"/>
+          </w:tcPr>
+          <w:p>
+            <w:r>
+              <w:rPr>
+                <w:sz w:val="20"/>
+              </w:rPr>
+            </w:r>
+            <w:r>
+              <w:rPr>
+                <w:sz w:val="20"/>
+              </w:rPr>
+              <w:t>Estás pagando el día que él trabajó por ti</w:t>
             </w:r>
           </w:p>
         </w:tc>
@@ -5151,43 +5271,56 @@
                 <w:b/>
                 <w:sz w:val="20"/>
               </w:rPr>
-              <w:t>Rechazada</w:t>
-            </w:r>
-          </w:p>
-        </w:tc>
-        <w:tc>
-          <w:tcPr>
-            <w:tcW w:type="dxa" w:w="2880"/>
-          </w:tcPr>
-          <w:p>
-            <w:r>
-              <w:rPr>
-                <w:sz w:val="20"/>
-              </w:rPr>
-            </w:r>
-            <w:r>
-              <w:rPr>
-                <w:sz w:val="20"/>
-              </w:rPr>
-              <w:t>Alguien la rechazó; nada cambia</w:t>
-            </w:r>
-          </w:p>
-        </w:tc>
-        <w:tc>
-          <w:tcPr>
-            <w:tcW w:type="dxa" w:w="2880"/>
-          </w:tcPr>
-          <w:p>
-            <w:r>
-              <w:rPr>
-                <w:sz w:val="20"/>
-              </w:rPr>
-            </w:r>
-            <w:r>
-              <w:rPr>
-                <w:sz w:val="20"/>
-              </w:rPr>
-              <w:t>Nada; envía otra si procede</w:t>
+              <w:t>Cambio de día de descanso</w:t>
+            </w:r>
+          </w:p>
+        </w:tc>
+        <w:tc>
+          <w:tcPr>
+            <w:tcW w:type="dxa" w:w="2880"/>
+          </w:tcPr>
+          <w:p>
+            <w:r>
+              <w:rPr>
+                <w:sz w:val="20"/>
+              </w:rPr>
+            </w:r>
+            <w:r>
+              <w:rPr>
+                <w:sz w:val="20"/>
+              </w:rPr>
+              <w:t>"</w:t>
+            </w:r>
+            <w:r>
+              <w:rPr>
+                <w:b/>
+                <w:sz w:val="20"/>
+              </w:rPr>
+              <w:t>Intercambio con</w:t>
+            </w:r>
+            <w:r>
+              <w:rPr>
+                <w:sz w:val="20"/>
+              </w:rPr>
+              <w:t xml:space="preserve"> Jessika Cardona."</w:t>
+            </w:r>
+          </w:p>
+        </w:tc>
+        <w:tc>
+          <w:tcPr>
+            <w:tcW w:type="dxa" w:w="2880"/>
+          </w:tcPr>
+          <w:p>
+            <w:r>
+              <w:rPr>
+                <w:sz w:val="20"/>
+              </w:rPr>
+            </w:r>
+            <w:r>
+              <w:rPr>
+                <w:sz w:val="20"/>
+              </w:rPr>
+              <w:t>Es un trueque: cada uno toma el día del otro y nadie queda debiendo</w:t>
             </w:r>
           </w:p>
         </w:tc>
@@ -5208,43 +5341,133 @@
                 <w:b/>
                 <w:sz w:val="20"/>
               </w:rPr>
-              <w:t>Cancelada</w:t>
-            </w:r>
-          </w:p>
-        </w:tc>
-        <w:tc>
-          <w:tcPr>
-            <w:tcW w:type="dxa" w:w="2880"/>
-          </w:tcPr>
-          <w:p>
-            <w:r>
-              <w:rPr>
-                <w:sz w:val="20"/>
-              </w:rPr>
-            </w:r>
-            <w:r>
-              <w:rPr>
-                <w:sz w:val="20"/>
-              </w:rPr>
-              <w:t>Se dio de baja</w:t>
-            </w:r>
-          </w:p>
-        </w:tc>
-        <w:tc>
-          <w:tcPr>
-            <w:tcW w:type="dxa" w:w="2880"/>
-          </w:tcPr>
-          <w:p>
-            <w:r>
-              <w:rPr>
-                <w:sz w:val="20"/>
-              </w:rPr>
-            </w:r>
-            <w:r>
-              <w:rPr>
-                <w:sz w:val="20"/>
-              </w:rPr>
-              <w:t>Nada</w:t>
+              <w:t>Cambio de turno</w:t>
+            </w:r>
+            <w:r>
+              <w:rPr>
+                <w:sz w:val="20"/>
+              </w:rPr>
+              <w:t xml:space="preserve">, </w:t>
+            </w:r>
+            <w:r>
+              <w:rPr>
+                <w:b/>
+                <w:sz w:val="20"/>
+              </w:rPr>
+              <w:t>Cambio de turno permanente</w:t>
+            </w:r>
+          </w:p>
+        </w:tc>
+        <w:tc>
+          <w:tcPr>
+            <w:tcW w:type="dxa" w:w="2880"/>
+          </w:tcPr>
+          <w:p>
+            <w:r>
+              <w:rPr>
+                <w:sz w:val="20"/>
+              </w:rPr>
+            </w:r>
+            <w:r>
+              <w:rPr>
+                <w:sz w:val="20"/>
+              </w:rPr>
+              <w:t>"</w:t>
+            </w:r>
+            <w:r>
+              <w:rPr>
+                <w:b/>
+                <w:sz w:val="20"/>
+              </w:rPr>
+              <w:t>Cambio con</w:t>
+            </w:r>
+            <w:r>
+              <w:rPr>
+                <w:sz w:val="20"/>
+              </w:rPr>
+              <w:t xml:space="preserve"> Jessika Cardona."</w:t>
+            </w:r>
+          </w:p>
+        </w:tc>
+        <w:tc>
+          <w:tcPr>
+            <w:tcW w:type="dxa" w:w="2880"/>
+          </w:tcPr>
+          <w:p>
+            <w:r>
+              <w:rPr>
+                <w:sz w:val="20"/>
+              </w:rPr>
+            </w:r>
+            <w:r>
+              <w:rPr>
+                <w:sz w:val="20"/>
+              </w:rPr>
+              <w:t>Os intercambiasteis la jornada</w:t>
+            </w:r>
+          </w:p>
+        </w:tc>
+      </w:tr>
+      <w:tr>
+        <w:tc>
+          <w:tcPr>
+            <w:tcW w:type="dxa" w:w="2880"/>
+          </w:tcPr>
+          <w:p>
+            <w:r>
+              <w:rPr>
+                <w:sz w:val="20"/>
+              </w:rPr>
+            </w:r>
+            <w:r>
+              <w:rPr>
+                <w:b/>
+                <w:sz w:val="20"/>
+              </w:rPr>
+              <w:t>Pago reprogramado</w:t>
+            </w:r>
+          </w:p>
+        </w:tc>
+        <w:tc>
+          <w:tcPr>
+            <w:tcW w:type="dxa" w:w="2880"/>
+          </w:tcPr>
+          <w:p>
+            <w:r>
+              <w:rPr>
+                <w:sz w:val="20"/>
+              </w:rPr>
+            </w:r>
+            <w:r>
+              <w:rPr>
+                <w:sz w:val="20"/>
+              </w:rPr>
+              <w:t>"Es la doblada que quedó pendiente con Arley Ramírez."</w:t>
+            </w:r>
+          </w:p>
+        </w:tc>
+        <w:tc>
+          <w:tcPr>
+            <w:tcW w:type="dxa" w:w="2880"/>
+          </w:tcPr>
+          <w:p>
+            <w:r>
+              <w:rPr>
+                <w:sz w:val="20"/>
+              </w:rPr>
+            </w:r>
+            <w:r>
+              <w:rPr>
+                <w:sz w:val="20"/>
+              </w:rPr>
+              <w:t xml:space="preserve">El día que tu supervisor programó para pagar una doblada que no pudiste cumplir; el texto añade </w:t>
+            </w:r>
+            <w:r>
+              <w:rPr>
+                <w:i/>
+                <w:sz w:val="20"/>
+              </w:rPr>
+              <w:t>"Programado por el supervisor."</w:t>
             </w:r>
           </w:p>
         </w:tc>
@@ -5253,44 +5476,35 @@
     <w:p/>
     <w:p>
       <w:r>
-        <w:t>&lt;!-- fuente: templates/solicitudes/mis_solicitudes_list.html (filtros Pendiente/Aprobada/Rechazada/Cancelada) --&gt; &lt;!-- fuente: core/constants.py (VENTANA_PEDIR_CANCELACION_HORAS = 24) --&gt;</w:t>
-      </w:r>
-    </w:p>
-    <w:p>
-      <w:r>
-        <w:t xml:space="preserve">En las filas aprobadas, el botón muestra una cuenta atrás con el tiempo que te queda: </w:t>
+        <w:t>&lt;!-- fuente: static/js/utils/detalle-dia-mensajes.js (conQuien; rama PAGO REPROGRAMADO de mensajeCambio) --&gt;</w:t>
+      </w:r>
+    </w:p>
+    <w:p>
+      <w:r>
+        <w:t xml:space="preserve">Cierra la fecha de aprobación, con día y hora: </w:t>
+      </w:r>
+      <w:r>
+        <w:rPr>
+          <w:i/>
+        </w:rPr>
+        <w:t>"Aprobado el 27/08/2026 14:29."</w:t>
+      </w:r>
+      <w:r>
+        <w:t xml:space="preserve"> &lt;!-- fuente: core/utils/date_utils.py (format_datetime_display: DD/MM/YYYY HH:MM en hora local) --&gt;</w:t>
+      </w:r>
+    </w:p>
+    <w:p>
+      <w:r>
+        <w:t xml:space="preserve">Los días en los que </w:t>
       </w:r>
       <w:r>
         <w:rPr>
           <w:b/>
         </w:rPr>
-        <w:t>Pedir cancelación (7h 12m)</w:t>
-      </w:r>
-      <w:r>
-        <w:t xml:space="preserve">. Cuando el plazo se agota, el botón se apaga y dice </w:t>
-      </w:r>
-      <w:r>
-        <w:rPr>
-          <w:i/>
-        </w:rPr>
-        <w:t>Expirado</w:t>
-      </w:r>
-      <w:r>
-        <w:t>. &lt;!-- fuente: static/js/solicitudes/mis_solicitudes_list.js (actualizarContadoresCancelacion) --&gt;</w:t>
-      </w:r>
-    </w:p>
-    <w:p>
-      <w:r>
-        <w:t xml:space="preserve">Una solicitud aprobada </w:t>
-      </w:r>
-      <w:r>
-        <w:rPr>
-          <w:b/>
-        </w:rPr>
-        <w:t>no se cancela sola</w:t>
-      </w:r>
-      <w:r>
-        <w:t>: se le pide al compañero. Por eso, cuando ya pediste la cancelación, en lugar del botón aparece una de estas tres etiquetas.</w:t>
+        <w:t>no</w:t>
+      </w:r>
+      <w:r>
+        <w:t xml:space="preserve"> trabajas siguen la misma regla.</w:t>
       </w:r>
     </w:p>
     <w:tbl>
@@ -5321,6 +5535,784 @@
               <w:rPr>
                 <w:b/>
               </w:rPr>
+              <w:t>Lo que ves</w:t>
+            </w:r>
+          </w:p>
+        </w:tc>
+        <w:tc>
+          <w:tcPr>
+            <w:tcW w:type="dxa" w:w="2880"/>
+          </w:tcPr>
+          <w:p>
+            <w:r>
+              <w:rPr>
+                <w:b/>
+              </w:rPr>
+            </w:r>
+            <w:r>
+              <w:rPr>
+                <w:b/>
+              </w:rPr>
+              <w:t>Cuándo aparece</w:t>
+            </w:r>
+          </w:p>
+        </w:tc>
+        <w:tc>
+          <w:tcPr>
+            <w:tcW w:type="dxa" w:w="2880"/>
+          </w:tcPr>
+          <w:p>
+            <w:r>
+              <w:rPr>
+                <w:b/>
+              </w:rPr>
+            </w:r>
+            <w:r>
+              <w:rPr>
+                <w:b/>
+              </w:rPr>
+              <w:t>Ejemplo del texto</w:t>
+            </w:r>
+          </w:p>
+        </w:tc>
+      </w:tr>
+      <w:tr>
+        <w:tc>
+          <w:tcPr>
+            <w:tcW w:type="dxa" w:w="2880"/>
+          </w:tcPr>
+          <w:p>
+            <w:r>
+              <w:rPr>
+                <w:sz w:val="20"/>
+              </w:rPr>
+            </w:r>
+            <w:r>
+              <w:rPr>
+                <w:sz w:val="20"/>
+              </w:rPr>
+              <w:t xml:space="preserve">Etiqueta </w:t>
+            </w:r>
+            <w:r>
+              <w:rPr>
+                <w:b/>
+                <w:sz w:val="20"/>
+              </w:rPr>
+              <w:t>DÍA LIBRE</w:t>
+            </w:r>
+            <w:r>
+              <w:rPr>
+                <w:sz w:val="20"/>
+              </w:rPr>
+              <w:t>, encabezada por el nombre del acuerdo</w:t>
+            </w:r>
+          </w:p>
+        </w:tc>
+        <w:tc>
+          <w:tcPr>
+            <w:tcW w:type="dxa" w:w="2880"/>
+          </w:tcPr>
+          <w:p>
+            <w:r>
+              <w:rPr>
+                <w:sz w:val="20"/>
+              </w:rPr>
+            </w:r>
+            <w:r>
+              <w:rPr>
+                <w:sz w:val="20"/>
+              </w:rPr>
+              <w:t>Quedaste libre porque un compañero cubre tu jornada</w:t>
+            </w:r>
+          </w:p>
+        </w:tc>
+        <w:tc>
+          <w:tcPr>
+            <w:tcW w:type="dxa" w:w="2880"/>
+          </w:tcPr>
+          <w:p>
+            <w:r>
+              <w:rPr>
+                <w:sz w:val="20"/>
+              </w:rPr>
+            </w:r>
+            <w:r>
+              <w:rPr>
+                <w:sz w:val="20"/>
+              </w:rPr>
+              <w:t>*"</w:t>
+            </w:r>
+            <w:r>
+              <w:rPr>
+                <w:b/>
+                <w:sz w:val="20"/>
+              </w:rPr>
+              <w:t>Doblada permanente:</w:t>
+            </w:r>
+            <w:r>
+              <w:rPr>
+                <w:sz w:val="20"/>
+              </w:rPr>
+              <w:t xml:space="preserve"> El compañero Arley Ramírez está trabajando por ti este día. Aprobado el 27/08/2026 14:29."*</w:t>
+            </w:r>
+          </w:p>
+        </w:tc>
+      </w:tr>
+      <w:tr>
+        <w:tc>
+          <w:tcPr>
+            <w:tcW w:type="dxa" w:w="2880"/>
+          </w:tcPr>
+          <w:p>
+            <w:r>
+              <w:rPr>
+                <w:sz w:val="20"/>
+              </w:rPr>
+            </w:r>
+            <w:r>
+              <w:rPr>
+                <w:sz w:val="20"/>
+              </w:rPr>
+              <w:t xml:space="preserve">Etiqueta </w:t>
+            </w:r>
+            <w:r>
+              <w:rPr>
+                <w:b/>
+                <w:sz w:val="20"/>
+              </w:rPr>
+              <w:t>DESCANSO</w:t>
+            </w:r>
+            <w:r>
+              <w:rPr>
+                <w:sz w:val="20"/>
+              </w:rPr>
+              <w:t xml:space="preserve">, encabezada por </w:t>
+            </w:r>
+            <w:r>
+              <w:rPr>
+                <w:b/>
+                <w:sz w:val="20"/>
+              </w:rPr>
+              <w:t>Cambio de día de descanso</w:t>
+            </w:r>
+          </w:p>
+        </w:tc>
+        <w:tc>
+          <w:tcPr>
+            <w:tcW w:type="dxa" w:w="2880"/>
+          </w:tcPr>
+          <w:p>
+            <w:r>
+              <w:rPr>
+                <w:sz w:val="20"/>
+              </w:rPr>
+            </w:r>
+            <w:r>
+              <w:rPr>
+                <w:sz w:val="20"/>
+              </w:rPr>
+              <w:t>Tu descanso se movió de día por un intercambio</w:t>
+            </w:r>
+          </w:p>
+        </w:tc>
+        <w:tc>
+          <w:tcPr>
+            <w:tcW w:type="dxa" w:w="2880"/>
+          </w:tcPr>
+          <w:p>
+            <w:r>
+              <w:rPr>
+                <w:sz w:val="20"/>
+              </w:rPr>
+            </w:r>
+            <w:r>
+              <w:rPr>
+                <w:sz w:val="20"/>
+              </w:rPr>
+              <w:t>*"</w:t>
+            </w:r>
+            <w:r>
+              <w:rPr>
+                <w:b/>
+                <w:sz w:val="20"/>
+              </w:rPr>
+              <w:t>Cambio de día de descanso:</w:t>
+            </w:r>
+            <w:r>
+              <w:rPr>
+                <w:sz w:val="20"/>
+              </w:rPr>
+              <w:t xml:space="preserve"> Descanso intercambiado con Jessika Cardona. Aprobado el 08/09/2026 16:18."*</w:t>
+            </w:r>
+          </w:p>
+        </w:tc>
+      </w:tr>
+      <w:tr>
+        <w:tc>
+          <w:tcPr>
+            <w:tcW w:type="dxa" w:w="2880"/>
+          </w:tcPr>
+          <w:p>
+            <w:r>
+              <w:rPr>
+                <w:sz w:val="20"/>
+              </w:rPr>
+            </w:r>
+            <w:r>
+              <w:rPr>
+                <w:sz w:val="20"/>
+              </w:rPr>
+              <w:t xml:space="preserve">Etiqueta </w:t>
+            </w:r>
+            <w:r>
+              <w:rPr>
+                <w:b/>
+                <w:sz w:val="20"/>
+              </w:rPr>
+              <w:t>DESCANSO</w:t>
+            </w:r>
+            <w:r>
+              <w:rPr>
+                <w:sz w:val="20"/>
+              </w:rPr>
+              <w:t xml:space="preserve">, encabezada por </w:t>
+            </w:r>
+            <w:r>
+              <w:rPr>
+                <w:b/>
+                <w:sz w:val="20"/>
+              </w:rPr>
+              <w:t>Día de descanso</w:t>
+            </w:r>
+          </w:p>
+        </w:tc>
+        <w:tc>
+          <w:tcPr>
+            <w:tcW w:type="dxa" w:w="2880"/>
+          </w:tcPr>
+          <w:p>
+            <w:r>
+              <w:rPr>
+                <w:sz w:val="20"/>
+              </w:rPr>
+            </w:r>
+            <w:r>
+              <w:rPr>
+                <w:sz w:val="20"/>
+              </w:rPr>
+              <w:t>Descanso de tu programación: mantenimiento, temporada o fin de semana</w:t>
+            </w:r>
+          </w:p>
+        </w:tc>
+        <w:tc>
+          <w:tcPr>
+            <w:tcW w:type="dxa" w:w="2880"/>
+          </w:tcPr>
+          <w:p>
+            <w:r>
+              <w:rPr>
+                <w:sz w:val="20"/>
+              </w:rPr>
+            </w:r>
+            <w:r>
+              <w:rPr>
+                <w:sz w:val="20"/>
+              </w:rPr>
+              <w:t>*"</w:t>
+            </w:r>
+            <w:r>
+              <w:rPr>
+                <w:b/>
+                <w:sz w:val="20"/>
+              </w:rPr>
+              <w:t>Día de descanso:</w:t>
+            </w:r>
+            <w:r>
+              <w:rPr>
+                <w:sz w:val="20"/>
+              </w:rPr>
+              <w:t xml:space="preserve"> Descanso por día de mantenimiento."*</w:t>
+            </w:r>
+          </w:p>
+        </w:tc>
+      </w:tr>
+    </w:tbl>
+    <w:p/>
+    <w:p>
+      <w:r>
+        <w:t>&lt;!-- fuente: static/js/utils/detalle-dia-mensajes.js (mensajeDescanso) --&gt; &lt;!-- fuente: turnos/services/mis_turnos_dia.py (descanso_info); solicitudes/services/descanso_solicitud_service.py --&gt;</w:t>
+      </w:r>
+    </w:p>
+    <w:p>
+      <w:r>
+        <w:t>Un descanso que viene de tu programación no lo pactó nadie contigo: por eso no nombra a ningún compañero ni lleva fecha de aprobación. Si un día de descanso no menciona a nadie, es tuyo por calendario y no hay nada que revisar. &lt;!-- fuente: turnos/services/mis_turnos_dia.py (descanso de temporada y mantenimiento, sin compañero ni fecha) --&gt;</w:t>
+      </w:r>
+    </w:p>
+    <w:p>
+      <w:r>
+        <w:t xml:space="preserve">Cuando el acuerdo tiene sus dos fechas —el día que cediste y el día en que se paga—, el texto añade la otra: </w:t>
+      </w:r>
+      <w:r>
+        <w:rPr>
+          <w:i/>
+        </w:rPr>
+        <w:t>"Pagarás el 15/09/2026."</w:t>
+      </w:r>
+      <w:r>
+        <w:t xml:space="preserve"> en el día que cediste y </w:t>
+      </w:r>
+      <w:r>
+        <w:rPr>
+          <w:i/>
+        </w:rPr>
+        <w:t>"Tú lo cubriste el 01/09/2026."</w:t>
+      </w:r>
+      <w:r>
+        <w:t xml:space="preserve"> en el día que te devuelven. Los acuerdos permanentes no la llevan, porque son un rango de fechas y no un par. &lt;!-- fuente: static/js/utils/detalle-dia-mensajes.js (mensajeDescanso: fecha_pago y fecha_cesion) --&gt; &lt;!-- fuente: solicitudes/services/descanso_solicitud_service.py (DOBLADA PERMANENTE deja ambas fechas vacías) --&gt;</w:t>
+      </w:r>
+    </w:p>
+    <w:p>
+      <w:r>
+        <w:t xml:space="preserve">Si en el detalle del día la sala aparece como </w:t>
+      </w:r>
+      <w:r>
+        <w:rPr>
+          <w:b/>
+        </w:rPr>
+        <w:t>Por asignar</w:t>
+      </w:r>
+      <w:r>
+        <w:t>, no es un fallo ni te falta nada: significa que ese turno todavía no tiene sala asignada. El turno es válido y cuenta igual; la sala la completa tu supervisor. &lt;!-- fuente: turnos/services/mis_turnos_dia.py:77,141,205,235; turnos/services/turno_service.py:166 --&gt;</w:t>
+      </w:r>
+    </w:p>
+    <w:p>
+      <w:r>
+        <w:t xml:space="preserve">Un detalle de vocabulario: entre semana, trabajar AM y PM el mismo día se muestra como </w:t>
+      </w:r>
+      <w:r>
+        <w:rPr>
+          <w:b/>
+        </w:rPr>
+        <w:t>DOBLADA (AM + PM)</w:t>
+      </w:r>
+      <w:r>
+        <w:t xml:space="preserve">; en sábado o domingo, como </w:t>
+      </w:r>
+      <w:r>
+        <w:rPr>
+          <w:b/>
+        </w:rPr>
+        <w:t>DÍA COMPLETO (AM + PM)</w:t>
+      </w:r>
+      <w:r>
+        <w:t>, porque en fin de semana lo habitual es trabajar el día entero y no es un esfuerzo extra. &lt;!-- fuente: static/js/mis_turnos.js:742 --&gt;</w:t>
+      </w:r>
+    </w:p>
+    <w:p>
+      <w:pPr>
+        <w:pStyle w:val="Heading3"/>
+      </w:pPr>
+      <w:r>
+        <w:t>3.3 Estado de una solicitud</w:t>
+      </w:r>
+    </w:p>
+    <w:p>
+      <w:r>
+        <w:t xml:space="preserve">En </w:t>
+      </w:r>
+      <w:r>
+        <w:rPr>
+          <w:b/>
+        </w:rPr>
+        <w:t>Mis Solicitudes</w:t>
+      </w:r>
+      <w:r>
+        <w:t xml:space="preserve"> cada fila tiene un estado.</w:t>
+      </w:r>
+    </w:p>
+    <w:tbl>
+      <w:tblPr>
+        <w:tblStyle w:val="LightGrid-Accent1"/>
+        <w:tblW w:type="auto" w:w="0"/>
+        <w:jc w:val="center"/>
+        <w:tblLayout w:type="autofit"/>
+        <w:tblLook w:firstColumn="1" w:firstRow="1" w:lastColumn="0" w:lastRow="0" w:noHBand="0" w:noVBand="1" w:val="04A0"/>
+      </w:tblPr>
+      <w:tblGrid>
+        <w:gridCol w:w="2880"/>
+        <w:gridCol w:w="2880"/>
+        <w:gridCol w:w="2880"/>
+      </w:tblGrid>
+      <w:tr>
+        <w:tc>
+          <w:tcPr>
+            <w:tcW w:type="dxa" w:w="2880"/>
+          </w:tcPr>
+          <w:p>
+            <w:r>
+              <w:rPr>
+                <w:b/>
+              </w:rPr>
+            </w:r>
+            <w:r>
+              <w:rPr>
+                <w:b/>
+              </w:rPr>
+              <w:t>Estado</w:t>
+            </w:r>
+          </w:p>
+        </w:tc>
+        <w:tc>
+          <w:tcPr>
+            <w:tcW w:type="dxa" w:w="2880"/>
+          </w:tcPr>
+          <w:p>
+            <w:r>
+              <w:rPr>
+                <w:b/>
+              </w:rPr>
+            </w:r>
+            <w:r>
+              <w:rPr>
+                <w:b/>
+              </w:rPr>
+              <w:t>Qué significa</w:t>
+            </w:r>
+          </w:p>
+        </w:tc>
+        <w:tc>
+          <w:tcPr>
+            <w:tcW w:type="dxa" w:w="2880"/>
+          </w:tcPr>
+          <w:p>
+            <w:r>
+              <w:rPr>
+                <w:b/>
+              </w:rPr>
+            </w:r>
+            <w:r>
+              <w:rPr>
+                <w:b/>
+              </w:rPr>
+              <w:t>Qué puedes hacer</w:t>
+            </w:r>
+          </w:p>
+        </w:tc>
+      </w:tr>
+      <w:tr>
+        <w:tc>
+          <w:tcPr>
+            <w:tcW w:type="dxa" w:w="2880"/>
+          </w:tcPr>
+          <w:p>
+            <w:r>
+              <w:rPr>
+                <w:sz w:val="20"/>
+              </w:rPr>
+            </w:r>
+            <w:r>
+              <w:rPr>
+                <w:b/>
+                <w:sz w:val="20"/>
+              </w:rPr>
+              <w:t>Pendiente</w:t>
+            </w:r>
+          </w:p>
+        </w:tc>
+        <w:tc>
+          <w:tcPr>
+            <w:tcW w:type="dxa" w:w="2880"/>
+          </w:tcPr>
+          <w:p>
+            <w:r>
+              <w:rPr>
+                <w:sz w:val="20"/>
+              </w:rPr>
+            </w:r>
+            <w:r>
+              <w:rPr>
+                <w:sz w:val="20"/>
+              </w:rPr>
+              <w:t>Falta al menos una de las dos aprobaciones</w:t>
+            </w:r>
+          </w:p>
+        </w:tc>
+        <w:tc>
+          <w:tcPr>
+            <w:tcW w:type="dxa" w:w="2880"/>
+          </w:tcPr>
+          <w:p>
+            <w:r>
+              <w:rPr>
+                <w:sz w:val="20"/>
+              </w:rPr>
+            </w:r>
+            <w:r>
+              <w:rPr>
+                <w:b/>
+                <w:sz w:val="20"/>
+              </w:rPr>
+              <w:t>Cancelar</w:t>
+            </w:r>
+            <w:r>
+              <w:rPr>
+                <w:sz w:val="20"/>
+              </w:rPr>
+              <w:t>, sin límite de tiempo y en el acto</w:t>
+            </w:r>
+          </w:p>
+        </w:tc>
+      </w:tr>
+      <w:tr>
+        <w:tc>
+          <w:tcPr>
+            <w:tcW w:type="dxa" w:w="2880"/>
+          </w:tcPr>
+          <w:p>
+            <w:r>
+              <w:rPr>
+                <w:sz w:val="20"/>
+              </w:rPr>
+            </w:r>
+            <w:r>
+              <w:rPr>
+                <w:b/>
+                <w:sz w:val="20"/>
+              </w:rPr>
+              <w:t>Aprobada</w:t>
+            </w:r>
+          </w:p>
+        </w:tc>
+        <w:tc>
+          <w:tcPr>
+            <w:tcW w:type="dxa" w:w="2880"/>
+          </w:tcPr>
+          <w:p>
+            <w:r>
+              <w:rPr>
+                <w:sz w:val="20"/>
+              </w:rPr>
+            </w:r>
+            <w:r>
+              <w:rPr>
+                <w:sz w:val="20"/>
+              </w:rPr>
+              <w:t>Compañero y supervisor aprobaron; el calendario ya cambió</w:t>
+            </w:r>
+          </w:p>
+        </w:tc>
+        <w:tc>
+          <w:tcPr>
+            <w:tcW w:type="dxa" w:w="2880"/>
+          </w:tcPr>
+          <w:p>
+            <w:r>
+              <w:rPr>
+                <w:sz w:val="20"/>
+              </w:rPr>
+            </w:r>
+            <w:r>
+              <w:rPr>
+                <w:b/>
+                <w:sz w:val="20"/>
+              </w:rPr>
+              <w:t>Pedir cancelación</w:t>
+            </w:r>
+            <w:r>
+              <w:rPr>
+                <w:sz w:val="20"/>
+              </w:rPr>
+              <w:t xml:space="preserve"> al compañero, dentro de las 24 horas siguientes</w:t>
+            </w:r>
+          </w:p>
+        </w:tc>
+      </w:tr>
+      <w:tr>
+        <w:tc>
+          <w:tcPr>
+            <w:tcW w:type="dxa" w:w="2880"/>
+          </w:tcPr>
+          <w:p>
+            <w:r>
+              <w:rPr>
+                <w:sz w:val="20"/>
+              </w:rPr>
+            </w:r>
+            <w:r>
+              <w:rPr>
+                <w:b/>
+                <w:sz w:val="20"/>
+              </w:rPr>
+              <w:t>Rechazada</w:t>
+            </w:r>
+          </w:p>
+        </w:tc>
+        <w:tc>
+          <w:tcPr>
+            <w:tcW w:type="dxa" w:w="2880"/>
+          </w:tcPr>
+          <w:p>
+            <w:r>
+              <w:rPr>
+                <w:sz w:val="20"/>
+              </w:rPr>
+            </w:r>
+            <w:r>
+              <w:rPr>
+                <w:sz w:val="20"/>
+              </w:rPr>
+              <w:t>Alguien la rechazó; nada cambia</w:t>
+            </w:r>
+          </w:p>
+        </w:tc>
+        <w:tc>
+          <w:tcPr>
+            <w:tcW w:type="dxa" w:w="2880"/>
+          </w:tcPr>
+          <w:p>
+            <w:r>
+              <w:rPr>
+                <w:sz w:val="20"/>
+              </w:rPr>
+            </w:r>
+            <w:r>
+              <w:rPr>
+                <w:sz w:val="20"/>
+              </w:rPr>
+              <w:t>Nada; envía otra si procede</w:t>
+            </w:r>
+          </w:p>
+        </w:tc>
+      </w:tr>
+      <w:tr>
+        <w:tc>
+          <w:tcPr>
+            <w:tcW w:type="dxa" w:w="2880"/>
+          </w:tcPr>
+          <w:p>
+            <w:r>
+              <w:rPr>
+                <w:sz w:val="20"/>
+              </w:rPr>
+            </w:r>
+            <w:r>
+              <w:rPr>
+                <w:b/>
+                <w:sz w:val="20"/>
+              </w:rPr>
+              <w:t>Cancelada</w:t>
+            </w:r>
+          </w:p>
+        </w:tc>
+        <w:tc>
+          <w:tcPr>
+            <w:tcW w:type="dxa" w:w="2880"/>
+          </w:tcPr>
+          <w:p>
+            <w:r>
+              <w:rPr>
+                <w:sz w:val="20"/>
+              </w:rPr>
+            </w:r>
+            <w:r>
+              <w:rPr>
+                <w:sz w:val="20"/>
+              </w:rPr>
+              <w:t>Se dio de baja</w:t>
+            </w:r>
+          </w:p>
+        </w:tc>
+        <w:tc>
+          <w:tcPr>
+            <w:tcW w:type="dxa" w:w="2880"/>
+          </w:tcPr>
+          <w:p>
+            <w:r>
+              <w:rPr>
+                <w:sz w:val="20"/>
+              </w:rPr>
+            </w:r>
+            <w:r>
+              <w:rPr>
+                <w:sz w:val="20"/>
+              </w:rPr>
+              <w:t>Nada</w:t>
+            </w:r>
+          </w:p>
+        </w:tc>
+      </w:tr>
+    </w:tbl>
+    <w:p/>
+    <w:p>
+      <w:r>
+        <w:t>&lt;!-- fuente: templates/solicitudes/mis_solicitudes_list.html (filtros Pendiente/Aprobada/Rechazada/Cancelada) --&gt; &lt;!-- fuente: core/constants.py (VENTANA_PEDIR_CANCELACION_HORAS = 24) --&gt;</w:t>
+      </w:r>
+    </w:p>
+    <w:p>
+      <w:r>
+        <w:t xml:space="preserve">En las filas aprobadas, el botón muestra una cuenta atrás con el tiempo que te queda: </w:t>
+      </w:r>
+      <w:r>
+        <w:rPr>
+          <w:b/>
+        </w:rPr>
+        <w:t>Pedir cancelación (7h 12m)</w:t>
+      </w:r>
+      <w:r>
+        <w:t xml:space="preserve">. Cuando el plazo se agota, el botón se apaga y dice </w:t>
+      </w:r>
+      <w:r>
+        <w:rPr>
+          <w:i/>
+        </w:rPr>
+        <w:t>Expirado</w:t>
+      </w:r>
+      <w:r>
+        <w:t>. &lt;!-- fuente: static/js/solicitudes/mis_solicitudes_list.js (actualizarContadoresCancelacion) --&gt;</w:t>
+      </w:r>
+    </w:p>
+    <w:p>
+      <w:r>
+        <w:t xml:space="preserve">Una solicitud aprobada </w:t>
+      </w:r>
+      <w:r>
+        <w:rPr>
+          <w:b/>
+        </w:rPr>
+        <w:t>no se cancela sola</w:t>
+      </w:r>
+      <w:r>
+        <w:t>: se le pide al compañero. Por eso, cuando ya pediste la cancelación, en lugar del botón aparece una de estas tres etiquetas.</w:t>
+      </w:r>
+    </w:p>
+    <w:tbl>
+      <w:tblPr>
+        <w:tblStyle w:val="LightGrid-Accent1"/>
+        <w:tblW w:type="auto" w:w="0"/>
+        <w:jc w:val="center"/>
+        <w:tblLayout w:type="autofit"/>
+        <w:tblLook w:firstColumn="1" w:firstRow="1" w:lastColumn="0" w:lastRow="0" w:noHBand="0" w:noVBand="1" w:val="04A0"/>
+      </w:tblPr>
+      <w:tblGrid>
+        <w:gridCol w:w="2880"/>
+        <w:gridCol w:w="2880"/>
+        <w:gridCol w:w="2880"/>
+      </w:tblGrid>
+      <w:tr>
+        <w:tc>
+          <w:tcPr>
+            <w:tcW w:type="dxa" w:w="2880"/>
+          </w:tcPr>
+          <w:p>
+            <w:r>
+              <w:rPr>
+                <w:b/>
+              </w:rPr>
+            </w:r>
+            <w:r>
+              <w:rPr>
+                <w:b/>
+              </w:rPr>
               <w:t>Etiqueta</w:t>
             </w:r>
           </w:p>
@@ -5654,6 +6646,40 @@
     <w:p>
       <w:r>
         <w:t>decide. Está explicado una sola vez, para los seis, en el apartado 6.3. &lt;!-- fuente: solicitudes/use_cases/cancelar_solicitud.py (_pedir_cancelacion) --&gt;</w:t>
+      </w:r>
+    </w:p>
+    <w:p>
+      <w:pPr>
+        <w:pStyle w:val="ListBullet"/>
+      </w:pPr>
+      <w:r>
+        <w:rPr>
+          <w:b/>
+        </w:rPr>
+        <w:t>El aviso de "Enviando solicitud..." nunca se queda para siempre.</w:t>
+      </w:r>
+      <w:r>
+        <w:t xml:space="preserve"> Si pasan</w:t>
+      </w:r>
+    </w:p>
+    <w:p>
+      <w:r>
+        <w:rPr>
+          <w:b/>
+        </w:rPr>
+        <w:t>45 segundos</w:t>
+      </w:r>
+      <w:r>
+        <w:t xml:space="preserve"> sin respuesta, la pantalla deja de esperar y te avisa. Ese aviso no quiere decir que el envío haya fallado: antes de reenviar hay que comprobar </w:t>
+      </w:r>
+      <w:r>
+        <w:rPr>
+          <w:b/>
+        </w:rPr>
+        <w:t>Mis Solicitudes</w:t>
+      </w:r>
+      <w:r>
+        <w:t>. Está explicado una sola vez, para los seis, en el apartado 7.1. &lt;!-- fuente: static/js/loading-ui.js:43 (LIMITE_ENVIO_MS = 45000), :50-52, :101-131 (fetchLimitado) --&gt;</w:t>
       </w:r>
     </w:p>
     <w:p>
@@ -6830,7 +7856,7 @@
         <w:t>Cambio de turno</w:t>
       </w:r>
       <w:r>
-        <w:t>. &lt;!-- fuente: templates/solicitudes/mis_solicitudes_list.html; static/js/mis_turnos.js:590-597 --&gt;</w:t>
+        <w:t>, con quién fue el cambio y cuándo se aprobó. Ver el apartado 3.2 &lt;!-- fuente: templates/solicitudes/mis_solicitudes_list.html; static/js/utils/detalle-dia-mensajes.js --&gt;</w:t>
       </w:r>
     </w:p>
     <w:p>
@@ -7787,6 +8813,29 @@
     <w:p>
       <w:r>
         <w:t>&lt;!-- fuente: solicitudes/services/validators/ct_validator.py; base_validator.py; strategies/cambio_turno_strategy.py --&gt;</w:t>
+      </w:r>
+    </w:p>
+    <w:p>
+      <w:r>
+        <w:t xml:space="preserve">Además, si pasan 45 segundos sin respuesta el envío deja de esperar y sale </w:t>
+      </w:r>
+      <w:r>
+        <w:rPr>
+          <w:i/>
+        </w:rPr>
+        <w:t>"La solicitud está tardando demasiado"</w:t>
+      </w:r>
+      <w:r>
+        <w:t xml:space="preserve">. No significa que haya fallado: comprueba </w:t>
+      </w:r>
+      <w:r>
+        <w:rPr>
+          <w:b/>
+        </w:rPr>
+        <w:t>Mis Solicitudes</w:t>
+      </w:r>
+      <w:r>
+        <w:t xml:space="preserve"> antes de reenviar. Ver el apartado 7.1. &lt;!-- fuente: static/js/loading-ui.js:43, :50-52, :133-152 --&gt;</w:t>
       </w:r>
     </w:p>
     <w:p>
@@ -9215,7 +10264,16 @@
         <w:t>Mis Turnos</w:t>
       </w:r>
       <w:r>
-        <w:t xml:space="preserve"> por los meses del rango: los días marcados mostrarán la jornada nueva.</w:t>
+        <w:t xml:space="preserve"> por los meses del rango: los días marcados mostrarán la jornada nueva. Al tocar cualquiera de ellos, el detalle dice </w:t>
+      </w:r>
+      <w:r>
+        <w:rPr>
+          <w:i/>
+        </w:rPr>
+        <w:t>Cambio de turno permanente</w:t>
+      </w:r>
+      <w:r>
+        <w:t>, con quién es y cuándo se aprobó; antes ese dato solo salía en el primer día del rango. Ver el apartado 3.2 &lt;!-- fuente: solicitudes/services/acuerdo_por_dia_service.py (todos los días del rango, no solo el primero) --&gt;</w:t>
       </w:r>
     </w:p>
     <w:p>
@@ -9977,6 +11035,29 @@
     <w:p>
       <w:r>
         <w:t>&lt;!-- fuente: solicitudes/services/validators/ct_permanente_validator.py; strategies/ct_permanente_strategy.py; views/api_disponibles_ct_preview.py:331 --&gt;</w:t>
+      </w:r>
+    </w:p>
+    <w:p>
+      <w:r>
+        <w:t xml:space="preserve">Además, si pasan 45 segundos sin respuesta el envío deja de esperar y sale </w:t>
+      </w:r>
+      <w:r>
+        <w:rPr>
+          <w:i/>
+        </w:rPr>
+        <w:t>"La solicitud está tardando demasiado"</w:t>
+      </w:r>
+      <w:r>
+        <w:t xml:space="preserve">. No significa que haya fallado: comprueba </w:t>
+      </w:r>
+      <w:r>
+        <w:rPr>
+          <w:b/>
+        </w:rPr>
+        <w:t>Mis Solicitudes</w:t>
+      </w:r>
+      <w:r>
+        <w:t xml:space="preserve"> antes de reenviar. Ver el apartado 7.1. &lt;!-- fuente: static/js/loading-ui.js:43, :50-52, :133-152 --&gt;</w:t>
       </w:r>
     </w:p>
     <w:p>
@@ -13265,7 +14346,25 @@
         <w:t>Cambio de día de descanso</w:t>
       </w:r>
       <w:r>
-        <w:t>. El día que pasa a ser descanso se marca con 😴, no con ☕: es un intercambio, no una doblada. &lt;!-- fuente: static/js/mis_turnos.js:455,675-682 --&gt;</w:t>
+        <w:t>. El día que pasa a ser descanso se marca con 😴, no con ☕: es un intercambio, no una doblada. El detalle nombra además al compañero —</w:t>
+      </w:r>
+      <w:r>
+        <w:rPr>
+          <w:i/>
+        </w:rPr>
+        <w:t>Intercambio con</w:t>
+      </w:r>
+      <w:r>
+        <w:t xml:space="preserve"> él en el día que trabajas, </w:t>
+      </w:r>
+      <w:r>
+        <w:rPr>
+          <w:i/>
+        </w:rPr>
+        <w:t>Descanso intercambiado con</w:t>
+      </w:r>
+      <w:r>
+        <w:t xml:space="preserve"> él en el que descansas— y la fecha de aprobación. Ver el apartado 3.2 &lt;!-- fuente: static/js/mis_turnos.js:455; static/js/utils/detalle-dia-mensajes.js (conQuien, mensajeDescanso) --&gt;</w:t>
       </w:r>
     </w:p>
     <w:p>
@@ -14512,6 +15611,29 @@
     <w:p>
       <w:r>
         <w:t>&lt;!-- fuente: solicitudes/services/strategies/cambio_descanso_strategy.py; solicitud_orchestrator.py:190-290 --&gt;</w:t>
+      </w:r>
+    </w:p>
+    <w:p>
+      <w:r>
+        <w:t xml:space="preserve">Además, si pasan 45 segundos sin respuesta el envío deja de esperar y sale </w:t>
+      </w:r>
+      <w:r>
+        <w:rPr>
+          <w:i/>
+        </w:rPr>
+        <w:t>"La solicitud está tardando demasiado"</w:t>
+      </w:r>
+      <w:r>
+        <w:t xml:space="preserve">. No significa que haya fallado: comprueba </w:t>
+      </w:r>
+      <w:r>
+        <w:rPr>
+          <w:b/>
+        </w:rPr>
+        <w:t>Mis Solicitudes</w:t>
+      </w:r>
+      <w:r>
+        <w:t xml:space="preserve"> antes de reenviar. Ver el apartado 7.1. &lt;!-- fuente: static/js/loading-ui.js:43, :50-52, :133-152 --&gt;</w:t>
       </w:r>
     </w:p>
     <w:p>
@@ -16759,7 +17881,7 @@
         <w:t>DÍA COMPLETO (AM + PM)</w:t>
       </w:r>
       <w:r>
-        <w:t xml:space="preserve"> en fin de semana. &lt;!-- fuente: static/js/mis_turnos.js:459,742 --&gt;</w:t>
+        <w:t xml:space="preserve"> en fin de semana. Al tocarlos, el día que cediste dice qué compañero está trabajando por ti, y el de pago, a quién estás cubriendo o a quién le devuelves el favor, con la fecha de aprobación. Ver el apartado 3.2 &lt;!-- fuente: static/js/mis_turnos.js:459; static/js/utils/detalle-dia-mensajes.js --&gt;</w:t>
       </w:r>
     </w:p>
     <w:p>
@@ -18153,6 +19275,29 @@
     <w:p>
       <w:r>
         <w:t>&lt;!-- fuente: solicitudes/services/validators/doblada_validator.py; base_validator.py; strategies/doblada_strategy.py --&gt;</w:t>
+      </w:r>
+    </w:p>
+    <w:p>
+      <w:r>
+        <w:t xml:space="preserve">Además, si pasan 45 segundos sin respuesta el envío deja de esperar y sale </w:t>
+      </w:r>
+      <w:r>
+        <w:rPr>
+          <w:i/>
+        </w:rPr>
+        <w:t>"La solicitud está tardando demasiado"</w:t>
+      </w:r>
+      <w:r>
+        <w:t xml:space="preserve">. No significa que haya fallado: comprueba </w:t>
+      </w:r>
+      <w:r>
+        <w:rPr>
+          <w:b/>
+        </w:rPr>
+        <w:t>Mis Solicitudes</w:t>
+      </w:r>
+      <w:r>
+        <w:t xml:space="preserve"> antes de reenviar. Ver el apartado 7.1. &lt;!-- fuente: static/js/loading-ui.js:43, :50-52, :133-152 --&gt;</w:t>
       </w:r>
     </w:p>
     <w:p>
@@ -19802,7 +20947,7 @@
         <w:t>DOBLADA (AM + PM)</w:t>
       </w:r>
       <w:r>
-        <w:t>.</w:t>
+        <w:t>. El detalle de cada uno nombra al compañero y la fecha de aprobación; en este trámite antes no se decía con quién era el acuerdo. Ver el apartado 3.2 &lt;!-- fuente: solicitudes/services/acuerdo_por_dia_service.py; solicitudes/services/descanso_solicitud_service.py (rama DOBLADA PERMANENTE) --&gt;</w:t>
       </w:r>
     </w:p>
     <w:p>
@@ -20914,6 +22059,29 @@
     <w:p>
       <w:r>
         <w:t>&lt;!-- fuente: solicitudes/services/strategies/doblada_permanente_strategy.py; solicitud_orchestrator.py --&gt;</w:t>
+      </w:r>
+    </w:p>
+    <w:p>
+      <w:r>
+        <w:t xml:space="preserve">Además, si pasan 45 segundos sin respuesta el envío deja de esperar y sale </w:t>
+      </w:r>
+      <w:r>
+        <w:rPr>
+          <w:i/>
+        </w:rPr>
+        <w:t>"La solicitud está tardando demasiado"</w:t>
+      </w:r>
+      <w:r>
+        <w:t xml:space="preserve">. No significa que haya fallado: comprueba </w:t>
+      </w:r>
+      <w:r>
+        <w:rPr>
+          <w:b/>
+        </w:rPr>
+        <w:t>Mis Solicitudes</w:t>
+      </w:r>
+      <w:r>
+        <w:t xml:space="preserve"> antes de reenviar. Ver el apartado 7.1. &lt;!-- fuente: static/js/loading-ui.js:43, :50-52, :133-152 --&gt;</w:t>
       </w:r>
     </w:p>
     <w:p>
@@ -22303,7 +23471,7 @@
         <w:t>DÍA COMPLETO (AM + PM)</w:t>
       </w:r>
       <w:r>
-        <w:t xml:space="preserve">. Además, este trámite se refleja en </w:t>
+        <w:t xml:space="preserve">; el detalle de cada uno nombra al compañero y la fecha de aprobación. Ver el apartado 3.2. Además, este trámite se refleja en </w:t>
       </w:r>
       <w:r>
         <w:rPr>
@@ -23143,6 +24311,29 @@
     </w:p>
     <w:p>
       <w:r>
+        <w:t xml:space="preserve">Además, si pasan 45 segundos sin respuesta el envío deja de esperar y sale </w:t>
+      </w:r>
+      <w:r>
+        <w:rPr>
+          <w:i/>
+        </w:rPr>
+        <w:t>"La solicitud está tardando demasiado"</w:t>
+      </w:r>
+      <w:r>
+        <w:t xml:space="preserve">. No significa que haya fallado: comprueba </w:t>
+      </w:r>
+      <w:r>
+        <w:rPr>
+          <w:b/>
+        </w:rPr>
+        <w:t>Mis Solicitudes</w:t>
+      </w:r>
+      <w:r>
+        <w:t xml:space="preserve"> antes de reenviar. Ver el apartado 7.1. &lt;!-- fuente: static/js/loading-ui.js:43, :50-52, :133-152 --&gt;</w:t>
+      </w:r>
+    </w:p>
+    <w:p>
+      <w:r>
         <w:rPr>
           <w:b/>
         </w:rPr>
@@ -23595,7 +24786,7 @@
               <w:rPr>
                 <w:sz w:val="20"/>
               </w:rPr>
-              <w:t>No trabajas porque cediste tu jornada en una doblada</w:t>
+              <w:t>No trabajas porque un compañero cubre tu jornada en una doblada. El detalle del día dice cuál es y con quién (apartado 3.2)</w:t>
             </w:r>
           </w:p>
         </w:tc>
@@ -27540,7 +28731,7 @@
         <w:pStyle w:val="Heading3"/>
       </w:pPr>
       <w:r>
-        <w:t>6.9 Cuando las horas te las deben a ti</w:t>
+        <w:t>6.10 Cuando las horas te las deben a ti</w:t>
       </w:r>
     </w:p>
     <w:p>
@@ -27715,6 +28906,225 @@
     <w:p>
       <w:r>
         <w:t>Los mensajes propios de cada formulario están en su ficha, punto 14. Aquí van los que pueden aparecer en cualquiera de los seis.</w:t>
+      </w:r>
+    </w:p>
+    <w:p>
+      <w:pPr>
+        <w:pStyle w:val="Heading4"/>
+      </w:pPr>
+      <w:r>
+        <w:t>Cuando el envío tarda demasiado: comprueba antes de reenviar</w:t>
+      </w:r>
+    </w:p>
+    <w:p>
+      <w:r>
+        <w:t xml:space="preserve">Al pulsar el botón de envío aparece </w:t>
+      </w:r>
+      <w:r>
+        <w:rPr>
+          <w:i/>
+        </w:rPr>
+        <w:t>"Enviando solicitud..."</w:t>
+      </w:r>
+      <w:r>
+        <w:t xml:space="preserve">. Si pasan </w:t>
+      </w:r>
+      <w:r>
+        <w:rPr>
+          <w:b/>
+        </w:rPr>
+        <w:t>45 segundos</w:t>
+      </w:r>
+      <w:r>
+        <w:t xml:space="preserve"> sin que llegue la respuesta, la pantalla deja de esperar y muestra un aviso de advertencia. Ocurre en los seis formularios. &lt;!-- fuente: static/js/loading-ui.js:43 (LIMITE_ENVIO_MS = 45000) y :101-131 (fetchLimitado); mostrar('Enviando solicitud...') en solicitar_cambio_turno.js:385, solicitar_ct_permanente.js:1687,1720, solicitar_doblada.js:2827,2884, solicitar_doblada_permanente.js:711, solicitar_d_fds.js:418, solicitar_cambio_descanso.js:1287; fetchLimitado en :387, :1689,:1722, :2829,:2886, :716, :422, :1294 --&gt;</w:t>
+      </w:r>
+    </w:p>
+    <w:p>
+      <w:r>
+        <w:t xml:space="preserve">El título es </w:t>
+      </w:r>
+      <w:r>
+        <w:rPr>
+          <w:i/>
+        </w:rPr>
+        <w:t>"La solicitud está tardando demasiado"</w:t>
+      </w:r>
+      <w:r>
+        <w:t xml:space="preserve"> y el texto, </w:t>
+      </w:r>
+      <w:r>
+        <w:rPr>
+          <w:i/>
+        </w:rPr>
+        <w:t>"Dejamos de esperar la respuesta del servidor. Es posible que la solicitud SÍ se haya enviado: revisa "Mis Solicitudes" antes de volver a intentarlo."</w:t>
+      </w:r>
+      <w:r>
+        <w:t xml:space="preserve"> &lt;!-- fuente: static/js/loading-ui.js:50-52 (TITULO_TIEMPO, TEXTO_TIEMPO) --&gt;</w:t>
+      </w:r>
+    </w:p>
+    <w:p>
+      <w:r>
+        <w:rPr>
+          <w:b/>
+        </w:rPr>
+        <w:t>Este aviso no dice que el envío haya fallado.</w:t>
+      </w:r>
+      <w:r>
+        <w:t xml:space="preserve"> Dice que se dejó de esperar la respuesta. La solicitud puede haberse creado igualmente: reenviar a ciegas puede dejarte el mismo acuerdo por duplicado. Haz esto, en este orden:</w:t>
+      </w:r>
+    </w:p>
+    <w:p>
+      <w:pPr>
+        <w:pStyle w:val="ListNumber"/>
+      </w:pPr>
+      <w:r>
+        <w:t>Cierra el aviso con su botón de confirmación.</w:t>
+      </w:r>
+    </w:p>
+    <w:p>
+      <w:pPr>
+        <w:pStyle w:val="ListNumber"/>
+      </w:pPr>
+      <w:r>
+        <w:t xml:space="preserve">Entra en </w:t>
+      </w:r>
+      <w:r>
+        <w:rPr>
+          <w:b/>
+        </w:rPr>
+        <w:t>Mis Solicitudes</w:t>
+      </w:r>
+      <w:r>
+        <w:t>.</w:t>
+      </w:r>
+    </w:p>
+    <w:p>
+      <w:pPr>
+        <w:pStyle w:val="ListNumber"/>
+      </w:pPr>
+      <w:r>
+        <w:t>Si la solicitud aparece, ya está enviada: no hagas nada más.</w:t>
+      </w:r>
+    </w:p>
+    <w:p>
+      <w:pPr>
+        <w:pStyle w:val="ListNumber"/>
+      </w:pPr>
+      <w:r>
+        <w:t>Si no aparece, vuelve al formulario y envíala de nuevo.</w:t>
+      </w:r>
+    </w:p>
+    <w:p>
+      <w:r>
+        <w:t>&lt;!-- fuente: static/js/loading-ui.js:45-52 y :133-152 (avisoDeFallo); tests_js/loading-ui.test.cjs ("el corte por tiempo trae titulo propio y manda a comprobar") --&gt;</w:t>
+      </w:r>
+    </w:p>
+    <w:p>
+      <w:r>
+        <w:t xml:space="preserve">Es el caso contrario al de </w:t>
+      </w:r>
+      <w:r>
+        <w:rPr>
+          <w:i/>
+        </w:rPr>
+        <w:t>"Ocurrió un error de red. Intenta de nuevo."</w:t>
+      </w:r>
+      <w:r>
+        <w:t xml:space="preserve">: ahí la solicitud no salió y reintentar es lo correcto. Por eso, en </w:t>
+      </w:r>
+      <w:r>
+        <w:rPr>
+          <w:b/>
+        </w:rPr>
+        <w:t>Cambio de Turno</w:t>
+      </w:r>
+      <w:r>
+        <w:t xml:space="preserve"> y en </w:t>
+      </w:r>
+      <w:r>
+        <w:rPr>
+          <w:b/>
+        </w:rPr>
+        <w:t>Cambio de Turno Permanente</w:t>
+      </w:r>
+      <w:r>
+        <w:t xml:space="preserve">, el aviso de tiempo se cierra con </w:t>
+      </w:r>
+      <w:r>
+        <w:rPr>
+          <w:b/>
+        </w:rPr>
+        <w:t>Entendido</w:t>
+      </w:r>
+      <w:r>
+        <w:t xml:space="preserve"> mientras que el de red te ofrece </w:t>
+      </w:r>
+      <w:r>
+        <w:rPr>
+          <w:b/>
+        </w:rPr>
+        <w:t>Reintentar</w:t>
+      </w:r>
+      <w:r>
+        <w:t xml:space="preserve">. En </w:t>
+      </w:r>
+      <w:r>
+        <w:rPr>
+          <w:b/>
+        </w:rPr>
+        <w:t>Doblada de Fin de Semana</w:t>
+      </w:r>
+      <w:r>
+        <w:t xml:space="preserve"> y en </w:t>
+      </w:r>
+      <w:r>
+        <w:rPr>
+          <w:b/>
+        </w:rPr>
+        <w:t>Doblada Permanente</w:t>
+      </w:r>
+      <w:r>
+        <w:t xml:space="preserve"> el botón es siempre </w:t>
+      </w:r>
+      <w:r>
+        <w:rPr>
+          <w:b/>
+        </w:rPr>
+        <w:t>Entendido</w:t>
+      </w:r>
+      <w:r>
+        <w:t>. &lt;!-- fuente: static/js/cambio-turno/solicitar_cambio_turno.js:462-470 y solicitar_ct_permanente.js:1760-1768 (confirmButtonText: 'Entendido' si el corte fue por tiempo, 'Reintentar' si no); solicitar_d_fds.js:47-51 y solicitar_doblada_permanente.js:42-46 (notificar fija 'Entendido') --&gt;</w:t>
+      </w:r>
+    </w:p>
+    <w:p>
+      <w:r>
+        <w:t xml:space="preserve">Este aviso concreto </w:t>
+      </w:r>
+      <w:r>
+        <w:rPr>
+          <w:b/>
+        </w:rPr>
+        <w:t>no</w:t>
+      </w:r>
+      <w:r>
+        <w:t xml:space="preserve"> trae </w:t>
+      </w:r>
+      <w:r>
+        <w:rPr>
+          <w:b/>
+        </w:rPr>
+        <w:t>Código de referencia</w:t>
+      </w:r>
+      <w:r>
+        <w:t>, y no hace falta: no hay ningún fallo que reportar, solo una respuesta que no llegó a tiempo. &lt;!-- fuente: static/js/cambio-turno/solicitar_ct_permanente.js:1739, solicitar_doblada.js:2904, solicitar_doblada_permanente.js:735, solicitar_d_fds.js:448, solicitar_cambio_descanso.js:1306 (CodigoReferencia.htmlMensaje solo se aplica cuando NO es corte por tiempo); solicitar_cambio_turno.js:464-467 (el aviso del .catch nunca lo lleva) --&gt;</w:t>
+      </w:r>
+    </w:p>
+    <w:p>
+      <w:pPr>
+        <w:pStyle w:val="Heading4"/>
+      </w:pPr>
+      <w:r>
+        <w:t>Los demás avisos comunes a los seis formularios</w:t>
       </w:r>
     </w:p>
     <w:tbl>
@@ -28822,25 +30232,38 @@
               <w:rPr>
                 <w:sz w:val="20"/>
               </w:rPr>
-              <w:t>"Ocurrió un error de red. Intenta de nuevo."</w:t>
-            </w:r>
-          </w:p>
-        </w:tc>
-        <w:tc>
-          <w:tcPr>
-            <w:tcW w:type="dxa" w:w="2880"/>
-          </w:tcPr>
-          <w:p>
-            <w:r>
-              <w:rPr>
-                <w:sz w:val="20"/>
-              </w:rPr>
-            </w:r>
-            <w:r>
-              <w:rPr>
-                <w:sz w:val="20"/>
-              </w:rPr>
-              <w:t>El envío no llegó a completarse</w:t>
+              <w:t>"La solicitud está tardando demasiado" — "Dejamos de esperar la respuesta del servidor. Es posible que la solicitud SÍ se haya enviado: revisa "Mis Solicitudes" antes de volver a intentarlo."</w:t>
+            </w:r>
+          </w:p>
+        </w:tc>
+        <w:tc>
+          <w:tcPr>
+            <w:tcW w:type="dxa" w:w="2880"/>
+          </w:tcPr>
+          <w:p>
+            <w:r>
+              <w:rPr>
+                <w:sz w:val="20"/>
+              </w:rPr>
+            </w:r>
+            <w:r>
+              <w:rPr>
+                <w:sz w:val="20"/>
+              </w:rPr>
+              <w:t xml:space="preserve">Pasaron 45 segundos sin respuesta y la pantalla dejó de esperar. </w:t>
+            </w:r>
+            <w:r>
+              <w:rPr>
+                <w:b/>
+                <w:sz w:val="20"/>
+              </w:rPr>
+              <w:t>No</w:t>
+            </w:r>
+            <w:r>
+              <w:rPr>
+                <w:sz w:val="20"/>
+              </w:rPr>
+              <w:t xml:space="preserve"> significa que el envío haya fallado</w:t>
             </w:r>
           </w:p>
         </w:tc>
@@ -28871,20 +30294,7 @@
               <w:rPr>
                 <w:sz w:val="20"/>
               </w:rPr>
-              <w:t xml:space="preserve"> antes de reenviar. Si el aviso incluye un </w:t>
-            </w:r>
-            <w:r>
-              <w:rPr>
-                <w:b/>
-                <w:sz w:val="20"/>
-              </w:rPr>
-              <w:t>Código de referencia</w:t>
-            </w:r>
-            <w:r>
-              <w:rPr>
-                <w:sz w:val="20"/>
-              </w:rPr>
-              <w:t>, apúntalo: ver el apartado 7.3 &lt;!-- fuente: static/js/cambio-turno/solicitar_d_fds.js:442; solicitar_doblada_permanente.js:705 --&gt;</w:t>
+              <w:t>; solo si no aparece nada, envíala de nuevo. Ver el bloque justo encima de esta tabla &lt;!-- fuente: static/js/loading-ui.js:50-52, :43, :147-152 --&gt;</w:t>
             </w:r>
           </w:p>
         </w:tc>
@@ -28904,57 +30314,69 @@
               <w:rPr>
                 <w:sz w:val="20"/>
               </w:rPr>
-              <w:t xml:space="preserve">"Intenta de nuevo." bajo el título </w:t>
-            </w:r>
-            <w:r>
-              <w:rPr>
-                <w:i/>
-                <w:sz w:val="20"/>
-              </w:rPr>
-              <w:t>Error de red</w:t>
-            </w:r>
-          </w:p>
-        </w:tc>
-        <w:tc>
-          <w:tcPr>
-            <w:tcW w:type="dxa" w:w="2880"/>
-          </w:tcPr>
-          <w:p>
-            <w:r>
-              <w:rPr>
-                <w:sz w:val="20"/>
-              </w:rPr>
-            </w:r>
-            <w:r>
-              <w:rPr>
-                <w:sz w:val="20"/>
-              </w:rPr>
-              <w:t xml:space="preserve">Lo mismo, en </w:t>
+              <w:t>"Ocurrió un error de red. Intenta de nuevo."</w:t>
+            </w:r>
+          </w:p>
+        </w:tc>
+        <w:tc>
+          <w:tcPr>
+            <w:tcW w:type="dxa" w:w="2880"/>
+          </w:tcPr>
+          <w:p>
+            <w:r>
+              <w:rPr>
+                <w:sz w:val="20"/>
+              </w:rPr>
+            </w:r>
+            <w:r>
+              <w:rPr>
+                <w:sz w:val="20"/>
+              </w:rPr>
+              <w:t>El envío no llegó a completarse</w:t>
+            </w:r>
+          </w:p>
+        </w:tc>
+        <w:tc>
+          <w:tcPr>
+            <w:tcW w:type="dxa" w:w="2880"/>
+          </w:tcPr>
+          <w:p>
+            <w:r>
+              <w:rPr>
+                <w:sz w:val="20"/>
+              </w:rPr>
+            </w:r>
+            <w:r>
+              <w:rPr>
+                <w:sz w:val="20"/>
+              </w:rPr>
+              <w:t xml:space="preserve">Comprueba </w:t>
             </w:r>
             <w:r>
               <w:rPr>
                 <w:b/>
                 <w:sz w:val="20"/>
               </w:rPr>
-              <w:t>Cambio de Día de Descanso</w:t>
-            </w:r>
-          </w:p>
-        </w:tc>
-        <w:tc>
-          <w:tcPr>
-            <w:tcW w:type="dxa" w:w="2880"/>
-          </w:tcPr>
-          <w:p>
-            <w:r>
-              <w:rPr>
-                <w:sz w:val="20"/>
-              </w:rPr>
-            </w:r>
-            <w:r>
-              <w:rPr>
-                <w:sz w:val="20"/>
-              </w:rPr>
-              <w:t>Igual que el anterior &lt;!-- fuente: static/js/cambio-turno/solicitar_cambio_descanso.js:1328,1362,1382 --&gt;</w:t>
+              <w:t>Mis Solicitudes</w:t>
+            </w:r>
+            <w:r>
+              <w:rPr>
+                <w:sz w:val="20"/>
+              </w:rPr>
+              <w:t xml:space="preserve"> antes de reenviar. Si el aviso incluye un </w:t>
+            </w:r>
+            <w:r>
+              <w:rPr>
+                <w:b/>
+                <w:sz w:val="20"/>
+              </w:rPr>
+              <w:t>Código de referencia</w:t>
+            </w:r>
+            <w:r>
+              <w:rPr>
+                <w:sz w:val="20"/>
+              </w:rPr>
+              <w:t>, apúntalo: ver el apartado 7.3 &lt;!-- fuente: static/js/cambio-turno/solicitar_d_fds.js:445; solicitar_doblada_permanente.js:732 --&gt;</w:t>
             </w:r>
           </w:p>
         </w:tc>
@@ -28974,7 +30396,14 @@
               <w:rPr>
                 <w:sz w:val="20"/>
               </w:rPr>
-              <w:t>"Ocurrió un error de red."</w:t>
+              <w:t xml:space="preserve">"Intenta de nuevo." bajo el título </w:t>
+            </w:r>
+            <w:r>
+              <w:rPr>
+                <w:i/>
+                <w:sz w:val="20"/>
+              </w:rPr>
+              <w:t>Error de red</w:t>
             </w:r>
           </w:p>
         </w:tc>
@@ -28999,38 +30428,25 @@
                 <w:b/>
                 <w:sz w:val="20"/>
               </w:rPr>
-              <w:t>Cambio de Turno Permanente</w:t>
-            </w:r>
-            <w:r>
-              <w:rPr>
-                <w:sz w:val="20"/>
-              </w:rPr>
-              <w:t xml:space="preserve"> y en </w:t>
-            </w:r>
-            <w:r>
-              <w:rPr>
-                <w:b/>
-                <w:sz w:val="20"/>
-              </w:rPr>
-              <w:t>Doblada</w:t>
-            </w:r>
-          </w:p>
-        </w:tc>
-        <w:tc>
-          <w:tcPr>
-            <w:tcW w:type="dxa" w:w="2880"/>
-          </w:tcPr>
-          <w:p>
-            <w:r>
-              <w:rPr>
-                <w:sz w:val="20"/>
-              </w:rPr>
-            </w:r>
-            <w:r>
-              <w:rPr>
-                <w:sz w:val="20"/>
-              </w:rPr>
-              <w:t>Igual que el anterior &lt;!-- fuente: static/js/cambio-turno/solicitar_ct_permanente.js:1748; solicitar_doblada.js:2862 --&gt;</w:t>
+              <w:t>Cambio de Día de Descanso</w:t>
+            </w:r>
+          </w:p>
+        </w:tc>
+        <w:tc>
+          <w:tcPr>
+            <w:tcW w:type="dxa" w:w="2880"/>
+          </w:tcPr>
+          <w:p>
+            <w:r>
+              <w:rPr>
+                <w:sz w:val="20"/>
+              </w:rPr>
+            </w:r>
+            <w:r>
+              <w:rPr>
+                <w:sz w:val="20"/>
+              </w:rPr>
+              <w:t>Igual que el anterior &lt;!-- fuente: static/js/cambio-turno/solicitar_cambio_descanso.js:1302 (avisarFallo), usada desde :1340, :1374 y :1394 --&gt;</w:t>
             </w:r>
           </w:p>
         </w:tc>
@@ -29050,6 +30466,82 @@
               <w:rPr>
                 <w:sz w:val="20"/>
               </w:rPr>
+              <w:t>"Ocurrió un error de red."</w:t>
+            </w:r>
+          </w:p>
+        </w:tc>
+        <w:tc>
+          <w:tcPr>
+            <w:tcW w:type="dxa" w:w="2880"/>
+          </w:tcPr>
+          <w:p>
+            <w:r>
+              <w:rPr>
+                <w:sz w:val="20"/>
+              </w:rPr>
+            </w:r>
+            <w:r>
+              <w:rPr>
+                <w:sz w:val="20"/>
+              </w:rPr>
+              <w:t xml:space="preserve">Lo mismo, en </w:t>
+            </w:r>
+            <w:r>
+              <w:rPr>
+                <w:b/>
+                <w:sz w:val="20"/>
+              </w:rPr>
+              <w:t>Cambio de Turno Permanente</w:t>
+            </w:r>
+            <w:r>
+              <w:rPr>
+                <w:sz w:val="20"/>
+              </w:rPr>
+              <w:t xml:space="preserve"> y en </w:t>
+            </w:r>
+            <w:r>
+              <w:rPr>
+                <w:b/>
+                <w:sz w:val="20"/>
+              </w:rPr>
+              <w:t>Doblada</w:t>
+            </w:r>
+          </w:p>
+        </w:tc>
+        <w:tc>
+          <w:tcPr>
+            <w:tcW w:type="dxa" w:w="2880"/>
+          </w:tcPr>
+          <w:p>
+            <w:r>
+              <w:rPr>
+                <w:sz w:val="20"/>
+              </w:rPr>
+            </w:r>
+            <w:r>
+              <w:rPr>
+                <w:sz w:val="20"/>
+              </w:rPr>
+              <w:t>Igual que el anterior &lt;!-- fuente: static/js/cambio-turno/solicitar_ct_permanente.js:1735; solicitar_doblada.js:2900 --&gt;</w:t>
+            </w:r>
+          </w:p>
+        </w:tc>
+      </w:tr>
+      <w:tr>
+        <w:tc>
+          <w:tcPr>
+            <w:tcW w:type="dxa" w:w="2880"/>
+          </w:tcPr>
+          <w:p>
+            <w:r>
+              <w:rPr>
+                <w:sz w:val="20"/>
+              </w:rPr>
+            </w:r>
+            <w:r>
+              <w:rPr>
+                <w:sz w:val="20"/>
+              </w:rPr>
               <w:t>"Ocurrió un error al procesar la solicitud"</w:t>
             </w:r>
           </w:p>
@@ -29113,6 +30605,108 @@
                 <w:sz w:val="20"/>
               </w:rPr>
               <w:t xml:space="preserve"> antes de reenviar &lt;!-- fuente: static/js/cambio-turno/solicitar_cambio_turno.js:421 --&gt;</w:t>
+            </w:r>
+          </w:p>
+        </w:tc>
+      </w:tr>
+      <w:tr>
+        <w:tc>
+          <w:tcPr>
+            <w:tcW w:type="dxa" w:w="2880"/>
+          </w:tcPr>
+          <w:p>
+            <w:r>
+              <w:rPr>
+                <w:sz w:val="20"/>
+              </w:rPr>
+            </w:r>
+            <w:r>
+              <w:rPr>
+                <w:sz w:val="20"/>
+              </w:rPr>
+              <w:t xml:space="preserve">"No se pudo enviar la solicitud. Inténtalo de nuevo." bajo el título </w:t>
+            </w:r>
+            <w:r>
+              <w:rPr>
+                <w:i/>
+                <w:sz w:val="20"/>
+              </w:rPr>
+              <w:t>Error de conexión</w:t>
+            </w:r>
+          </w:p>
+        </w:tc>
+        <w:tc>
+          <w:tcPr>
+            <w:tcW w:type="dxa" w:w="2880"/>
+          </w:tcPr>
+          <w:p>
+            <w:r>
+              <w:rPr>
+                <w:sz w:val="20"/>
+              </w:rPr>
+            </w:r>
+            <w:r>
+              <w:rPr>
+                <w:sz w:val="20"/>
+              </w:rPr>
+              <w:t xml:space="preserve">El envío de </w:t>
+            </w:r>
+            <w:r>
+              <w:rPr>
+                <w:b/>
+                <w:sz w:val="20"/>
+              </w:rPr>
+              <w:t>Cambio de Turno</w:t>
+            </w:r>
+            <w:r>
+              <w:rPr>
+                <w:sz w:val="20"/>
+              </w:rPr>
+              <w:t xml:space="preserve"> o de </w:t>
+            </w:r>
+            <w:r>
+              <w:rPr>
+                <w:b/>
+                <w:sz w:val="20"/>
+              </w:rPr>
+              <w:t>Cambio de Turno Permanente</w:t>
+            </w:r>
+            <w:r>
+              <w:rPr>
+                <w:sz w:val="20"/>
+              </w:rPr>
+              <w:t xml:space="preserve"> no llegó a salir</w:t>
+            </w:r>
+          </w:p>
+        </w:tc>
+        <w:tc>
+          <w:tcPr>
+            <w:tcW w:type="dxa" w:w="2880"/>
+          </w:tcPr>
+          <w:p>
+            <w:r>
+              <w:rPr>
+                <w:sz w:val="20"/>
+              </w:rPr>
+            </w:r>
+            <w:r>
+              <w:rPr>
+                <w:sz w:val="20"/>
+              </w:rPr>
+              <w:t xml:space="preserve">Pulsa </w:t>
+            </w:r>
+            <w:r>
+              <w:rPr>
+                <w:b/>
+                <w:sz w:val="20"/>
+              </w:rPr>
+              <w:t>Reintentar</w:t>
+            </w:r>
+            <w:r>
+              <w:rPr>
+                <w:sz w:val="20"/>
+              </w:rPr>
+              <w:t xml:space="preserve"> &lt;!-- fuente: static/js/cambio-turno/solicitar_cambio_turno.js:463; solicitar_ct_permanente.js:1761 --&gt;</w:t>
             </w:r>
           </w:p>
         </w:tc>
@@ -32192,7 +33786,7 @@
     </w:p>
     <w:p>
       <w:r>
-        <w:t>Es el mismo tipo de código que el de las pantallas completas: 12 caracteres, distinto en cada caso. Vale para los seis formularios de solicitud de cambio de turno. &lt;!-- fuente: static/js/utils/codigo-referencia.js:73 (filtro [A-Za-z0-9]); core/errors.py:68; static/js/cambio-turno/solicitar_cambio_turno.js:421, solicitar_ct_permanente.js:1748, solicitar_doblada.js:2862, solicitar_doblada_permanente.js:705, solicitar_d_fds.js:442, solicitar_cambio_descanso.js:1328,1362,1382 --&gt;</w:t>
+        <w:t>Es el mismo tipo de código que el de las pantallas completas: 12 caracteres, distinto en cada caso. Vale para los seis formularios de solicitud de cambio de turno. &lt;!-- fuente: static/js/utils/codigo-referencia.js:73 (filtro [A-Za-z0-9]); core/errors.py:68; static/js/cambio-turno/solicitar_cambio_turno.js:421, solicitar_ct_permanente.js:1739, solicitar_doblada.js:2904, solicitar_doblada_permanente.js:735, solicitar_d_fds.js:448, solicitar_cambio_descanso.js:1306 --&gt;</w:t>
       </w:r>
     </w:p>
     <w:p>
@@ -32204,6 +33798,20 @@
       </w:r>
       <w:r>
         <w:t xml:space="preserve"> El código solo existe si el servidor llegó a responder. Si se te cayó la conexión del todo y la petición nunca llegó, el aviso sale igual que antes, sin recuadro: no hay nada registrado que el equipo pueda buscar. En ese caso, reporta simplemente qué estabas haciendo y a qué hora. &lt;!-- fuente: static/js/utils/codigo-referencia.js:71-72 (sin código se devuelve el aviso tal cual) y :103-106 (un fallo de red no deja cabecera que leer) --&gt;</w:t>
+      </w:r>
+    </w:p>
+    <w:p>
+      <w:r>
+        <w:t xml:space="preserve">Tampoco lo lleva el aviso </w:t>
+      </w:r>
+      <w:r>
+        <w:rPr>
+          <w:i/>
+        </w:rPr>
+        <w:t>"La solicitud está tardando demasiado"</w:t>
+      </w:r>
+      <w:r>
+        <w:t>, y ahí es a propósito: no hay ningún fallo registrado, solo una respuesta que no llegó a tiempo. Lo que toca hacer con ese aviso está en el apartado 7.1. &lt;!-- fuente: static/js/cambio-turno/solicitar_d_fds.js:448 y las otras cinco pantallas de envío: CodigoReferencia solo se aplica cuando el fallo NO es un corte por tiempo --&gt;</w:t>
       </w:r>
     </w:p>
     <w:p>
@@ -32770,6 +34378,26 @@
       </w:r>
       <w:r>
         <w:t xml:space="preserve"> y pégalo en tu reporte. Es lo único que el equipo necesita para encontrar tu caso; el detalle técnico les llega solo. &lt;!-- fuente: templates/errors/_base_error.html (bloque meta); core/errors.py:18-29 --&gt;</w:t>
+      </w:r>
+    </w:p>
+    <w:p>
+      <w:r>
+        <w:rPr>
+          <w:b/>
+        </w:rPr>
+        <w:t>Salió "La solicitud está tardando demasiado". ¿La envío otra vez?</w:t>
+      </w:r>
+      <w:r>
+        <w:t xml:space="preserve"> Todavía no. Ese aviso significa que la pantalla dejó de esperar la respuesta, no que el envío haya fallado: la solicitud puede haberse creado igualmente. Entra primero en </w:t>
+      </w:r>
+      <w:r>
+        <w:rPr>
+          <w:b/>
+        </w:rPr>
+        <w:t>Mis Solicitudes</w:t>
+      </w:r>
+      <w:r>
+        <w:t>. Si está ahí, ya no hay nada que hacer; si no está, vuelve al formulario y envíala. Reenviar sin comprobar puede dejar el mismo acuerdo por duplicado. Ver el apartado 7.1. &lt;!-- fuente: static/js/loading-ui.js:45-52 y :133-152 (avisoDeFallo) --&gt;</w:t>
       </w:r>
     </w:p>
     <w:p>
@@ -33326,7 +34954,7 @@
                 <w:b/>
                 <w:sz w:val="20"/>
               </w:rPr>
-              <w:t>Nuevo: horas a favor del explorador</w:t>
+              <w:t>El detalle del día dice ahora con quién es el acuerdo</w:t>
             </w:r>
           </w:p>
         </w:tc>
@@ -33344,7 +34972,20 @@
               <w:rPr>
                 <w:sz w:val="20"/>
               </w:rPr>
-              <w:t>Si tu supervisor o la corporación te deben horas —te pidieron entrar antes de tu turno, por ejemplo—, ahora quedan registradas y se descuentan de lo que tú debas. Lo que sobre no se pierde: sigue a tu favor para la próxima. Ver § 6.9</w:t>
+              <w:t xml:space="preserve">En </w:t>
+            </w:r>
+            <w:r>
+              <w:rPr>
+                <w:b/>
+                <w:sz w:val="20"/>
+              </w:rPr>
+              <w:t>Mis Turnos</w:t>
+            </w:r>
+            <w:r>
+              <w:rPr>
+                <w:sz w:val="20"/>
+              </w:rPr>
+              <w:t>, cualquier día que cambió por una solicitud aprobada nombra el trámite, al compañero con nombre y apellido, el papel de cada uno y la fecha de aprobación. Antes faltaba el compañero en la doblada permanente, en el cambio de turno permanente salvo el primer día del rango, y en parte de los cambios de día de descanso. Ver el apartado 3.2 &lt;!-- fuente: solicitudes/services/acuerdo_por_dia_service.py; static/js/utils/detalle-dia-mensajes.js --&gt;</w:t>
             </w:r>
           </w:p>
         </w:tc>
@@ -33365,7 +35006,7 @@
                 <w:b/>
                 <w:sz w:val="20"/>
               </w:rPr>
-              <w:t>Cancelar un cambio aprobado ya no es cosa tuya sola: se le pide al compañero</w:t>
+              <w:t>Los días de descanso dicen de qué trámite vienen</w:t>
             </w:r>
           </w:p>
         </w:tc>
@@ -33383,20 +35024,33 @@
               <w:rPr>
                 <w:sz w:val="20"/>
               </w:rPr>
-              <w:t xml:space="preserve">Antes cancelabas de inmediato y él se enteraba después. Ahora pulsas </w:t>
-            </w:r>
-            <w:r>
-              <w:rPr>
-                <w:b/>
-                <w:sz w:val="20"/>
-              </w:rPr>
-              <w:t>Pedir cancelación</w:t>
-            </w:r>
-            <w:r>
-              <w:rPr>
-                <w:sz w:val="20"/>
-              </w:rPr>
-              <w:t xml:space="preserve"> y él aprueba o rechaza. Aplica a los seis formularios. Ver el apartado 6.3 &lt;!-- fuente: solicitudes/use_cases/cancelar_solicitud.py (_pedir_cancelacion, responder_cancelacion) --&gt;</w:t>
+              <w:t>Un día libre o un descanso que sale de una solicitud aprobada muestra el nombre del acuerdo —</w:t>
+            </w:r>
+            <w:r>
+              <w:rPr>
+                <w:i/>
+                <w:sz w:val="20"/>
+              </w:rPr>
+              <w:t>Doblada permanente</w:t>
+            </w:r>
+            <w:r>
+              <w:rPr>
+                <w:sz w:val="20"/>
+              </w:rPr>
+              <w:t xml:space="preserve">, por ejemplo, en lugar del genérico </w:t>
+            </w:r>
+            <w:r>
+              <w:rPr>
+                <w:i/>
+                <w:sz w:val="20"/>
+              </w:rPr>
+              <w:t>Día libre</w:t>
+            </w:r>
+            <w:r>
+              <w:rPr>
+                <w:sz w:val="20"/>
+              </w:rPr>
+              <w:t>— y cuándo se aprobó. Un descanso de tu programación (mantenimiento, temporada o fin de semana) sigue sin compañero ni fecha, porque no lo pactó nadie contigo &lt;!-- fuente: solicitudes/services/descanso_solicitud_service.py; static/js/utils/detalle-dia-mensajes.js (mensajeDescanso) --&gt;</w:t>
             </w:r>
           </w:p>
         </w:tc>
@@ -33417,7 +35071,7 @@
                 <w:b/>
                 <w:sz w:val="20"/>
               </w:rPr>
-              <w:t>Mientras nadie responde, el cambio sigue vigente</w:t>
+              <w:t>El pago reprogramado nombra la doblada que quedó pendiente</w:t>
             </w:r>
           </w:p>
         </w:tc>
@@ -33435,7 +35089,7 @@
               <w:rPr>
                 <w:sz w:val="20"/>
               </w:rPr>
-              <w:t>Pedir la cancelación no mueve ningún turno. Solo la aprobación del compañero los devuelve a como estaban &lt;!-- fuente: solicitudes/use_cases/cancelar_solicitud.py (_pedir_cancelacion) --&gt;</w:t>
+              <w:t>El día que tu supervisor programa para pagar una doblada que no cumpliste dice ahora con qué compañero era esa doblada, además de indicar que lo programó el supervisor &lt;!-- fuente: solicitudes/services/acuerdo_por_dia_service.py (_agregar_pagos_reprogramados) --&gt;</w:t>
             </w:r>
           </w:p>
         </w:tc>
@@ -33456,7 +35110,7 @@
                 <w:b/>
                 <w:sz w:val="20"/>
               </w:rPr>
-              <w:t>El plazo pasó de 30 minutos a 24 horas</w:t>
+              <w:t>Nuevo: horas a favor del explorador</w:t>
             </w:r>
           </w:p>
         </w:tc>
@@ -33474,7 +35128,7 @@
               <w:rPr>
                 <w:sz w:val="20"/>
               </w:rPr>
-              <w:t>Tienes 24 horas desde la aprobación para pedir la cancelación, y tu compañero otras 24 para responderte &lt;!-- fuente: core/constants.py (VENTANA_PEDIR_CANCELACION_HORAS, VENTANA_RESPONDER_CANCELACION_HORAS) --&gt;</w:t>
+              <w:t>Si tu supervisor o la corporación te deben horas —te pidieron entrar antes de tu turno, por ejemplo—, ahora quedan registradas y se descuentan de lo que tú debas. Lo que sobre no se pierde: sigue a tu favor para la próxima. Ver § 6.10</w:t>
             </w:r>
           </w:p>
         </w:tc>
@@ -33495,7 +35149,7 @@
                 <w:b/>
                 <w:sz w:val="20"/>
               </w:rPr>
-              <w:t>Un rechazo, o el silencio, dejan el cambio firme</w:t>
+              <w:t>Cancelar un cambio aprobado ya no es cosa tuya sola: se le pide al compañero</w:t>
             </w:r>
           </w:p>
         </w:tc>
@@ -33513,7 +35167,20 @@
               <w:rPr>
                 <w:sz w:val="20"/>
               </w:rPr>
-              <w:t>No se puede volver a pedir la cancelación: o solicitas un cambio nuevo, o se lo pides a tu supervisor &lt;!-- fuente: solicitudes/use_cases/cancelar_solicitud.py (_mensaje_cancelacion_cerrada) --&gt;</w:t>
+              <w:t xml:space="preserve">Antes cancelabas de inmediato y él se enteraba después. Ahora pulsas </w:t>
+            </w:r>
+            <w:r>
+              <w:rPr>
+                <w:b/>
+                <w:sz w:val="20"/>
+              </w:rPr>
+              <w:t>Pedir cancelación</w:t>
+            </w:r>
+            <w:r>
+              <w:rPr>
+                <w:sz w:val="20"/>
+              </w:rPr>
+              <w:t xml:space="preserve"> y él aprueba o rechaza. Aplica a los seis formularios. Ver el apartado 6.3 &lt;!-- fuente: solicitudes/use_cases/cancelar_solicitud.py (_pedir_cancelacion, responder_cancelacion) --&gt;</w:t>
             </w:r>
           </w:p>
         </w:tc>
@@ -33534,7 +35201,7 @@
                 <w:b/>
                 <w:sz w:val="20"/>
               </w:rPr>
-              <w:t>Tarjeta nueva en Solicitudes Pendientes: "Cancelaciones que esperan tu respuesta"</w:t>
+              <w:t>Mientras nadie responde, el cambio sigue vigente</w:t>
             </w:r>
           </w:p>
         </w:tc>
@@ -33552,33 +35219,7 @@
               <w:rPr>
                 <w:sz w:val="20"/>
               </w:rPr>
-              <w:t xml:space="preserve">Si eres el compañero, ahí ves quién pide qué, con qué motivo y desde cuándo, con los botones </w:t>
-            </w:r>
-            <w:r>
-              <w:rPr>
-                <w:b/>
-                <w:sz w:val="20"/>
-              </w:rPr>
-              <w:t>Aprobar cancelación</w:t>
-            </w:r>
-            <w:r>
-              <w:rPr>
-                <w:sz w:val="20"/>
-              </w:rPr>
-              <w:t xml:space="preserve"> y </w:t>
-            </w:r>
-            <w:r>
-              <w:rPr>
-                <w:b/>
-                <w:sz w:val="20"/>
-              </w:rPr>
-              <w:t>Rechazar</w:t>
-            </w:r>
-            <w:r>
-              <w:rPr>
-                <w:sz w:val="20"/>
-              </w:rPr>
-              <w:t xml:space="preserve"> &lt;!-- fuente: templates/solicitudes/solicitudes_pendientes_list.html --&gt;</w:t>
+              <w:t>Pedir la cancelación no mueve ningún turno. Solo la aprobación del compañero los devuelve a como estaban &lt;!-- fuente: solicitudes/use_cases/cancelar_solicitud.py (_pedir_cancelacion) --&gt;</w:t>
             </w:r>
           </w:p>
         </w:tc>
@@ -33599,7 +35240,7 @@
                 <w:b/>
                 <w:sz w:val="20"/>
               </w:rPr>
-              <w:t>En Mis Solicitudes hay tres etiquetas nuevas</w:t>
+              <w:t>El plazo pasó de 30 minutos a 24 horas</w:t>
             </w:r>
           </w:p>
         </w:tc>
@@ -33615,42 +35256,9 @@
             </w:r>
             <w:r>
               <w:rPr>
-                <w:b/>
-                <w:sz w:val="20"/>
-              </w:rPr>
-              <w:t>Cancelación pendiente</w:t>
-            </w:r>
-            <w:r>
-              <w:rPr>
-                <w:sz w:val="20"/>
-              </w:rPr>
-              <w:t xml:space="preserve">, </w:t>
-            </w:r>
-            <w:r>
-              <w:rPr>
-                <w:b/>
-                <w:sz w:val="20"/>
-              </w:rPr>
-              <w:t>Cancelación rechazada</w:t>
-            </w:r>
-            <w:r>
-              <w:rPr>
-                <w:sz w:val="20"/>
-              </w:rPr>
-              <w:t xml:space="preserve"> y </w:t>
-            </w:r>
-            <w:r>
-              <w:rPr>
-                <w:b/>
-                <w:sz w:val="20"/>
-              </w:rPr>
-              <w:t>Cancelación caducada</w:t>
-            </w:r>
-            <w:r>
-              <w:rPr>
-                <w:sz w:val="20"/>
-              </w:rPr>
-              <w:t xml:space="preserve"> te dicen en qué punto está tu petición &lt;!-- fuente: templates/solicitudes/mis_solicitudes_list.html --&gt;</w:t>
+                <w:sz w:val="20"/>
+              </w:rPr>
+              <w:t>Tienes 24 horas desde la aprobación para pedir la cancelación, y tu compañero otras 24 para responderte &lt;!-- fuente: core/constants.py (VENTANA_PEDIR_CANCELACION_HORAS, VENTANA_RESPONDER_CANCELACION_HORAS) --&gt;</w:t>
             </w:r>
           </w:p>
         </w:tc>
@@ -33671,7 +35279,7 @@
                 <w:b/>
                 <w:sz w:val="20"/>
               </w:rPr>
-              <w:t>El permiso de media jornada de temporada sigue la misma regla</w:t>
+              <w:t>Un rechazo, o el silencio, dejan el cambio firme</w:t>
             </w:r>
           </w:p>
         </w:tc>
@@ -33689,7 +35297,7 @@
               <w:rPr>
                 <w:sz w:val="20"/>
               </w:rPr>
-              <w:t>Aprobado el permiso, ya no lo cancelas tú: lo pides y lo decide tu supervisor, con los mismos plazos &lt;!-- fuente: permisos/views.py (PermisoMediaJornadaCancelView) --&gt;</w:t>
+              <w:t>No se puede volver a pedir la cancelación: o solicitas un cambio nuevo, o se lo pides a tu supervisor &lt;!-- fuente: solicitudes/use_cases/cancelar_solicitud.py (_mensaje_cancelacion_cerrada) --&gt;</w:t>
             </w:r>
           </w:p>
         </w:tc>
@@ -33710,7 +35318,7 @@
                 <w:b/>
                 <w:sz w:val="20"/>
               </w:rPr>
-              <w:t>Las 24 horas del permiso cuentan desde su aprobación</w:t>
+              <w:t>Tarjeta nueva en Solicitudes Pendientes: "Cancelaciones que esperan tu respuesta"</w:t>
             </w:r>
           </w:p>
         </w:tc>
@@ -33728,7 +35336,33 @@
               <w:rPr>
                 <w:sz w:val="20"/>
               </w:rPr>
-              <w:t>Antes el plazo se movía con cualquier edición posterior del permiso, así que podía alargarse solo. Ahora arranca en el momento en que tu supervisor lo aprueba, tanto desde su pantalla como desde el enlace del correo &lt;!-- fuente: permisos/models.py (fecha_aprobacion); permisos/views.py --&gt;</w:t>
+              <w:t xml:space="preserve">Si eres el compañero, ahí ves quién pide qué, con qué motivo y desde cuándo, con los botones </w:t>
+            </w:r>
+            <w:r>
+              <w:rPr>
+                <w:b/>
+                <w:sz w:val="20"/>
+              </w:rPr>
+              <w:t>Aprobar cancelación</w:t>
+            </w:r>
+            <w:r>
+              <w:rPr>
+                <w:sz w:val="20"/>
+              </w:rPr>
+              <w:t xml:space="preserve"> y </w:t>
+            </w:r>
+            <w:r>
+              <w:rPr>
+                <w:b/>
+                <w:sz w:val="20"/>
+              </w:rPr>
+              <w:t>Rechazar</w:t>
+            </w:r>
+            <w:r>
+              <w:rPr>
+                <w:sz w:val="20"/>
+              </w:rPr>
+              <w:t xml:space="preserve"> &lt;!-- fuente: templates/solicitudes/solicitudes_pendientes_list.html --&gt;</w:t>
             </w:r>
           </w:p>
         </w:tc>
@@ -33749,7 +35383,7 @@
                 <w:b/>
                 <w:sz w:val="20"/>
               </w:rPr>
-              <w:t>Sobre tu propio permiso siempre se pide la cancelación</w:t>
+              <w:t>En Mis Solicitudes hay tres etiquetas nuevas</w:t>
             </w:r>
           </w:p>
         </w:tc>
@@ -33765,9 +35399,42 @@
             </w:r>
             <w:r>
               <w:rPr>
-                <w:sz w:val="20"/>
-              </w:rPr>
-              <w:t>Antes, si eras explorador y además supervisor, cancelabas tu permiso de un clic. Ahora la decide otra persona, y no puedes responder tu propia petición &lt;!-- fuente: permisos/views.py (PermisoMediaJornadaCancelView.post, _puede_responder_cancelacion) --&gt;</w:t>
+                <w:b/>
+                <w:sz w:val="20"/>
+              </w:rPr>
+              <w:t>Cancelación pendiente</w:t>
+            </w:r>
+            <w:r>
+              <w:rPr>
+                <w:sz w:val="20"/>
+              </w:rPr>
+              <w:t xml:space="preserve">, </w:t>
+            </w:r>
+            <w:r>
+              <w:rPr>
+                <w:b/>
+                <w:sz w:val="20"/>
+              </w:rPr>
+              <w:t>Cancelación rechazada</w:t>
+            </w:r>
+            <w:r>
+              <w:rPr>
+                <w:sz w:val="20"/>
+              </w:rPr>
+              <w:t xml:space="preserve"> y </w:t>
+            </w:r>
+            <w:r>
+              <w:rPr>
+                <w:b/>
+                <w:sz w:val="20"/>
+              </w:rPr>
+              <w:t>Cancelación caducada</w:t>
+            </w:r>
+            <w:r>
+              <w:rPr>
+                <w:sz w:val="20"/>
+              </w:rPr>
+              <w:t xml:space="preserve"> te dicen en qué punto está tu petición &lt;!-- fuente: templates/solicitudes/mis_solicitudes_list.html --&gt;</w:t>
             </w:r>
           </w:p>
         </w:tc>
@@ -33788,7 +35455,7 @@
                 <w:b/>
                 <w:sz w:val="20"/>
               </w:rPr>
-              <w:t>La cancelación de un permiso la responde su supervisor</w:t>
+              <w:t>El permiso de media jornada de temporada sigue la misma regla</w:t>
             </w:r>
           </w:p>
         </w:tc>
@@ -33806,7 +35473,7 @@
               <w:rPr>
                 <w:sz w:val="20"/>
               </w:rPr>
-              <w:t>Antes bastaba con tener rol de supervisor para decidir sobre el permiso de cualquiera. Ahora responde el supervisor que aprobó ese permiso; los botones de aprobar y rechazar solo salen sobre permisos ajenos &lt;!-- fuente: permisos/views.py (_supervisor_del_permiso, _puede_responder_cancelacion); templates/permisos/permisos_especiales_list.html --&gt;</w:t>
+              <w:t>Aprobado el permiso, ya no lo cancelas tú: lo pides y lo decide tu supervisor, con los mismos plazos &lt;!-- fuente: permisos/views.py (PermisoMediaJornadaCancelView) --&gt;</w:t>
             </w:r>
           </w:p>
         </w:tc>
@@ -33827,7 +35494,7 @@
                 <w:b/>
                 <w:sz w:val="20"/>
               </w:rPr>
-              <w:t>Un intercambio de descanso ya no reserva el día durante 30 minutos</w:t>
+              <w:t>Las 24 horas del permiso cuentan desde su aprobación</w:t>
             </w:r>
           </w:p>
         </w:tc>
@@ -33845,7 +35512,7 @@
               <w:rPr>
                 <w:sz w:val="20"/>
               </w:rPr>
-              <w:t>Antes, tras aprobarse un intercambio, sus días quedaban bloqueados media hora: no se podían elegir en el selector de fines de semana ni al enviar el formulario. Ahora el día queda libre desde que se aplica el intercambio. A cambio, si alguien lo reutiliza antes de que se resuelva tu petición de cancelación, ya no podrás deshacer tu cambio &lt;!-- fuente: solicitudes/services/cambio_descanso_aplicacion_service.py (dia_bloqueado_para_nuevo_cambio) --&gt;</w:t>
+              <w:t>Antes el plazo se movía con cualquier edición posterior del permiso, así que podía alargarse solo. Ahora arranca en el momento en que tu supervisor lo aprueba, tanto desde su pantalla como desde el enlace del correo &lt;!-- fuente: permisos/models.py (fecha_aprobacion); permisos/views.py --&gt;</w:t>
             </w:r>
           </w:p>
         </w:tc>
@@ -33866,7 +35533,7 @@
                 <w:b/>
                 <w:sz w:val="20"/>
               </w:rPr>
-              <w:t>El aviso de día bloqueado en el cambio de descanso dice qué hacer</w:t>
+              <w:t>Sobre tu propio permiso siempre se pide la cancelación</w:t>
             </w:r>
           </w:p>
         </w:tc>
@@ -33884,7 +35551,7 @@
               <w:rPr>
                 <w:sz w:val="20"/>
               </w:rPr>
-              <w:t>Solo aparece cuando el día tiene aplicado otro tipo de cambio, y te indica que hay que deshacerlo primero, pidiéndoselo a tu compañero si aún está en plazo o a tu supervisor &lt;!-- fuente: solicitudes/services/strategies/cambio_descanso_strategy.py (_trabaja_dia) --&gt;</w:t>
+              <w:t>Antes, si eras explorador y además supervisor, cancelabas tu permiso de un clic. Ahora la decide otra persona, y no puedes responder tu propia petición &lt;!-- fuente: permisos/views.py (PermisoMediaJornadaCancelView.post, _puede_responder_cancelacion) --&gt;</w:t>
             </w:r>
           </w:p>
         </w:tc>
@@ -33905,6 +35572,123 @@
                 <w:b/>
                 <w:sz w:val="20"/>
               </w:rPr>
+              <w:t>La cancelación de un permiso la responde su supervisor</w:t>
+            </w:r>
+          </w:p>
+        </w:tc>
+        <w:tc>
+          <w:tcPr>
+            <w:tcW w:type="dxa" w:w="4320"/>
+          </w:tcPr>
+          <w:p>
+            <w:r>
+              <w:rPr>
+                <w:sz w:val="20"/>
+              </w:rPr>
+            </w:r>
+            <w:r>
+              <w:rPr>
+                <w:sz w:val="20"/>
+              </w:rPr>
+              <w:t>Antes bastaba con tener rol de supervisor para decidir sobre el permiso de cualquiera. Ahora responde el supervisor que aprobó ese permiso; los botones de aprobar y rechazar solo salen sobre permisos ajenos &lt;!-- fuente: permisos/views.py (_supervisor_del_permiso, _puede_responder_cancelacion); templates/permisos/permisos_especiales_list.html --&gt;</w:t>
+            </w:r>
+          </w:p>
+        </w:tc>
+      </w:tr>
+      <w:tr>
+        <w:tc>
+          <w:tcPr>
+            <w:tcW w:type="dxa" w:w="4320"/>
+          </w:tcPr>
+          <w:p>
+            <w:r>
+              <w:rPr>
+                <w:sz w:val="20"/>
+              </w:rPr>
+            </w:r>
+            <w:r>
+              <w:rPr>
+                <w:b/>
+                <w:sz w:val="20"/>
+              </w:rPr>
+              <w:t>Un intercambio de descanso ya no reserva el día durante 30 minutos</w:t>
+            </w:r>
+          </w:p>
+        </w:tc>
+        <w:tc>
+          <w:tcPr>
+            <w:tcW w:type="dxa" w:w="4320"/>
+          </w:tcPr>
+          <w:p>
+            <w:r>
+              <w:rPr>
+                <w:sz w:val="20"/>
+              </w:rPr>
+            </w:r>
+            <w:r>
+              <w:rPr>
+                <w:sz w:val="20"/>
+              </w:rPr>
+              <w:t>Antes, tras aprobarse un intercambio, sus días quedaban bloqueados media hora: no se podían elegir en el selector de fines de semana ni al enviar el formulario. Ahora el día queda libre desde que se aplica el intercambio. A cambio, si alguien lo reutiliza antes de que se resuelva tu petición de cancelación, ya no podrás deshacer tu cambio &lt;!-- fuente: solicitudes/services/cambio_descanso_aplicacion_service.py (dia_bloqueado_para_nuevo_cambio) --&gt;</w:t>
+            </w:r>
+          </w:p>
+        </w:tc>
+      </w:tr>
+      <w:tr>
+        <w:tc>
+          <w:tcPr>
+            <w:tcW w:type="dxa" w:w="4320"/>
+          </w:tcPr>
+          <w:p>
+            <w:r>
+              <w:rPr>
+                <w:sz w:val="20"/>
+              </w:rPr>
+            </w:r>
+            <w:r>
+              <w:rPr>
+                <w:b/>
+                <w:sz w:val="20"/>
+              </w:rPr>
+              <w:t>El aviso de día bloqueado en el cambio de descanso dice qué hacer</w:t>
+            </w:r>
+          </w:p>
+        </w:tc>
+        <w:tc>
+          <w:tcPr>
+            <w:tcW w:type="dxa" w:w="4320"/>
+          </w:tcPr>
+          <w:p>
+            <w:r>
+              <w:rPr>
+                <w:sz w:val="20"/>
+              </w:rPr>
+            </w:r>
+            <w:r>
+              <w:rPr>
+                <w:sz w:val="20"/>
+              </w:rPr>
+              <w:t>Solo aparece cuando el día tiene aplicado otro tipo de cambio, y te indica que hay que deshacerlo primero, pidiéndoselo a tu compañero si aún está en plazo o a tu supervisor &lt;!-- fuente: solicitudes/services/strategies/cambio_descanso_strategy.py (_trabaja_dia) --&gt;</w:t>
+            </w:r>
+          </w:p>
+        </w:tc>
+      </w:tr>
+      <w:tr>
+        <w:tc>
+          <w:tcPr>
+            <w:tcW w:type="dxa" w:w="4320"/>
+          </w:tcPr>
+          <w:p>
+            <w:r>
+              <w:rPr>
+                <w:sz w:val="20"/>
+              </w:rPr>
+            </w:r>
+            <w:r>
+              <w:rPr>
+                <w:b/>
+                <w:sz w:val="20"/>
+              </w:rPr>
               <w:t>Tres avisos nuevos en la campana</w:t>
             </w:r>
           </w:p>
@@ -33924,6 +35708,188 @@
                 <w:sz w:val="20"/>
               </w:rPr>
               <w:t>"Te piden cancelar un cambio ya aprobado", "Cancelación aprobada" y "Cancelación rechazada". Solo dentro de la aplicación; no se envían por correo &lt;!-- fuente: solicitudes/services/notificacion_service.py --&gt;</w:t>
+            </w:r>
+          </w:p>
+        </w:tc>
+      </w:tr>
+      <w:tr>
+        <w:tc>
+          <w:tcPr>
+            <w:tcW w:type="dxa" w:w="4320"/>
+          </w:tcPr>
+          <w:p>
+            <w:r>
+              <w:rPr>
+                <w:sz w:val="20"/>
+              </w:rPr>
+            </w:r>
+            <w:r>
+              <w:rPr>
+                <w:b/>
+                <w:sz w:val="20"/>
+              </w:rPr>
+              <w:t>Nuevo: el envío de una solicitud ya no se queda esperando sin fin</w:t>
+            </w:r>
+          </w:p>
+        </w:tc>
+        <w:tc>
+          <w:tcPr>
+            <w:tcW w:type="dxa" w:w="4320"/>
+          </w:tcPr>
+          <w:p>
+            <w:r>
+              <w:rPr>
+                <w:sz w:val="20"/>
+              </w:rPr>
+            </w:r>
+            <w:r>
+              <w:rPr>
+                <w:sz w:val="20"/>
+              </w:rPr>
+              <w:t xml:space="preserve">Antes, si el envío se colgaba, el aviso </w:t>
+            </w:r>
+            <w:r>
+              <w:rPr>
+                <w:i/>
+                <w:sz w:val="20"/>
+              </w:rPr>
+              <w:t>"Enviando solicitud..."</w:t>
+            </w:r>
+            <w:r>
+              <w:rPr>
+                <w:sz w:val="20"/>
+              </w:rPr>
+              <w:t xml:space="preserve"> podía quedarse en pantalla de forma indefinida, sin botón ni forma de cerrarlo salvo recargar la página, que es justo lo que ese aviso pide no hacer. Ahora, a los 45 segundos sin respuesta, la pantalla deja de esperar y siempre te da una salida. Afecta a los seis formularios &lt;!-- fuente: static/js/loading-ui.js:27-35, :43, :101-131 --&gt;</w:t>
+            </w:r>
+          </w:p>
+        </w:tc>
+      </w:tr>
+      <w:tr>
+        <w:tc>
+          <w:tcPr>
+            <w:tcW w:type="dxa" w:w="4320"/>
+          </w:tcPr>
+          <w:p>
+            <w:r>
+              <w:rPr>
+                <w:sz w:val="20"/>
+              </w:rPr>
+            </w:r>
+            <w:r>
+              <w:rPr>
+                <w:b/>
+                <w:sz w:val="20"/>
+              </w:rPr>
+              <w:t>Aviso nuevo: "La solicitud está tardando demasiado"</w:t>
+            </w:r>
+          </w:p>
+        </w:tc>
+        <w:tc>
+          <w:tcPr>
+            <w:tcW w:type="dxa" w:w="4320"/>
+          </w:tcPr>
+          <w:p>
+            <w:r>
+              <w:rPr>
+                <w:sz w:val="20"/>
+              </w:rPr>
+            </w:r>
+            <w:r>
+              <w:rPr>
+                <w:sz w:val="20"/>
+              </w:rPr>
+              <w:t xml:space="preserve">Es el aviso de ese corte por tiempo, y no dice que el envío haya fallado: te manda a comprobar </w:t>
+            </w:r>
+            <w:r>
+              <w:rPr>
+                <w:b/>
+                <w:sz w:val="20"/>
+              </w:rPr>
+              <w:t>Mis Solicitudes</w:t>
+            </w:r>
+            <w:r>
+              <w:rPr>
+                <w:sz w:val="20"/>
+              </w:rPr>
+              <w:t xml:space="preserve"> antes de reenviar, porque la solicitud puede haberse creado igualmente. Por eso, donde el aviso de error de red ofrece </w:t>
+            </w:r>
+            <w:r>
+              <w:rPr>
+                <w:b/>
+                <w:sz w:val="20"/>
+              </w:rPr>
+              <w:t>Reintentar</w:t>
+            </w:r>
+            <w:r>
+              <w:rPr>
+                <w:sz w:val="20"/>
+              </w:rPr>
+              <w:t xml:space="preserve">, este se cierra con </w:t>
+            </w:r>
+            <w:r>
+              <w:rPr>
+                <w:b/>
+                <w:sz w:val="20"/>
+              </w:rPr>
+              <w:t>Entendido</w:t>
+            </w:r>
+            <w:r>
+              <w:rPr>
+                <w:sz w:val="20"/>
+              </w:rPr>
+              <w:t>. Ver el apartado 7.1 &lt;!-- fuente: static/js/loading-ui.js:50-52, :133-152; solicitar_cambio_turno.js:470; solicitar_ct_permanente.js:1768 --&gt;</w:t>
+            </w:r>
+          </w:p>
+        </w:tc>
+      </w:tr>
+      <w:tr>
+        <w:tc>
+          <w:tcPr>
+            <w:tcW w:type="dxa" w:w="4320"/>
+          </w:tcPr>
+          <w:p>
+            <w:r>
+              <w:rPr>
+                <w:sz w:val="20"/>
+              </w:rPr>
+            </w:r>
+            <w:r>
+              <w:rPr>
+                <w:b/>
+                <w:sz w:val="20"/>
+              </w:rPr>
+              <w:t>El envío es más rápido</w:t>
+            </w:r>
+          </w:p>
+        </w:tc>
+        <w:tc>
+          <w:tcPr>
+            <w:tcW w:type="dxa" w:w="4320"/>
+          </w:tcPr>
+          <w:p>
+            <w:r>
+              <w:rPr>
+                <w:sz w:val="20"/>
+              </w:rPr>
+            </w:r>
+            <w:r>
+              <w:rPr>
+                <w:sz w:val="20"/>
+              </w:rPr>
+              <w:t xml:space="preserve">Los correos de aviso al supervisor y al compañero ya no se mandan mientras esperas: salen por su cuenta en cuanto la solicitud queda guardada. No cambia ninguna regla ni ningún paso; solo que </w:t>
+            </w:r>
+            <w:r>
+              <w:rPr>
+                <w:i/>
+                <w:sz w:val="20"/>
+              </w:rPr>
+              <w:t>"Enviando solicitud..."</w:t>
+            </w:r>
+            <w:r>
+              <w:rPr>
+                <w:sz w:val="20"/>
+              </w:rPr>
+              <w:t xml:space="preserve"> dura mucho menos. Los correos siguen llegando a las mismas personas &lt;!-- fuente: solicitudes/services/email_outbox_service.py:303-325 (enviar_tras_commit) y :327-359 (envio_agrupado); config/settings.py:271 (EMAIL_SEND_ASYNC) --&gt;</w:t>
             </w:r>
           </w:p>
         </w:tc>
@@ -35740,6 +37706,118 @@
               <w:rPr>
                 <w:sz w:val="20"/>
               </w:rPr>
+              <w:t>Si los acuerdos aprobados hace tiempo también nombran al compañero en el detalle del día</w:t>
+            </w:r>
+          </w:p>
+        </w:tc>
+        <w:tc>
+          <w:tcPr>
+            <w:tcW w:type="dxa" w:w="2880"/>
+          </w:tcPr>
+          <w:p>
+            <w:r>
+              <w:rPr>
+                <w:sz w:val="20"/>
+              </w:rPr>
+            </w:r>
+            <w:r>
+              <w:rPr>
+                <w:sz w:val="20"/>
+              </w:rPr>
+              <w:t>Servicio que resuelve qué acuerdo cambió cada día y el registro que deja cada trámite al aplicarse</w:t>
+            </w:r>
+          </w:p>
+        </w:tc>
+        <w:tc>
+          <w:tcPr>
+            <w:tcW w:type="dxa" w:w="2880"/>
+          </w:tcPr>
+          <w:p>
+            <w:r>
+              <w:rPr>
+                <w:sz w:val="20"/>
+              </w:rPr>
+            </w:r>
+            <w:r>
+              <w:rPr>
+                <w:sz w:val="20"/>
+              </w:rPr>
+              <w:t>El compañero sale del registro que escribe el trámite en el momento de aplicarse. Los seis lo escriben hoy; no se pudo comprobar con datos reales qué muestran los acuerdos aprobados antes de que ese registro existiera</w:t>
+            </w:r>
+          </w:p>
+        </w:tc>
+      </w:tr>
+      <w:tr>
+        <w:tc>
+          <w:tcPr>
+            <w:tcW w:type="dxa" w:w="2880"/>
+          </w:tcPr>
+          <w:p>
+            <w:r>
+              <w:rPr>
+                <w:sz w:val="20"/>
+              </w:rPr>
+            </w:r>
+            <w:r>
+              <w:rPr>
+                <w:sz w:val="20"/>
+              </w:rPr>
+              <w:t>Qué compañero se nombra en un día que dos acuerdos aprobados tocaron</w:t>
+            </w:r>
+          </w:p>
+        </w:tc>
+        <w:tc>
+          <w:tcPr>
+            <w:tcW w:type="dxa" w:w="2880"/>
+          </w:tcPr>
+          <w:p>
+            <w:r>
+              <w:rPr>
+                <w:sz w:val="20"/>
+              </w:rPr>
+            </w:r>
+            <w:r>
+              <w:rPr>
+                <w:sz w:val="20"/>
+              </w:rPr>
+              <w:t>Servicio que resuelve el acuerdo de cada día</w:t>
+            </w:r>
+          </w:p>
+        </w:tc>
+        <w:tc>
+          <w:tcPr>
+            <w:tcW w:type="dxa" w:w="2880"/>
+          </w:tcPr>
+          <w:p>
+            <w:r>
+              <w:rPr>
+                <w:sz w:val="20"/>
+              </w:rPr>
+            </w:r>
+            <w:r>
+              <w:rPr>
+                <w:sz w:val="20"/>
+              </w:rPr>
+              <w:t>Manda el último aprobado (apartado 6.1); no se pudo reproducir en pantalla un día con dos acuerdos para confirmar qué nombre aparece</w:t>
+            </w:r>
+          </w:p>
+        </w:tc>
+      </w:tr>
+      <w:tr>
+        <w:tc>
+          <w:tcPr>
+            <w:tcW w:type="dxa" w:w="2880"/>
+          </w:tcPr>
+          <w:p>
+            <w:r>
+              <w:rPr>
+                <w:sz w:val="20"/>
+              </w:rPr>
+            </w:r>
+            <w:r>
+              <w:rPr>
+                <w:sz w:val="20"/>
+              </w:rPr>
               <w:t>Si las horas a favor caducan pasado un tiempo</w:t>
             </w:r>
           </w:p>
@@ -37080,6 +39158,151 @@
                 <w:sz w:val="20"/>
               </w:rPr>
               <w:t>Se comprobó la validación al enviar, común a los seis; no se localizó un aviso equivalente en la propia pantalla</w:t>
+            </w:r>
+          </w:p>
+        </w:tc>
+      </w:tr>
+      <w:tr>
+        <w:tc>
+          <w:tcPr>
+            <w:tcW w:type="dxa" w:w="2880"/>
+          </w:tcPr>
+          <w:p>
+            <w:r>
+              <w:rPr>
+                <w:sz w:val="20"/>
+              </w:rPr>
+            </w:r>
+            <w:r>
+              <w:rPr>
+                <w:sz w:val="20"/>
+              </w:rPr>
+              <w:t xml:space="preserve">Qué texto lleva el botón del aviso "La solicitud está tardando demasiado" en </w:t>
+            </w:r>
+            <w:r>
+              <w:rPr>
+                <w:b/>
+                <w:sz w:val="20"/>
+              </w:rPr>
+              <w:t>Cambio de Día de Descanso</w:t>
+            </w:r>
+            <w:r>
+              <w:rPr>
+                <w:sz w:val="20"/>
+              </w:rPr>
+              <w:t xml:space="preserve"> y en </w:t>
+            </w:r>
+            <w:r>
+              <w:rPr>
+                <w:b/>
+                <w:sz w:val="20"/>
+              </w:rPr>
+              <w:t>Doblada</w:t>
+            </w:r>
+          </w:p>
+        </w:tc>
+        <w:tc>
+          <w:tcPr>
+            <w:tcW w:type="dxa" w:w="2880"/>
+          </w:tcPr>
+          <w:p>
+            <w:r>
+              <w:rPr>
+                <w:sz w:val="20"/>
+              </w:rPr>
+            </w:r>
+            <w:r>
+              <w:rPr>
+                <w:sz w:val="20"/>
+              </w:rPr>
+              <w:t>Pantallas de envío de esos dos formularios</w:t>
+            </w:r>
+          </w:p>
+        </w:tc>
+        <w:tc>
+          <w:tcPr>
+            <w:tcW w:type="dxa" w:w="2880"/>
+          </w:tcPr>
+          <w:p>
+            <w:r>
+              <w:rPr>
+                <w:sz w:val="20"/>
+              </w:rPr>
+            </w:r>
+            <w:r>
+              <w:rPr>
+                <w:sz w:val="20"/>
+              </w:rPr>
+              <w:t xml:space="preserve">Los otros cuatro fijan </w:t>
+            </w:r>
+            <w:r>
+              <w:rPr>
+                <w:b/>
+                <w:sz w:val="20"/>
+              </w:rPr>
+              <w:t>Entendido</w:t>
+            </w:r>
+            <w:r>
+              <w:rPr>
+                <w:sz w:val="20"/>
+              </w:rPr>
+              <w:t xml:space="preserve"> de forma explícita; estos dos no lo indican y muestran el botón por defecto del componente de avisos. No se comprobó en pantalla qué palabra aparece ahí</w:t>
+            </w:r>
+          </w:p>
+        </w:tc>
+      </w:tr>
+      <w:tr>
+        <w:tc>
+          <w:tcPr>
+            <w:tcW w:type="dxa" w:w="2880"/>
+          </w:tcPr>
+          <w:p>
+            <w:r>
+              <w:rPr>
+                <w:sz w:val="20"/>
+              </w:rPr>
+            </w:r>
+            <w:r>
+              <w:rPr>
+                <w:sz w:val="20"/>
+              </w:rPr>
+              <w:t>Si el aviso de tiempo puede salir cuando la solicitud ya se guardó y el compañero ya recibió el correo</w:t>
+            </w:r>
+          </w:p>
+        </w:tc>
+        <w:tc>
+          <w:tcPr>
+            <w:tcW w:type="dxa" w:w="2880"/>
+          </w:tcPr>
+          <w:p>
+            <w:r>
+              <w:rPr>
+                <w:sz w:val="20"/>
+              </w:rPr>
+            </w:r>
+            <w:r>
+              <w:rPr>
+                <w:sz w:val="20"/>
+              </w:rPr>
+              <w:t>Envío de solicitudes y cola de correo</w:t>
+            </w:r>
+          </w:p>
+        </w:tc>
+        <w:tc>
+          <w:tcPr>
+            <w:tcW w:type="dxa" w:w="2880"/>
+          </w:tcPr>
+          <w:p>
+            <w:r>
+              <w:rPr>
+                <w:sz w:val="20"/>
+              </w:rPr>
+            </w:r>
+            <w:r>
+              <w:rPr>
+                <w:sz w:val="20"/>
+              </w:rPr>
+              <w:t>Es posible en teoría, porque el corte solo detiene la espera y no cancela nada en el servidor; no se pudo reproducir para confirmar qué avisos llegan en ese caso</w:t>
             </w:r>
           </w:p>
         </w:tc>

</xml_diff>

<commit_message>
docs: reorganiza deployment/ por temas y actualiza manuales
- deployment/ pasa de carpeta plana a subcarpetas numeradas con su README:
  01-dokploy, 02-correo, 03-operacion, 99-aws. Se actualizan las rutas
  internas que apuntaban a los ficheros movidos (incluida la del docstring
  de revisar_sanciones_por_deuda.py).
- Nuevo MANUAL_CORREO_GOOGLE_WORKSPACE.md (relay SMTP por IP, sin credenciales).
- manual_tecnico.md / manual_usuario.md: correo en lote, base de plantillas,
  detalle del dia y el resto de cambios de la ventana; PDFs y DOCX regenerados.
- REGLAS_NEGOCIO_SOLICITUDES.md: dia de pago libre en cobertura con 2
  companeros y "cambio de doblada" deshabilitado.
- Se eliminan notas sueltas de la raiz del repo (EJEMPLO_CAMBIO_DESCANSO.txt,
  "pendientes que hay que organizar.txt").

Co-Authored-By: Claude Sonnet 5 <noreply@anthropic.com>
Claude-Session: https://claude.ai/code/session_01LHMyoQYbQuakFu31PrVhgC
</commit_message>
<xml_diff>
--- a/AppTurnosExplora/docs/pdf/Manual_Usuario.docx
+++ b/AppTurnosExplora/docs/pdf/Manual_Usuario.docx
@@ -42,7 +42,7 @@
           <w:color w:val="606060"/>
           <w:sz w:val="20"/>
         </w:rPr>
-        <w:t>Version 1.0  |  09/09/2026</w:t>
+        <w:t>Version 1.0  |  10/09/2026</w:t>
       </w:r>
     </w:p>
     <w:p>
@@ -11318,7 +11318,16 @@
         <w:t>Entre semana</w:t>
       </w:r>
       <w:r>
-        <w:t>, además, decidir cuál de las cinco opciones quieres.</w:t>
+        <w:t xml:space="preserve">, además, decidir qué quieres hacer esa semana: de las cinco opciones que se muestran, </w:t>
+      </w:r>
+      <w:r>
+        <w:rPr>
+          <w:b/>
+        </w:rPr>
+        <w:t>Cambio de doblada</w:t>
+      </w:r>
+      <w:r>
+        <w:t xml:space="preserve"> está deshabilitada por ahora, así que puedes elegir entre las otras cuatro. &lt;!-- fuente: templates/solicitudes/solicitar_cambio_descanso.html:128-133; solicitudes/services/strategies/cambio_descanso_strategy.py:53 --&gt;</w:t>
       </w:r>
     </w:p>
     <w:p>
@@ -11559,7 +11568,30 @@
         <w:t>¿Qué quieres hacer?</w:t>
       </w:r>
       <w:r>
-        <w:t>, elige una de las cinco opciones (ver punto 8).</w:t>
+        <w:t>, elige una de las cuatro opciones disponibles (ver punto 8).</w:t>
+      </w:r>
+    </w:p>
+    <w:p>
+      <w:r>
+        <w:t xml:space="preserve">La quinta tarjeta, </w:t>
+      </w:r>
+      <w:r>
+        <w:rPr>
+          <w:b/>
+        </w:rPr>
+        <w:t>Cambio de doblada</w:t>
+      </w:r>
+      <w:r>
+        <w:t xml:space="preserve">, aparece atenuada con la nota </w:t>
+      </w:r>
+      <w:r>
+        <w:rPr>
+          <w:i/>
+        </w:rPr>
+        <w:t>No disponible por ahora</w:t>
+      </w:r>
+      <w:r>
+        <w:t xml:space="preserve"> y no se selecciona aunque la pulses.</w:t>
       </w:r>
     </w:p>
     <w:p>
@@ -12340,7 +12372,20 @@
               <w:rPr>
                 <w:sz w:val="20"/>
               </w:rPr>
-              <w:t>Una de las cinco opciones</w:t>
+              <w:t xml:space="preserve">Una de las cuatro opciones disponibles; </w:t>
+            </w:r>
+            <w:r>
+              <w:rPr>
+                <w:b/>
+                <w:sz w:val="20"/>
+              </w:rPr>
+              <w:t>Cambio de doblada</w:t>
+            </w:r>
+            <w:r>
+              <w:rPr>
+                <w:sz w:val="20"/>
+              </w:rPr>
+              <w:t xml:space="preserve"> está deshabilitada</w:t>
             </w:r>
           </w:p>
         </w:tc>
@@ -12717,7 +12762,7 @@
               <w:rPr>
                 <w:sz w:val="20"/>
               </w:rPr>
-              <w:t>Ninguno</w:t>
+              <w:t>Tu día de descanso de esa semana</w:t>
             </w:r>
           </w:p>
         </w:tc>
@@ -12735,7 +12780,46 @@
               <w:rPr>
                 <w:sz w:val="20"/>
               </w:rPr>
-              <w:t>Debe ser de la misma semana</w:t>
+              <w:t xml:space="preserve">Debe ser de la misma semana. Con </w:t>
+            </w:r>
+            <w:r>
+              <w:rPr>
+                <w:b/>
+                <w:sz w:val="20"/>
+              </w:rPr>
+              <w:t>Día completo (2 compañeros)</w:t>
+            </w:r>
+            <w:r>
+              <w:rPr>
+                <w:sz w:val="20"/>
+              </w:rPr>
+              <w:t xml:space="preserve"> tiene que ser un día en el que estés </w:t>
+            </w:r>
+            <w:r>
+              <w:rPr>
+                <w:b/>
+                <w:sz w:val="20"/>
+              </w:rPr>
+              <w:t>libre</w:t>
+            </w:r>
+            <w:r>
+              <w:rPr>
+                <w:sz w:val="20"/>
+              </w:rPr>
+              <w:t xml:space="preserve">. Los días de </w:t>
+            </w:r>
+            <w:r>
+              <w:rPr>
+                <w:b/>
+                <w:sz w:val="20"/>
+              </w:rPr>
+              <w:t>mantenimiento</w:t>
+            </w:r>
+            <w:r>
+              <w:rPr>
+                <w:sz w:val="20"/>
+              </w:rPr>
+              <w:t xml:space="preserve"> salen deshabilitados: ese día no opera nadie</w:t>
             </w:r>
           </w:p>
         </w:tc>
@@ -13014,6 +13098,12 @@
                 <w:sz w:val="20"/>
               </w:rPr>
               <w:t>Cambio de doblada</w:t>
+            </w:r>
+            <w:r>
+              <w:rPr>
+                <w:sz w:val="20"/>
+              </w:rPr>
+              <w:t>, que está deshabilitada por ahora: hoy este campo no llegas a verlo</w:t>
             </w:r>
           </w:p>
         </w:tc>
@@ -13613,9 +13703,16 @@
             </w:r>
             <w:r>
               <w:rPr>
-                <w:sz w:val="20"/>
-              </w:rPr>
-              <w:t>Tomas la doblada que un compañero ya tiene esa semana y él toma tu día completo. Sin deuda, porque ambos ya doblaban.</w:t>
+                <w:b/>
+                <w:sz w:val="20"/>
+              </w:rPr>
+              <w:t>No disponible por ahora.</w:t>
+            </w:r>
+            <w:r>
+              <w:rPr>
+                <w:sz w:val="20"/>
+              </w:rPr>
+              <w:t xml:space="preserve"> Cuando esté activa: tomas la doblada que un compañero ya tiene esa semana y él toma tu día completo. Sin deuda, porque ambos ya doblaban.</w:t>
             </w:r>
           </w:p>
         </w:tc>
@@ -13683,6 +13780,40 @@
     <w:p>
       <w:r>
         <w:t>&lt;!-- fuente: templates/solicitudes/solicitar_cambio_descanso.html:116-135 --&gt;</w:t>
+      </w:r>
+    </w:p>
+    <w:p>
+      <w:r>
+        <w:rPr>
+          <w:b/>
+        </w:rPr>
+        <w:t>Sobre la opción que está deshabilitada.</w:t>
+      </w:r>
+      <w:r>
+        <w:t xml:space="preserve"> La tarjeta ♻️ </w:t>
+      </w:r>
+      <w:r>
+        <w:rPr>
+          <w:b/>
+        </w:rPr>
+        <w:t>Cambio de doblada</w:t>
+      </w:r>
+      <w:r>
+        <w:t xml:space="preserve"> sigue en pantalla, atenuada y con la nota </w:t>
+      </w:r>
+      <w:r>
+        <w:rPr>
+          <w:i/>
+        </w:rPr>
+        <w:t>No disponible por ahora</w:t>
+      </w:r>
+      <w:r>
+        <w:t>, pero no se puede elegir: al pulsarla no ocurre nada y no se abre su bloque de campos. &lt;!-- fuente: templates/solicitudes/solicitar_cambio_descanso.html:128-133; static/js/cambio-turno/solicitar_cambio_descanso.js:780-786 --&gt;</w:t>
+      </w:r>
+    </w:p>
+    <w:p>
+      <w:r>
+        <w:t>Se mantiene a la vista, con su descripción, porque es una pausa y no una retirada: puede volver a activarse. Mientras tanto, para esa semana usa una de las otras cuatro opciones. El bloqueo no depende de la pantalla: aunque la solicitud llegue por otra vía, el sistema la rechaza igual (ver el punto 10). &lt;!-- fuente: solicitudes/services/strategies/cambio_descanso_strategy.py:53,248-256 --&gt;</w:t>
       </w:r>
     </w:p>
     <w:tbl>
@@ -13860,7 +13991,20 @@
               <w:rPr>
                 <w:sz w:val="20"/>
               </w:rPr>
-              <w:t xml:space="preserve"> solicitudes en un solo envío: o se crean las dos o ninguna. Después cada una se aprueba por separado.</w:t>
+              <w:t xml:space="preserve"> solicitudes en un solo envío: o se crean las dos o ninguna. Después cada una se aprueba por separado. </w:t>
+            </w:r>
+            <w:r>
+              <w:rPr>
+                <w:b/>
+                <w:sz w:val="20"/>
+              </w:rPr>
+              <w:t>El día de pago tiene que estar libre</w:t>
+            </w:r>
+            <w:r>
+              <w:rPr>
+                <w:sz w:val="20"/>
+              </w:rPr>
+              <w:t xml:space="preserve"> (ver abajo).</w:t>
             </w:r>
           </w:p>
         </w:tc>
@@ -13869,6 +14013,81 @@
     <w:p/>
     <w:p>
       <w:r>
+        <w:rPr>
+          <w:b/>
+        </w:rPr>
+        <w:t>Por qué el día completo exige pagar en un día libre.</w:t>
+      </w:r>
+      <w:r>
+        <w:t xml:space="preserve"> Con dos compañeros, ese día de pago se usa </w:t>
+      </w:r>
+      <w:r>
+        <w:rPr>
+          <w:b/>
+        </w:rPr>
+        <w:t>dos veces</w:t>
+      </w:r>
+      <w:r>
+        <w:t xml:space="preserve">: le devuelves media jornada a uno (la AM) y media al otro (la PM). O sea que ese día terminas trabajando </w:t>
+      </w:r>
+      <w:r>
+        <w:rPr>
+          <w:b/>
+        </w:rPr>
+        <w:t>AM+PM</w:t>
+      </w:r>
+      <w:r>
+        <w:t>, y eso solo cabe si llegabas libre. Si ese día ya trabajas media jornada, solo alcanza para pagarle a uno y el otro te habría cubierto gratis.</w:t>
+      </w:r>
+    </w:p>
+    <w:p>
+      <w:r>
+        <w:t xml:space="preserve">Un </w:t>
+      </w:r>
+      <w:r>
+        <w:rPr>
+          <w:b/>
+        </w:rPr>
+        <w:t>Cambio de Turno</w:t>
+      </w:r>
+      <w:r>
+        <w:t xml:space="preserve"> no lo resuelve: girar tu jornada solo traslada el choque al otro compañero. Y si el día de pago fuera de mantenimiento, ese día ni siquiera se puede pedir un Cambio de Turno. Las salidas reales son dos: </w:t>
+      </w:r>
+      <w:r>
+        <w:rPr>
+          <w:b/>
+        </w:rPr>
+        <w:t>elegir tu día libre</w:t>
+      </w:r>
+      <w:r>
+        <w:t xml:space="preserve"> de esa semana, o pedir que te cubran </w:t>
+      </w:r>
+      <w:r>
+        <w:rPr>
+          <w:b/>
+        </w:rPr>
+        <w:t>solo la AM</w:t>
+      </w:r>
+      <w:r>
+        <w:t xml:space="preserve"> o </w:t>
+      </w:r>
+      <w:r>
+        <w:rPr>
+          <w:b/>
+        </w:rPr>
+        <w:t>solo la PM</w:t>
+      </w:r>
+      <w:r>
+        <w:t xml:space="preserve"> (ahí sí basta con tener libre esa mitad).</w:t>
+      </w:r>
+    </w:p>
+    <w:p>
+      <w:r>
+        <w:t>&lt;!-- fuente: solicitudes/services/solicitud_orchestrator.py (_pago_dos_debe_estar_libre) --&gt; &lt;!-- fuente: static/js/cambio-turno/solicitar_cambio_descanso.js (mostrarAvisoDosDiaLibre) --&gt;</w:t>
+      </w:r>
+    </w:p>
+    <w:p>
+      <w:r>
         <w:t>&lt;!-- fuente: templates/solicitudes/solicitar_cambio_descanso.html:153-155,187-188 --&gt; &lt;!-- fuente: solicitudes/services/solicitud_orchestrator.py:190-290 --&gt;</w:t>
       </w:r>
     </w:p>
@@ -14015,12 +14234,30 @@
         <w:pStyle w:val="ListBullet"/>
       </w:pPr>
       <w:r>
-        <w:t>*"En el día de pago tienes la misma jornada que el compañero: primero haz un Cambio de</w:t>
-      </w:r>
-    </w:p>
-    <w:p>
-      <w:r>
-        <w:t>Turno sencillo."*</w:t>
+        <w:t xml:space="preserve">Solo en </w:t>
+      </w:r>
+      <w:r>
+        <w:rPr>
+          <w:b/>
+        </w:rPr>
+        <w:t>Día completo (2 compañeros)</w:t>
+      </w:r>
+      <w:r>
+        <w:t>, y en cuanto eliges un día de pago en el que ya</w:t>
+      </w:r>
+    </w:p>
+    <w:p>
+      <w:r>
+        <w:t xml:space="preserve">trabajas, un recuadro rojo: </w:t>
+      </w:r>
+      <w:r>
+        <w:rPr>
+          <w:i/>
+        </w:rPr>
+        <w:t>"Para el día completo el día de pago debe estar LIBRE. Ese día le devuelves media jornada a cada compañero (AM a uno y PM al otro), o sea que trabajas AM+PM. El dd/mm/aaaa ya trabajas AM, así que solo podrías pagarle a uno. Un Cambio de Turno no lo arregla: te dejaría chocando con el otro. Elige tu día libre (lunes 09/03), o pide que te cubran solo la AM o solo la PM."</w:t>
+      </w:r>
+      <w:r>
+        <w:t xml:space="preserve"> Es palabra por palabra lo que responde el sistema si envías igualmente (punto 14); lo único que añade la pantalla es el nombre y la fecha de tu día libre de esa semana, que solo se propone si sigue disponible en el desplegable. &lt;!-- fuente: static/js/cambio-turno/solicitar_cambio_descanso.js:1064-1095 (mostrarAvisoDosDiaLibre); solicitudes/services/solicitud_orchestrator.py:201-235 --&gt;</w:t>
       </w:r>
     </w:p>
     <w:p>
@@ -14028,19 +14265,45 @@
         <w:pStyle w:val="ListBullet"/>
       </w:pPr>
       <w:r>
+        <w:t xml:space="preserve">Si pulsas </w:t>
+      </w:r>
+      <w:r>
+        <w:rPr>
+          <w:b/>
+        </w:rPr>
+        <w:t>Enviar Solicitud</w:t>
+      </w:r>
+      <w:r>
+        <w:t xml:space="preserve"> sin corregirlo, la lista de </w:t>
+      </w:r>
+      <w:r>
         <w:rPr>
           <w:i/>
         </w:rPr>
-        <w:t>"Selecciona la doblada que tomas."</w:t>
-      </w:r>
-      <w:r>
-        <w:t xml:space="preserve">, </w:t>
-      </w:r>
+        <w:t>Faltan datos</w:t>
+      </w:r>
+      <w:r>
+        <w:t xml:space="preserve"> dice lo mismo:</w:t>
+      </w:r>
+    </w:p>
+    <w:p>
       <w:r>
         <w:rPr>
           <w:i/>
         </w:rPr>
-        <w:t>"Elige qué media jornada trabajas tu día."</w:t>
+        <w:t>"Para el día completo (2 compañeros) el día de pago debe estar LIBRE. Ese día le devuelves media jornada a cada compañero (AM a uno y PM al otro), o sea que trabajas AM+PM. Elige un día de esa semana en el que estés libre, o pide que te cubran solo la AM o solo la PM."</w:t>
+      </w:r>
+      <w:r>
+        <w:t xml:space="preserve"> Frente al recuadro rojo se ahorra dos cosas que ahí ya tienes delante: qué jornada trabajas ese día y la advertencia de que un </w:t>
+      </w:r>
+      <w:r>
+        <w:rPr>
+          <w:b/>
+        </w:rPr>
+        <w:t>Cambio de Turno</w:t>
+      </w:r>
+      <w:r>
+        <w:t xml:space="preserve"> no lo arregla. &lt;!-- fuente: static/js/cambio-turno/solicitar_cambio_descanso.js:1064-1067 (literales compartidos), :1294-1296 --&gt;</w:t>
       </w:r>
     </w:p>
     <w:p>
@@ -14048,10 +14311,12 @@
         <w:pStyle w:val="ListBullet"/>
       </w:pPr>
       <w:r>
-        <w:rPr>
-          <w:i/>
-        </w:rPr>
-        <w:t>"Ingresa un comentario."</w:t>
+        <w:t>*"En el día de pago tienes la misma jornada que el compañero: primero haz un Cambio de</w:t>
+      </w:r>
+    </w:p>
+    <w:p>
+      <w:r>
+        <w:t>Turno sencillo."*</w:t>
       </w:r>
     </w:p>
     <w:p>
@@ -14059,12 +14324,33 @@
         <w:pStyle w:val="ListBullet"/>
       </w:pPr>
       <w:r>
-        <w:t>Si el mes tiene 5 domingos: *"Uno trabajará 3 domingos y el otro 2. Confirmen ambos antes</w:t>
-      </w:r>
-    </w:p>
-    <w:p>
-      <w:r>
-        <w:t>de continuar."*</w:t>
+        <w:rPr>
+          <w:i/>
+        </w:rPr>
+        <w:t>"Elige qué media jornada trabajas tu día."</w:t>
+      </w:r>
+      <w:r>
+        <w:t xml:space="preserve"> (El aviso </w:t>
+      </w:r>
+      <w:r>
+        <w:rPr>
+          <w:i/>
+        </w:rPr>
+        <w:t>"Selecciona la doblada que tomas."</w:t>
+      </w:r>
+    </w:p>
+    <w:p>
+      <w:r>
+        <w:t xml:space="preserve">pertenece a </w:t>
+      </w:r>
+      <w:r>
+        <w:rPr>
+          <w:b/>
+        </w:rPr>
+        <w:t>Cambio de doblada</w:t>
+      </w:r>
+      <w:r>
+        <w:t xml:space="preserve"> y hoy no llegas a verlo: esa opción está deshabilitada.)</w:t>
       </w:r>
     </w:p>
     <w:p>
@@ -14072,12 +14358,21 @@
         <w:pStyle w:val="ListBullet"/>
       </w:pPr>
       <w:r>
-        <w:t>Si no hay descanso contrario esa semana: *"Esta semana no hay un descanso del grupo</w:t>
-      </w:r>
-    </w:p>
-    <w:p>
-      <w:r>
-        <w:t>contrario para intercambiar."*</w:t>
+        <w:t xml:space="preserve">La tarjeta ♻️ </w:t>
+      </w:r>
+      <w:r>
+        <w:rPr>
+          <w:b/>
+        </w:rPr>
+        <w:t>Cambio de doblada</w:t>
+      </w:r>
+      <w:r>
+        <w:t xml:space="preserve"> no responde al clic: no se marca ni abre campos.</w:t>
+      </w:r>
+    </w:p>
+    <w:p>
+      <w:r>
+        <w:t>&lt;!-- fuente: static/js/cambio-turno/solicitar_cambio_descanso.js:780-786 --&gt;</w:t>
       </w:r>
     </w:p>
     <w:p>
@@ -14085,39 +14380,10 @@
         <w:pStyle w:val="ListBullet"/>
       </w:pPr>
       <w:r>
-        <w:t>Si el mes no sirve: *"En este mes descansas todos los fines de semana o ya pasaron.</w:t>
-      </w:r>
-    </w:p>
-    <w:p>
-      <w:r>
-        <w:t>Prueba con otro mes."*</w:t>
-      </w:r>
-    </w:p>
-    <w:p>
-      <w:r>
-        <w:t>&lt;!-- fuente: static/js/cambio-turno/solicitar_cambio_descanso.js --&gt; &lt;!-- fuente: templates/solicitudes/solicitar_cambio_descanso.html:105 --&gt;</w:t>
-      </w:r>
-    </w:p>
-    <w:p>
-      <w:r>
-        <w:rPr>
-          <w:b/>
-        </w:rPr>
-        <w:t>10. Qué valida el sistema al enviar.</w:t>
-      </w:r>
-    </w:p>
-    <w:p>
-      <w:r>
-        <w:t xml:space="preserve">En modalidad </w:t>
-      </w:r>
-      <w:r>
-        <w:rPr>
-          <w:b/>
-        </w:rPr>
-        <w:t>Fin de semana</w:t>
-      </w:r>
-      <w:r>
-        <w:t>:</w:t>
+        <w:rPr>
+          <w:i/>
+        </w:rPr>
+        <w:t>"Ingresa un comentario."</w:t>
       </w:r>
     </w:p>
     <w:p>
@@ -14125,12 +14391,12 @@
         <w:pStyle w:val="ListBullet"/>
       </w:pPr>
       <w:r>
-        <w:t>Que el día que cambias y el de devolución sean fines de semana, distintos, futuros y del</w:t>
-      </w:r>
-    </w:p>
-    <w:p>
-      <w:r>
-        <w:t>mismo tipo de día (sábado por sábado, domingo por domingo), para mantener el balance de domingos del mes. &lt;!-- fuente: solicitudes/services/strategies/cambio_descanso_strategy.py --&gt;</w:t>
+        <w:t>Si el mes tiene 5 domingos: *"Uno trabajará 3 domingos y el otro 2. Confirmen ambos antes</w:t>
+      </w:r>
+    </w:p>
+    <w:p>
+      <w:r>
+        <w:t>de continuar."*</w:t>
       </w:r>
     </w:p>
     <w:p>
@@ -14138,12 +14404,12 @@
         <w:pStyle w:val="ListBullet"/>
       </w:pPr>
       <w:r>
-        <w:t>Que el compañero sea del grupo contrario y que ninguno de los dos trabaje ya el día que</w:t>
-      </w:r>
-    </w:p>
-    <w:p>
-      <w:r>
-        <w:t>va a recibir.</w:t>
+        <w:t>Si no hay descanso contrario esa semana: *"Esta semana no hay un descanso del grupo</w:t>
+      </w:r>
+    </w:p>
+    <w:p>
+      <w:r>
+        <w:t>contrario para intercambiar."*</w:t>
       </w:r>
     </w:p>
     <w:p>
@@ -14151,41 +14417,36 @@
         <w:pStyle w:val="ListBullet"/>
       </w:pPr>
       <w:r>
-        <w:t xml:space="preserve">Que ese día no tenga aplicado un cambio de </w:t>
-      </w:r>
+        <w:t>Si el mes no sirve: *"En este mes descansas todos los fines de semana o ya pasaron.</w:t>
+      </w:r>
+    </w:p>
+    <w:p>
+      <w:r>
+        <w:t>Prueba con otro mes."*</w:t>
+      </w:r>
+    </w:p>
+    <w:p>
+      <w:r>
+        <w:t>&lt;!-- fuente: static/js/cambio-turno/solicitar_cambio_descanso.js --&gt; &lt;!-- fuente: templates/solicitudes/solicitar_cambio_descanso.html:105 --&gt;</w:t>
+      </w:r>
+    </w:p>
+    <w:p>
       <w:r>
         <w:rPr>
           <w:b/>
         </w:rPr>
-        <w:t>otro tipo</w:t>
-      </w:r>
-      <w:r>
-        <w:t xml:space="preserve"> (doblada, cambio de día de fin</w:t>
-      </w:r>
-    </w:p>
-    <w:p>
-      <w:r>
-        <w:t xml:space="preserve">de semana, cambio de turno o sus versiones permanentes) ni haya un intercambio idéntico pendiente. Un intercambio de descanso anterior sobre ese día </w:t>
+        <w:t>10. Qué valida el sistema al enviar.</w:t>
+      </w:r>
+    </w:p>
+    <w:p>
+      <w:r>
+        <w:t xml:space="preserve">En modalidad </w:t>
       </w:r>
       <w:r>
         <w:rPr>
           <w:b/>
         </w:rPr>
-        <w:t>no</w:t>
-      </w:r>
-      <w:r>
-        <w:t xml:space="preserve"> lo bloquea. &lt;!-- fuente: solicitudes/services/cambio_descanso_aplicacion_service.py (dia_bloqueado_para_nuevo_cambio) --&gt;</w:t>
-      </w:r>
-    </w:p>
-    <w:p>
-      <w:r>
-        <w:t xml:space="preserve">En modalidad </w:t>
-      </w:r>
-      <w:r>
-        <w:rPr>
-          <w:b/>
-        </w:rPr>
-        <w:t>Entre semana</w:t>
+        <w:t>Fin de semana</w:t>
       </w:r>
       <w:r>
         <w:t>:</w:t>
@@ -14196,7 +14457,12 @@
         <w:pStyle w:val="ListBullet"/>
       </w:pPr>
       <w:r>
-        <w:t>Que ambos días sean de lunes a viernes, distintos y futuros.</w:t>
+        <w:t>Que el día que cambias y el de devolución sean fines de semana, distintos, futuros y del</w:t>
+      </w:r>
+    </w:p>
+    <w:p>
+      <w:r>
+        <w:t>mismo tipo de día (sábado por sábado, domingo por domingo), para mantener el balance de domingos del mes. &lt;!-- fuente: solicitudes/services/strategies/cambio_descanso_strategy.py --&gt;</w:t>
       </w:r>
     </w:p>
     <w:p>
@@ -14204,16 +14470,12 @@
         <w:pStyle w:val="ListBullet"/>
       </w:pPr>
       <w:r>
-        <w:t xml:space="preserve">Que el descanso del compañero sea de la </w:t>
-      </w:r>
-      <w:r>
-        <w:rPr>
-          <w:b/>
-        </w:rPr>
-        <w:t>misma semana</w:t>
-      </w:r>
-      <w:r>
-        <w:t xml:space="preserve"> que el tuyo.</w:t>
+        <w:t>Que el compañero sea del grupo contrario y que ninguno de los dos trabaje ya el día que</w:t>
+      </w:r>
+    </w:p>
+    <w:p>
+      <w:r>
+        <w:t>va a recibir.</w:t>
       </w:r>
     </w:p>
     <w:p>
@@ -14221,7 +14483,44 @@
         <w:pStyle w:val="ListBullet"/>
       </w:pPr>
       <w:r>
-        <w:t>Que esa semana tenga descansos de temporada configurados.</w:t>
+        <w:t xml:space="preserve">Que ese día no tenga aplicado un cambio de </w:t>
+      </w:r>
+      <w:r>
+        <w:rPr>
+          <w:b/>
+        </w:rPr>
+        <w:t>otro tipo</w:t>
+      </w:r>
+      <w:r>
+        <w:t xml:space="preserve"> (doblada, cambio de día de fin</w:t>
+      </w:r>
+    </w:p>
+    <w:p>
+      <w:r>
+        <w:t xml:space="preserve">de semana, cambio de turno o sus versiones permanentes) ni haya un intercambio idéntico pendiente. Un intercambio de descanso anterior sobre ese día </w:t>
+      </w:r>
+      <w:r>
+        <w:rPr>
+          <w:b/>
+        </w:rPr>
+        <w:t>no</w:t>
+      </w:r>
+      <w:r>
+        <w:t xml:space="preserve"> lo bloquea. &lt;!-- fuente: solicitudes/services/cambio_descanso_aplicacion_service.py (dia_bloqueado_para_nuevo_cambio) --&gt;</w:t>
+      </w:r>
+    </w:p>
+    <w:p>
+      <w:r>
+        <w:t xml:space="preserve">En modalidad </w:t>
+      </w:r>
+      <w:r>
+        <w:rPr>
+          <w:b/>
+        </w:rPr>
+        <w:t>Entre semana</w:t>
+      </w:r>
+      <w:r>
+        <w:t>:</w:t>
       </w:r>
     </w:p>
     <w:p>
@@ -14229,7 +14528,7 @@
         <w:pStyle w:val="ListBullet"/>
       </w:pPr>
       <w:r>
-        <w:t>Que la compensación sea en la misma semana.</w:t>
+        <w:t>Que ambos días sean de lunes a viernes, distintos y futuros.</w:t>
       </w:r>
     </w:p>
     <w:p>
@@ -14237,12 +14536,107 @@
         <w:pStyle w:val="ListBullet"/>
       </w:pPr>
       <w:r>
+        <w:t xml:space="preserve">Que el descanso del compañero sea de la </w:t>
+      </w:r>
+      <w:r>
+        <w:rPr>
+          <w:b/>
+        </w:rPr>
+        <w:t>misma semana</w:t>
+      </w:r>
+      <w:r>
+        <w:t xml:space="preserve"> que el tuyo.</w:t>
+      </w:r>
+    </w:p>
+    <w:p>
+      <w:pPr>
+        <w:pStyle w:val="ListBullet"/>
+      </w:pPr>
+      <w:r>
+        <w:t>Que esa semana tenga descansos de temporada configurados.</w:t>
+      </w:r>
+    </w:p>
+    <w:p>
+      <w:pPr>
+        <w:pStyle w:val="ListBullet"/>
+      </w:pPr>
+      <w:r>
+        <w:t>Que la compensación sea en la misma semana.</w:t>
+      </w:r>
+    </w:p>
+    <w:p>
+      <w:pPr>
+        <w:pStyle w:val="ListBullet"/>
+      </w:pPr>
+      <w:r>
         <w:t>Que el compañero sea del grupo contrario y que ambos tengáis realmente ese descanso</w:t>
       </w:r>
     </w:p>
     <w:p>
       <w:r>
         <w:t>asignado.</w:t>
+      </w:r>
+    </w:p>
+    <w:p>
+      <w:pPr>
+        <w:pStyle w:val="ListBullet"/>
+      </w:pPr>
+      <w:r>
+        <w:t xml:space="preserve">Que la opción elegida esté disponible. </w:t>
+      </w:r>
+      <w:r>
+        <w:rPr>
+          <w:b/>
+        </w:rPr>
+        <w:t>Cambio de doblada</w:t>
+      </w:r>
+      <w:r>
+        <w:t xml:space="preserve"> está deshabilitada: si la</w:t>
+      </w:r>
+    </w:p>
+    <w:p>
+      <w:r>
+        <w:t xml:space="preserve">solicitud llega igualmente, se rechaza con </w:t>
+      </w:r>
+      <w:r>
+        <w:rPr>
+          <w:i/>
+        </w:rPr>
+        <w:t>"«Cambio de doblada de la semana» está deshabilitado por ahora. Elige otra de las opciones de esa semana."</w:t>
+      </w:r>
+      <w:r>
+        <w:t>. La misma comprobación se repite al aprobar, así que una solicitud de esa opción enviada antes de que se apagara tampoco se puede aprobar: el compañero o el supervisor ven ese mismo texto y deben rechazarla. &lt;!-- fuente: solicitudes/services/strategies/cambio_descanso_strategy.py:53,248-256; solicitudes/tests/test_cambio_doblada_deshabilitado.py --&gt;</w:t>
+      </w:r>
+    </w:p>
+    <w:p>
+      <w:pPr>
+        <w:pStyle w:val="ListBullet"/>
+      </w:pPr>
+      <w:r>
+        <w:t xml:space="preserve">En </w:t>
+      </w:r>
+      <w:r>
+        <w:rPr>
+          <w:b/>
+        </w:rPr>
+        <w:t>Que me cubran mi día</w:t>
+      </w:r>
+      <w:r>
+        <w:t xml:space="preserve"> con </w:t>
+      </w:r>
+      <w:r>
+        <w:rPr>
+          <w:b/>
+        </w:rPr>
+        <w:t>Día completo (2 compañeros)</w:t>
+      </w:r>
+      <w:r>
+        <w:t>, que el día de pago sea un</w:t>
+      </w:r>
+    </w:p>
+    <w:p>
+      <w:r>
+        <w:t>día en el que estés libre. Se comprueba antes de crear nada, así que no queda ninguna de las dos solicitudes a medias. &lt;!-- fuente: solicitudes/services/solicitud_orchestrator.py:201-235,294-296 --&gt;</w:t>
       </w:r>
     </w:p>
     <w:p>
@@ -15602,6 +15996,196 @@
                 <w:sz w:val="20"/>
               </w:rPr>
               <w:t>Corrige y vuelve a enviar; no quedó nada a medias</w:t>
+            </w:r>
+          </w:p>
+        </w:tc>
+      </w:tr>
+      <w:tr>
+        <w:tc>
+          <w:tcPr>
+            <w:tcW w:type="dxa" w:w="2880"/>
+          </w:tcPr>
+          <w:p>
+            <w:r>
+              <w:rPr>
+                <w:sz w:val="20"/>
+              </w:rPr>
+            </w:r>
+            <w:r>
+              <w:rPr>
+                <w:sz w:val="20"/>
+              </w:rPr>
+              <w:t>"Para el día completo el día de pago debe estar LIBRE. Ese día le devuelves media jornada a cada compañero (AM a uno y PM al otro), o sea que trabajas AM+PM. El dd/mm/aaaa ya trabajas AM, así que solo podrías pagarle a uno. Un Cambio de Turno no lo arregla: te dejaría chocando con el otro. Elige un día de esa semana en el que estés libre, o pide que te cubran solo la AM o solo la PM."</w:t>
+            </w:r>
+          </w:p>
+        </w:tc>
+        <w:tc>
+          <w:tcPr>
+            <w:tcW w:type="dxa" w:w="2880"/>
+          </w:tcPr>
+          <w:p>
+            <w:r>
+              <w:rPr>
+                <w:sz w:val="20"/>
+              </w:rPr>
+            </w:r>
+            <w:r>
+              <w:rPr>
+                <w:sz w:val="20"/>
+              </w:rPr>
+              <w:t xml:space="preserve">Con dos compañeros pagas </w:t>
+            </w:r>
+            <w:r>
+              <w:rPr>
+                <w:b/>
+                <w:sz w:val="20"/>
+              </w:rPr>
+              <w:t>dos</w:t>
+            </w:r>
+            <w:r>
+              <w:rPr>
+                <w:sz w:val="20"/>
+              </w:rPr>
+              <w:t xml:space="preserve"> medias jornadas ese día, así que acabarías en AM+PM; ya trabajabas media. En lugar de AM ves lo que trabajas de verdad ese día: </w:t>
+            </w:r>
+            <w:r>
+              <w:rPr>
+                <w:b/>
+                <w:sz w:val="20"/>
+              </w:rPr>
+              <w:t>AM</w:t>
+            </w:r>
+            <w:r>
+              <w:rPr>
+                <w:sz w:val="20"/>
+              </w:rPr>
+              <w:t xml:space="preserve">, </w:t>
+            </w:r>
+            <w:r>
+              <w:rPr>
+                <w:b/>
+                <w:sz w:val="20"/>
+              </w:rPr>
+              <w:t>PM</w:t>
+            </w:r>
+            <w:r>
+              <w:rPr>
+                <w:sz w:val="20"/>
+              </w:rPr>
+              <w:t xml:space="preserve"> o </w:t>
+            </w:r>
+            <w:r>
+              <w:rPr>
+                <w:b/>
+                <w:sz w:val="20"/>
+              </w:rPr>
+              <w:t>AM+PM (doblada)</w:t>
+            </w:r>
+            <w:r>
+              <w:rPr>
+                <w:sz w:val="20"/>
+              </w:rPr>
+              <w:t>. Es el mismo texto del recuadro rojo del formulario (punto 9)</w:t>
+            </w:r>
+          </w:p>
+        </w:tc>
+        <w:tc>
+          <w:tcPr>
+            <w:tcW w:type="dxa" w:w="2880"/>
+          </w:tcPr>
+          <w:p>
+            <w:r>
+              <w:rPr>
+                <w:sz w:val="20"/>
+              </w:rPr>
+            </w:r>
+            <w:r>
+              <w:rPr>
+                <w:sz w:val="20"/>
+              </w:rPr>
+              <w:t xml:space="preserve">Elige un día libre de esa semana, o pide solo AM o solo PM. Un Cambio de Turno </w:t>
+            </w:r>
+            <w:r>
+              <w:rPr>
+                <w:b/>
+                <w:sz w:val="20"/>
+              </w:rPr>
+              <w:t>no</w:t>
+            </w:r>
+            <w:r>
+              <w:rPr>
+                <w:sz w:val="20"/>
+              </w:rPr>
+              <w:t xml:space="preserve"> lo arregla: movería el choque al otro compañero &lt;!-- fuente: solicitudes/services/solicitud_orchestrator.py:201-235 --&gt;</w:t>
+            </w:r>
+          </w:p>
+        </w:tc>
+      </w:tr>
+      <w:tr>
+        <w:tc>
+          <w:tcPr>
+            <w:tcW w:type="dxa" w:w="2880"/>
+          </w:tcPr>
+          <w:p>
+            <w:r>
+              <w:rPr>
+                <w:sz w:val="20"/>
+              </w:rPr>
+            </w:r>
+            <w:r>
+              <w:rPr>
+                <w:sz w:val="20"/>
+              </w:rPr>
+              <w:t>"«Cambio de doblada de la semana» está deshabilitado por ahora. Elige otra de las opciones de esa semana."</w:t>
+            </w:r>
+          </w:p>
+        </w:tc>
+        <w:tc>
+          <w:tcPr>
+            <w:tcW w:type="dxa" w:w="2880"/>
+          </w:tcPr>
+          <w:p>
+            <w:r>
+              <w:rPr>
+                <w:sz w:val="20"/>
+              </w:rPr>
+            </w:r>
+            <w:r>
+              <w:rPr>
+                <w:sz w:val="20"/>
+              </w:rPr>
+              <w:t xml:space="preserve">La opción ♻️ </w:t>
+            </w:r>
+            <w:r>
+              <w:rPr>
+                <w:b/>
+                <w:sz w:val="20"/>
+              </w:rPr>
+              <w:t>Cambio de doblada</w:t>
+            </w:r>
+            <w:r>
+              <w:rPr>
+                <w:sz w:val="20"/>
+              </w:rPr>
+              <w:t xml:space="preserve"> no está disponible. Sale si la solicitud se envía de todos modos, y también al intentar aprobar una enviada antes de que se apagara</w:t>
+            </w:r>
+          </w:p>
+        </w:tc>
+        <w:tc>
+          <w:tcPr>
+            <w:tcW w:type="dxa" w:w="2880"/>
+          </w:tcPr>
+          <w:p>
+            <w:r>
+              <w:rPr>
+                <w:sz w:val="20"/>
+              </w:rPr>
+            </w:r>
+            <w:r>
+              <w:rPr>
+                <w:sz w:val="20"/>
+              </w:rPr>
+              <w:t>Elige otra de las cuatro opciones de esa semana. Si la solicitud ya existe y está pendiente, hay que rechazarla &lt;!-- fuente: solicitudes/services/strategies/cambio_descanso_strategy.py:248-256 --&gt;</w:t>
             </w:r>
           </w:p>
         </w:tc>
@@ -20862,7 +21446,27 @@
         <w:pStyle w:val="ListBullet"/>
       </w:pPr>
       <w:r>
-        <w:t>Que el compañero no tenga ya otra doblada permanente en esas fechas.</w:t>
+        <w:t xml:space="preserve">Que el compañero no tenga ya otra doblada permanente sobre esas fechas, esté </w:t>
+      </w:r>
+      <w:r>
+        <w:rPr>
+          <w:b/>
+        </w:rPr>
+        <w:t>aprobada</w:t>
+      </w:r>
+    </w:p>
+    <w:p>
+      <w:r>
+        <w:t xml:space="preserve">o solo </w:t>
+      </w:r>
+      <w:r>
+        <w:rPr>
+          <w:b/>
+        </w:rPr>
+        <w:t>pendiente</w:t>
+      </w:r>
+      <w:r>
+        <w:t>. Una solicitud pendiente reserva las fechas desde que se envía: hasta que se apruebe o se cancele, esas fechas no se pueden comprometer otra vez. El aviso te dice en cuál de las dos situaciones estás y qué hacer en cada caso (punto 14). &lt;!-- fuente: solicitudes/services/strategies/doblada_permanente_strategy.py:264-293 --&gt;</w:t>
       </w:r>
     </w:p>
     <w:p>
@@ -21845,43 +22449,207 @@
               <w:rPr>
                 <w:sz w:val="20"/>
               </w:rPr>
-              <w:t>"… ya tiene una doblada permanente en esas fechas. Elige otras fechas u otro compañero."</w:t>
-            </w:r>
-          </w:p>
-        </w:tc>
-        <w:tc>
-          <w:tcPr>
-            <w:tcW w:type="dxa" w:w="2880"/>
-          </w:tcPr>
-          <w:p>
-            <w:r>
-              <w:rPr>
-                <w:sz w:val="20"/>
-              </w:rPr>
-            </w:r>
-            <w:r>
-              <w:rPr>
-                <w:sz w:val="20"/>
-              </w:rPr>
-              <w:t>Solapamiento</w:t>
-            </w:r>
-          </w:p>
-        </w:tc>
-        <w:tc>
-          <w:tcPr>
-            <w:tcW w:type="dxa" w:w="2880"/>
-          </w:tcPr>
-          <w:p>
-            <w:r>
-              <w:rPr>
-                <w:sz w:val="20"/>
-              </w:rPr>
-            </w:r>
-            <w:r>
-              <w:rPr>
-                <w:sz w:val="20"/>
-              </w:rPr>
-              <w:t>Ajusta</w:t>
+              <w:t>"NOMBRE APELLIDO ya tiene una doblada permanente aprobada en esas fechas (dd/mm/aaaa). Elige otras fechas u otro compañero."</w:t>
+            </w:r>
+          </w:p>
+        </w:tc>
+        <w:tc>
+          <w:tcPr>
+            <w:tcW w:type="dxa" w:w="2880"/>
+          </w:tcPr>
+          <w:p>
+            <w:r>
+              <w:rPr>
+                <w:sz w:val="20"/>
+              </w:rPr>
+            </w:r>
+            <w:r>
+              <w:rPr>
+                <w:sz w:val="20"/>
+              </w:rPr>
+              <w:t xml:space="preserve">El compañero ya tiene un acuerdo </w:t>
+            </w:r>
+            <w:r>
+              <w:rPr>
+                <w:b/>
+                <w:sz w:val="20"/>
+              </w:rPr>
+              <w:t>en firme</w:t>
+            </w:r>
+            <w:r>
+              <w:rPr>
+                <w:sz w:val="20"/>
+              </w:rPr>
+              <w:t xml:space="preserve"> sobre esas fechas; entre paréntesis salen las que chocan</w:t>
+            </w:r>
+          </w:p>
+        </w:tc>
+        <w:tc>
+          <w:tcPr>
+            <w:tcW w:type="dxa" w:w="2880"/>
+          </w:tcPr>
+          <w:p>
+            <w:r>
+              <w:rPr>
+                <w:sz w:val="20"/>
+              </w:rPr>
+            </w:r>
+            <w:r>
+              <w:rPr>
+                <w:sz w:val="20"/>
+              </w:rPr>
+              <w:t>Cambia esas fechas o elige a otra persona &lt;!-- fuente: solicitudes/services/strategies/doblada_permanente_strategy.py:290-293 --&gt;</w:t>
+            </w:r>
+          </w:p>
+        </w:tc>
+      </w:tr>
+      <w:tr>
+        <w:tc>
+          <w:tcPr>
+            <w:tcW w:type="dxa" w:w="2880"/>
+          </w:tcPr>
+          <w:p>
+            <w:r>
+              <w:rPr>
+                <w:sz w:val="20"/>
+              </w:rPr>
+            </w:r>
+            <w:r>
+              <w:rPr>
+                <w:sz w:val="20"/>
+              </w:rPr>
+              <w:t>"NOMBRE APELLIDO tiene una solicitud de doblada permanente PENDIENTE de aprobación que ya compromete esas fechas (dd/mm/aaaa). Espera a que se apruebe o se cancele, o elige otras fechas u otro compañero."</w:t>
+            </w:r>
+          </w:p>
+        </w:tc>
+        <w:tc>
+          <w:tcPr>
+            <w:tcW w:type="dxa" w:w="2880"/>
+          </w:tcPr>
+          <w:p>
+            <w:r>
+              <w:rPr>
+                <w:sz w:val="20"/>
+              </w:rPr>
+            </w:r>
+            <w:r>
+              <w:rPr>
+                <w:sz w:val="20"/>
+              </w:rPr>
+              <w:t xml:space="preserve">El acuerdo del compañero es con </w:t>
+            </w:r>
+            <w:r>
+              <w:rPr>
+                <w:b/>
+                <w:sz w:val="20"/>
+              </w:rPr>
+              <w:t>otra persona</w:t>
+            </w:r>
+            <w:r>
+              <w:rPr>
+                <w:sz w:val="20"/>
+              </w:rPr>
+              <w:t xml:space="preserve"> y todavía no está aprobado, pero esas fechas ya están reservadas</w:t>
+            </w:r>
+          </w:p>
+        </w:tc>
+        <w:tc>
+          <w:tcPr>
+            <w:tcW w:type="dxa" w:w="2880"/>
+          </w:tcPr>
+          <w:p>
+            <w:r>
+              <w:rPr>
+                <w:sz w:val="20"/>
+              </w:rPr>
+            </w:r>
+            <w:r>
+              <w:rPr>
+                <w:sz w:val="20"/>
+              </w:rPr>
+              <w:t>Espera a que se resuelva, o cambia las fechas o el compañero &lt;!-- fuente: solicitudes/services/strategies/doblada_permanente_strategy.py:285-289 --&gt;</w:t>
+            </w:r>
+          </w:p>
+        </w:tc>
+      </w:tr>
+      <w:tr>
+        <w:tc>
+          <w:tcPr>
+            <w:tcW w:type="dxa" w:w="2880"/>
+          </w:tcPr>
+          <w:p>
+            <w:r>
+              <w:rPr>
+                <w:sz w:val="20"/>
+              </w:rPr>
+            </w:r>
+            <w:r>
+              <w:rPr>
+                <w:sz w:val="20"/>
+              </w:rPr>
+              <w:t>"Ya enviaste una doblada permanente a NOMBRE APELLIDO que compromete esas fechas (dd/mm/aaaa) y sigue PENDIENTE de aprobación. Espera a que se apruebe o se cancele, o elige otras fechas."</w:t>
+            </w:r>
+          </w:p>
+        </w:tc>
+        <w:tc>
+          <w:tcPr>
+            <w:tcW w:type="dxa" w:w="2880"/>
+          </w:tcPr>
+          <w:p>
+            <w:r>
+              <w:rPr>
+                <w:sz w:val="20"/>
+              </w:rPr>
+            </w:r>
+            <w:r>
+              <w:rPr>
+                <w:sz w:val="20"/>
+              </w:rPr>
+              <w:t xml:space="preserve">La solicitud que bloquea es </w:t>
+            </w:r>
+            <w:r>
+              <w:rPr>
+                <w:b/>
+                <w:sz w:val="20"/>
+              </w:rPr>
+              <w:t>tuya</w:t>
+            </w:r>
+            <w:r>
+              <w:rPr>
+                <w:sz w:val="20"/>
+              </w:rPr>
+              <w:t>, y con ese mismo compañero</w:t>
+            </w:r>
+          </w:p>
+        </w:tc>
+        <w:tc>
+          <w:tcPr>
+            <w:tcW w:type="dxa" w:w="2880"/>
+          </w:tcPr>
+          <w:p>
+            <w:r>
+              <w:rPr>
+                <w:sz w:val="20"/>
+              </w:rPr>
+            </w:r>
+            <w:r>
+              <w:rPr>
+                <w:sz w:val="20"/>
+              </w:rPr>
+              <w:t xml:space="preserve">Espera su respuesta, o retírala desde </w:t>
+            </w:r>
+            <w:r>
+              <w:rPr>
+                <w:b/>
+                <w:sz w:val="20"/>
+              </w:rPr>
+              <w:t>Mis Solicitudes</w:t>
+            </w:r>
+            <w:r>
+              <w:rPr>
+                <w:sz w:val="20"/>
+              </w:rPr>
+              <w:t xml:space="preserve"> y vuelve a enviarla con otras fechas. Cambiar de compañero no hace falta &lt;!-- fuente: solicitudes/services/strategies/doblada_permanente_strategy.py:278-284 --&gt;</w:t>
             </w:r>
           </w:p>
         </w:tc>
@@ -22059,6 +22827,40 @@
     <w:p>
       <w:r>
         <w:t>&lt;!-- fuente: solicitudes/services/strategies/doblada_permanente_strategy.py; solicitud_orchestrator.py --&gt;</w:t>
+      </w:r>
+    </w:p>
+    <w:p>
+      <w:r>
+        <w:rPr>
+          <w:b/>
+        </w:rPr>
+        <w:t>Sobre los tres avisos de fechas ya comprometidas.</w:t>
+      </w:r>
+      <w:r>
+        <w:t xml:space="preserve"> Los tres significan lo mismo —esas fechas no están libres— y el bloqueo es idéntico: una doblada permanente </w:t>
+      </w:r>
+      <w:r>
+        <w:rPr>
+          <w:b/>
+        </w:rPr>
+        <w:t>pendiente</w:t>
+      </w:r>
+      <w:r>
+        <w:t xml:space="preserve"> reserva sus fechas desde que se envía, igual que una aprobada, y las mantiene reservadas hasta que se apruebe o se cancele. Lo que cambia es a quién le toca mover ficha.</w:t>
+      </w:r>
+    </w:p>
+    <w:p>
+      <w:r>
+        <w:t xml:space="preserve">Si el acuerdo está aprobado, no hay nada que esperar: cambia las fechas o el compañero. Si solo está pendiente, tienes dos caminos: esperar a que se resuelva o buscar otras fechas. Y si la pendiente es la que tú mismo enviaste a esa persona, cambiar de compañero no sirve de nada; lo que hay que mover son las fechas, o retirar tu propia solicitud desde </w:t>
+      </w:r>
+      <w:r>
+        <w:rPr>
+          <w:b/>
+        </w:rPr>
+        <w:t>Mis Solicitudes</w:t>
+      </w:r>
+      <w:r>
+        <w:t>. &lt;!-- fuente: solicitudes/services/strategies/doblada_permanente_strategy.py:264-293 --&gt;</w:t>
       </w:r>
     </w:p>
     <w:p>
@@ -25240,9 +26042,16 @@
             </w:r>
             <w:r>
               <w:rPr>
-                <w:sz w:val="20"/>
-              </w:rPr>
-              <w:t>Tomas la doblada que él ya tenía y él toma tu día. Sin deuda</w:t>
+                <w:b/>
+                <w:sz w:val="20"/>
+              </w:rPr>
+              <w:t>No disponible por ahora</w:t>
+            </w:r>
+            <w:r>
+              <w:rPr>
+                <w:sz w:val="20"/>
+              </w:rPr>
+              <w:t>: la tarjeta sale atenuada y no se puede elegir. Cuando esté activa, tomas la doblada que él ya tenía y él toma tu día. Sin deuda</w:t>
             </w:r>
           </w:p>
         </w:tc>
@@ -25426,7 +26235,7 @@
               <w:rPr>
                 <w:sz w:val="20"/>
               </w:rPr>
-              <w:t>Dos solicitudes en un solo envío, todo o nada</w:t>
+              <w:t>Dos solicitudes en un solo envío, todo o nada. El día de pago debe estar libre: ahí le devuelves media jornada a cada uno</w:t>
             </w:r>
           </w:p>
         </w:tc>
@@ -37587,6 +38396,175 @@
           </w:p>
         </w:tc>
       </w:tr>
+      <w:tr>
+        <w:tc>
+          <w:tcPr>
+            <w:tcW w:type="dxa" w:w="4320"/>
+          </w:tcPr>
+          <w:p>
+            <w:r>
+              <w:rPr>
+                <w:sz w:val="20"/>
+              </w:rPr>
+            </w:r>
+            <w:r>
+              <w:rPr>
+                <w:b/>
+                <w:sz w:val="20"/>
+              </w:rPr>
+              <w:t>En Doblada Permanente, el aviso de fechas ocupadas dice si el otro acuerdo está aprobado o solo pendiente</w:t>
+            </w:r>
+          </w:p>
+        </w:tc>
+        <w:tc>
+          <w:tcPr>
+            <w:tcW w:type="dxa" w:w="4320"/>
+          </w:tcPr>
+          <w:p>
+            <w:r>
+              <w:rPr>
+                <w:sz w:val="20"/>
+              </w:rPr>
+            </w:r>
+            <w:r>
+              <w:rPr>
+                <w:sz w:val="20"/>
+              </w:rPr>
+              <w:t>Antes salía siempre el mismo texto —"ya tiene una doblada permanente en esas fechas"— aunque el acuerdo del compañero estuviera todavía esperando aprobación, y eso hacía pensar que ya estaba en firme. Ahora hay tres avisos: acuerdo aprobado, solicitud pendiente de otra pareja, y solicitud pendiente que enviaste tú mismo a esa persona; cada uno indica qué hacer. La regla no cambió: una solicitud pendiente sigue reservando esas fechas hasta que se apruebe o se cancele. Ver el apartado 4.5 &lt;!-- fuente: solicitudes/services/strategies/doblada_permanente_strategy.py:264-293 --&gt;</w:t>
+            </w:r>
+          </w:p>
+        </w:tc>
+      </w:tr>
+      <w:tr>
+        <w:tc>
+          <w:tcPr>
+            <w:tcW w:type="dxa" w:w="4320"/>
+          </w:tcPr>
+          <w:p>
+            <w:r>
+              <w:rPr>
+                <w:sz w:val="20"/>
+              </w:rPr>
+            </w:r>
+            <w:r>
+              <w:rPr>
+                <w:b/>
+                <w:sz w:val="20"/>
+              </w:rPr>
+              <w:t>En Cambio de Día de Descanso, la opción "Cambio de doblada" está deshabilitada</w:t>
+            </w:r>
+          </w:p>
+        </w:tc>
+        <w:tc>
+          <w:tcPr>
+            <w:tcW w:type="dxa" w:w="4320"/>
+          </w:tcPr>
+          <w:p>
+            <w:r>
+              <w:rPr>
+                <w:sz w:val="20"/>
+              </w:rPr>
+            </w:r>
+            <w:r>
+              <w:rPr>
+                <w:sz w:val="20"/>
+              </w:rPr>
+              <w:t xml:space="preserve">La tarjeta ♻️ </w:t>
+            </w:r>
+            <w:r>
+              <w:rPr>
+                <w:b/>
+                <w:sz w:val="20"/>
+              </w:rPr>
+              <w:t>Cambio de doblada</w:t>
+            </w:r>
+            <w:r>
+              <w:rPr>
+                <w:sz w:val="20"/>
+              </w:rPr>
+              <w:t xml:space="preserve"> de la modalidad </w:t>
+            </w:r>
+            <w:r>
+              <w:rPr>
+                <w:b/>
+                <w:sz w:val="20"/>
+              </w:rPr>
+              <w:t>Entre semana</w:t>
+            </w:r>
+            <w:r>
+              <w:rPr>
+                <w:sz w:val="20"/>
+              </w:rPr>
+              <w:t xml:space="preserve"> sigue a la vista con su descripción, pero atenuada y con la nota </w:t>
+            </w:r>
+            <w:r>
+              <w:rPr>
+                <w:i/>
+                <w:sz w:val="20"/>
+              </w:rPr>
+              <w:t>No disponible por ahora</w:t>
+            </w:r>
+            <w:r>
+              <w:rPr>
+                <w:sz w:val="20"/>
+              </w:rPr>
+              <w:t>: no se puede seleccionar. Es una pausa, no una retirada. Las otras cuatro opciones de la semana funcionan igual que antes. Ver el apartado 4.3 &lt;!-- fuente: templates/solicitudes/solicitar_cambio_descanso.html:128-133; solicitudes/services/strategies/cambio_descanso_strategy.py:53,248-256 --&gt;</w:t>
+            </w:r>
+          </w:p>
+        </w:tc>
+      </w:tr>
+      <w:tr>
+        <w:tc>
+          <w:tcPr>
+            <w:tcW w:type="dxa" w:w="4320"/>
+          </w:tcPr>
+          <w:p>
+            <w:r>
+              <w:rPr>
+                <w:sz w:val="20"/>
+              </w:rPr>
+            </w:r>
+            <w:r>
+              <w:rPr>
+                <w:b/>
+                <w:sz w:val="20"/>
+              </w:rPr>
+              <w:t>La cobertura de día completo con dos compañeros exige pagar en un día libre</w:t>
+            </w:r>
+          </w:p>
+        </w:tc>
+        <w:tc>
+          <w:tcPr>
+            <w:tcW w:type="dxa" w:w="4320"/>
+          </w:tcPr>
+          <w:p>
+            <w:r>
+              <w:rPr>
+                <w:sz w:val="20"/>
+              </w:rPr>
+            </w:r>
+            <w:r>
+              <w:rPr>
+                <w:sz w:val="20"/>
+              </w:rPr>
+              <w:t xml:space="preserve">Ese día devuelves media jornada a cada uno (la AM a uno y la PM al otro), o sea que acabas trabajando el día entero. Si ya trabajabas media jornada, el envío se detiene antes de crear nada y el aviso explica el motivo: solo alcanzarías para pagarle a uno. Un </w:t>
+            </w:r>
+            <w:r>
+              <w:rPr>
+                <w:b/>
+                <w:sz w:val="20"/>
+              </w:rPr>
+              <w:t>Cambio de Turno</w:t>
+            </w:r>
+            <w:r>
+              <w:rPr>
+                <w:sz w:val="20"/>
+              </w:rPr>
+              <w:t xml:space="preserve"> no lo resuelve, porque traslada el choque al otro compañero. Esta regla se anuncia en tres momentos —el recuadro rojo bajo el día de pago, la lista de datos que faltan al enviar y la respuesta del sistema— y los tres la cuentan ahora con las mismas palabras. Antes cada uno la contaba a su manera y parecían reglas distintas. Lo único que cambia entre ellos es cuánto detalle repiten: el recuadro añade qué jornada trabajas ese día y te nombra tu día libre. Ver el apartado 4.3 &lt;!-- fuente: solicitudes/services/solicitud_orchestrator.py:201-235,294-296; static/js/cambio-turno/solicitar_cambio_descanso.js:1064-1067,1090-1095,1294-1296 --&gt;</w:t>
+            </w:r>
+          </w:p>
+        </w:tc>
+      </w:tr>
     </w:tbl>
     <w:p/>
     <w:p>
@@ -39303,6 +40281,151 @@
                 <w:sz w:val="20"/>
               </w:rPr>
               <w:t>Es posible en teoría, porque el corte solo detiene la espera y no cancela nada en el servidor; no se pudo reproducir para confirmar qué avisos llegan en ese caso</w:t>
+            </w:r>
+          </w:p>
+        </w:tc>
+      </w:tr>
+      <w:tr>
+        <w:tc>
+          <w:tcPr>
+            <w:tcW w:type="dxa" w:w="2880"/>
+          </w:tcPr>
+          <w:p>
+            <w:r>
+              <w:rPr>
+                <w:sz w:val="20"/>
+              </w:rPr>
+            </w:r>
+            <w:r>
+              <w:rPr>
+                <w:sz w:val="20"/>
+              </w:rPr>
+              <w:t xml:space="preserve">Hasta cuándo estará deshabilitada la opción ♻️ </w:t>
+            </w:r>
+            <w:r>
+              <w:rPr>
+                <w:b/>
+                <w:sz w:val="20"/>
+              </w:rPr>
+              <w:t>Cambio de doblada</w:t>
+            </w:r>
+            <w:r>
+              <w:rPr>
+                <w:sz w:val="20"/>
+              </w:rPr>
+              <w:t xml:space="preserve"> del cambio de descanso entre semana</w:t>
+            </w:r>
+          </w:p>
+        </w:tc>
+        <w:tc>
+          <w:tcPr>
+            <w:tcW w:type="dxa" w:w="2880"/>
+          </w:tcPr>
+          <w:p>
+            <w:r>
+              <w:rPr>
+                <w:sz w:val="20"/>
+              </w:rPr>
+            </w:r>
+            <w:r>
+              <w:rPr>
+                <w:sz w:val="20"/>
+              </w:rPr>
+              <w:t>Formulario, pantalla de envío y comprobación del servidor</w:t>
+            </w:r>
+          </w:p>
+        </w:tc>
+        <w:tc>
+          <w:tcPr>
+            <w:tcW w:type="dxa" w:w="2880"/>
+          </w:tcPr>
+          <w:p>
+            <w:r>
+              <w:rPr>
+                <w:sz w:val="20"/>
+              </w:rPr>
+            </w:r>
+            <w:r>
+              <w:rPr>
+                <w:sz w:val="20"/>
+              </w:rPr>
+              <w:t>El apagado está hecho para poder revertirse, pero no hay ninguna fecha ni condición escrita para reactivarlo: es una decisión que se toma fuera de la aplicación</w:t>
+            </w:r>
+          </w:p>
+        </w:tc>
+      </w:tr>
+      <w:tr>
+        <w:tc>
+          <w:tcPr>
+            <w:tcW w:type="dxa" w:w="2880"/>
+          </w:tcPr>
+          <w:p>
+            <w:r>
+              <w:rPr>
+                <w:sz w:val="20"/>
+              </w:rPr>
+            </w:r>
+            <w:r>
+              <w:rPr>
+                <w:sz w:val="20"/>
+              </w:rPr>
+              <w:t xml:space="preserve">Qué ve un explorador cuya solicitud de </w:t>
+            </w:r>
+            <w:r>
+              <w:rPr>
+                <w:b/>
+                <w:sz w:val="20"/>
+              </w:rPr>
+              <w:t>Cambio de doblada</w:t>
+            </w:r>
+            <w:r>
+              <w:rPr>
+                <w:sz w:val="20"/>
+              </w:rPr>
+              <w:t xml:space="preserve"> quedó pendiente antes de que se deshabilitara la opción</w:t>
+            </w:r>
+          </w:p>
+        </w:tc>
+        <w:tc>
+          <w:tcPr>
+            <w:tcW w:type="dxa" w:w="2880"/>
+          </w:tcPr>
+          <w:p>
+            <w:r>
+              <w:rPr>
+                <w:sz w:val="20"/>
+              </w:rPr>
+            </w:r>
+            <w:r>
+              <w:rPr>
+                <w:sz w:val="20"/>
+              </w:rPr>
+              <w:t>Comprobación del servidor y pantalla de solicitudes pendientes</w:t>
+            </w:r>
+          </w:p>
+        </w:tc>
+        <w:tc>
+          <w:tcPr>
+            <w:tcW w:type="dxa" w:w="2880"/>
+          </w:tcPr>
+          <w:p>
+            <w:r>
+              <w:rPr>
+                <w:sz w:val="20"/>
+              </w:rPr>
+            </w:r>
+            <w:r>
+              <w:rPr>
+                <w:sz w:val="20"/>
+              </w:rPr>
+              <w:t xml:space="preserve">Se verificó que esa solicitud ya no se puede aprobar y que quien intente aprobarla ve el aviso de opción deshabilitada; no se pudo comprobar con datos reales si queda alguna en esa situación ni qué se muestra en </w:t>
+            </w:r>
+            <w:r>
+              <w:rPr>
+                <w:b/>
+                <w:sz w:val="20"/>
+              </w:rPr>
+              <w:t>Mis Solicitudes</w:t>
             </w:r>
           </w:p>
         </w:tc>

</xml_diff>